<commit_message>
ajout du prompting zero-shot
</commit_message>
<xml_diff>
--- a/ai-business_assistant/atelier-prompt-engineering.docx
+++ b/ai-business_assistant/atelier-prompt-engineering.docx
@@ -46,14 +46,7 @@
           <w:color w:val="2E74B5"/>
           <w:sz w:val="24"/>
         </w:rPr>
-        <w:t>Présentation d</w:t>
-      </w:r>
-      <w:r>
-        <w:rPr>
-          <w:color w:val="2E74B5"/>
-          <w:sz w:val="24"/>
-        </w:rPr>
-        <w:t xml:space="preserve">e l'assistant </w:t>
+        <w:t xml:space="preserve">Présentation de l'assistant </w:t>
       </w:r>
     </w:p>
     <w:p>
@@ -125,13 +118,7 @@
         <w:rPr>
           <w:sz w:val="19"/>
         </w:rPr>
-        <w:t xml:space="preserve">             │           </w:t>
-      </w:r>
-      <w:r>
-        <w:rPr>
-          <w:sz w:val="19"/>
-        </w:rPr>
-        <w:t xml:space="preserve">   │              │ </w:t>
+        <w:t xml:space="preserve">             │              │              │ </w:t>
       </w:r>
     </w:p>
     <w:p>
@@ -208,13 +195,7 @@
         <w:rPr>
           <w:sz w:val="19"/>
         </w:rPr>
-        <w:t xml:space="preserve"> </w:t>
-      </w:r>
-      <w:r>
-        <w:rPr>
-          <w:sz w:val="19"/>
-        </w:rPr>
-        <w:t xml:space="preserve">            │  </w:t>
+        <w:t xml:space="preserve">             │  </w:t>
       </w:r>
       <w:r>
         <w:rPr>
@@ -336,16 +317,7 @@
         <w:ind w:right="0"/>
       </w:pPr>
       <w:r>
-        <w:t>L’atelier peut être réalisé avec un LLM accessible vi</w:t>
-      </w:r>
-      <w:r>
-        <w:t>a une interface web</w:t>
-      </w:r>
-      <w:r>
-        <w:t xml:space="preserve"> </w:t>
-      </w:r>
-      <w:r>
-        <w:t>ou avec une API LLM.</w:t>
+        <w:t>L’atelier peut être réalisé avec un LLM accessible via une interface web ou avec une API LLM.</w:t>
       </w:r>
       <w:r>
         <w:rPr>
@@ -890,7 +862,6 @@
       <w:pPr>
         <w:pStyle w:val="NormalWeb"/>
       </w:pPr>
-      <w:bookmarkStart w:id="0" w:name="_GoBack"/>
       <w:r>
         <w:rPr>
           <w:noProof/>
@@ -938,7 +909,38 @@
           </wp:inline>
         </w:drawing>
       </w:r>
-      <w:bookmarkEnd w:id="0"/>
+    </w:p>
+    <w:p>
+      <w:pPr>
+        <w:pStyle w:val="NormalWeb"/>
+      </w:pPr>
+      <w:r>
+        <w:rPr>
+          <w:rStyle w:val="lev"/>
+        </w:rPr>
+        <w:t>Analyse</w:t>
+      </w:r>
+    </w:p>
+    <w:p>
+      <w:pPr>
+        <w:pStyle w:val="NormalWeb"/>
+      </w:pPr>
+      <w:r>
+        <w:t xml:space="preserve">Par rapport à une demande vague comme « analyse ces retours clients », la décomposition en composantes apporte une structure exploitable (facile à réutiliser dans une application ou un rapport) plutôt qu'un texte libre difficile à </w:t>
+      </w:r>
+      <w:proofErr w:type="spellStart"/>
+      <w:r>
+        <w:t>parser</w:t>
+      </w:r>
+      <w:proofErr w:type="spellEnd"/>
+      <w:r>
+        <w:t>, des contraintes explicites qui évitent les hallucinations et cadrent le raisonnement du modèle, et une réponse priorisée et actionnable, directement utile pour une équipe métier.</w:t>
+      </w:r>
+    </w:p>
+    <w:p>
+      <w:pPr>
+        <w:pStyle w:val="NormalWeb"/>
+      </w:pPr>
     </w:p>
     <w:p>
       <w:pPr>
@@ -952,10 +954,7 @@
         <w:ind w:left="-5"/>
       </w:pPr>
       <w:r>
-        <w:t>Partie 2 - Comparer</w:t>
-      </w:r>
-      <w:r>
-        <w:t xml:space="preserve"> les techniques de </w:t>
+        <w:t xml:space="preserve">Partie 2 - Comparer les techniques de </w:t>
       </w:r>
       <w:proofErr w:type="spellStart"/>
       <w:r>
@@ -1005,18 +1004,15 @@
       <w:pPr>
         <w:spacing w:after="170" w:line="266" w:lineRule="auto"/>
         <w:ind w:right="2342"/>
-      </w:pPr>
-      <w:r>
         <w:rPr>
           <w:sz w:val="17"/>
         </w:rPr>
-        <w:t xml:space="preserve">  "Le service est rapide mais l'application pla</w:t>
-      </w:r>
+      </w:pPr>
       <w:r>
         <w:rPr>
           <w:sz w:val="17"/>
         </w:rPr>
-        <w:t>nte régulièrement."   Classes possibles :    positif, négatif, neutre.</w:t>
+        <w:t xml:space="preserve">  "Le service est rapide mais l'application plante régulièrement."   Classes possibles :    positif, négatif, neutre.</w:t>
       </w:r>
       <w:r>
         <w:t xml:space="preserve"> »</w:t>
@@ -1026,6 +1022,88 @@
           <w:sz w:val="17"/>
         </w:rPr>
         <w:t xml:space="preserve"> </w:t>
+      </w:r>
+    </w:p>
+    <w:p>
+      <w:pPr>
+        <w:spacing w:after="170" w:line="266" w:lineRule="auto"/>
+        <w:ind w:right="2342"/>
+      </w:pPr>
+      <w:r>
+        <w:rPr>
+          <w:rStyle w:val="lev"/>
+        </w:rPr>
+        <w:t xml:space="preserve">1) </w:t>
+      </w:r>
+      <w:proofErr w:type="spellStart"/>
+      <w:r>
+        <w:rPr>
+          <w:rStyle w:val="lev"/>
+        </w:rPr>
+        <w:t>Zero</w:t>
+      </w:r>
+      <w:proofErr w:type="spellEnd"/>
+      <w:r>
+        <w:rPr>
+          <w:rStyle w:val="lev"/>
+        </w:rPr>
+        <w:t>-shot</w:t>
+      </w:r>
+      <w:r>
+        <w:t xml:space="preserve"> (aucun exemple, instruction directe)</w:t>
+      </w:r>
+    </w:p>
+    <w:p>
+      <w:pPr>
+        <w:spacing w:after="170" w:line="266" w:lineRule="auto"/>
+        <w:ind w:right="2342"/>
+      </w:pPr>
+      <w:r>
+        <w:rPr>
+          <w:noProof/>
+        </w:rPr>
+        <w:lastRenderedPageBreak/>
+        <w:drawing>
+          <wp:inline distT="0" distB="0" distL="0" distR="0" wp14:anchorId="3B4B5A44" wp14:editId="767DF95F">
+            <wp:extent cx="5382260" cy="2172335"/>
+            <wp:effectExtent l="0" t="0" r="8890" b="0"/>
+            <wp:docPr id="2" name="Image 2"/>
+            <wp:cNvGraphicFramePr>
+              <a:graphicFrameLocks xmlns:a="http://schemas.openxmlformats.org/drawingml/2006/main" noChangeAspect="1"/>
+            </wp:cNvGraphicFramePr>
+            <a:graphic xmlns:a="http://schemas.openxmlformats.org/drawingml/2006/main">
+              <a:graphicData uri="http://schemas.openxmlformats.org/drawingml/2006/picture">
+                <pic:pic xmlns:pic="http://schemas.openxmlformats.org/drawingml/2006/picture">
+                  <pic:nvPicPr>
+                    <pic:cNvPr id="2" name="Capture d'écran 2026-09-10 083453.png"/>
+                    <pic:cNvPicPr/>
+                  </pic:nvPicPr>
+                  <pic:blipFill>
+                    <a:blip r:embed="rId8">
+                      <a:extLst>
+                        <a:ext uri="{28A0092B-C50C-407E-A947-70E740481C1C}">
+                          <a14:useLocalDpi xmlns:a14="http://schemas.microsoft.com/office/drawing/2010/main" val="0"/>
+                        </a:ext>
+                      </a:extLst>
+                    </a:blip>
+                    <a:stretch>
+                      <a:fillRect/>
+                    </a:stretch>
+                  </pic:blipFill>
+                  <pic:spPr>
+                    <a:xfrm>
+                      <a:off x="0" y="0"/>
+                      <a:ext cx="5382260" cy="2172335"/>
+                    </a:xfrm>
+                    <a:prstGeom prst="rect">
+                      <a:avLst/>
+                    </a:prstGeom>
+                  </pic:spPr>
+                </pic:pic>
+              </a:graphicData>
+            </a:graphic>
+          </wp:inline>
+        </w:drawing>
       </w:r>
     </w:p>
     <w:p>
@@ -1041,13 +1119,7 @@
         <w:t xml:space="preserve">Partie 3 – Prompt Engineering et raisonnement </w:t>
       </w:r>
       <w:r>
-        <w:t>1)</w:t>
-      </w:r>
-      <w:r>
-        <w:t xml:space="preserve"> </w:t>
-      </w:r>
-      <w:r>
-        <w:t xml:space="preserve">Décomposer le prompt suivant : </w:t>
+        <w:t xml:space="preserve">1) Décomposer le prompt suivant : </w:t>
       </w:r>
     </w:p>
     <w:p>
@@ -1062,13 +1134,15 @@
         <w:rPr>
           <w:sz w:val="17"/>
         </w:rPr>
-        <w:t>Analyse ces avis clients et donne-moi les problèmes les plus importants ainsi que les recommandatio</w:t>
-      </w:r>
+        <w:t xml:space="preserve">Analyse ces avis clients et donne-moi les problèmes les plus importants </w:t>
+      </w:r>
+      <w:bookmarkStart w:id="0" w:name="_GoBack"/>
+      <w:bookmarkEnd w:id="0"/>
       <w:r>
         <w:rPr>
           <w:sz w:val="17"/>
         </w:rPr>
-        <w:t>ns</w:t>
+        <w:t>ainsi que les recommandations</w:t>
       </w:r>
       <w:r>
         <w:t xml:space="preserve">. »  </w:t>
@@ -1079,24 +1153,7 @@
         <w:ind w:left="664" w:right="0" w:hanging="338"/>
       </w:pPr>
       <w:r>
-        <w:t>2)</w:t>
-      </w:r>
-      <w:r>
-        <w:t xml:space="preserve"> </w:t>
-      </w:r>
-      <w:r>
-        <w:t xml:space="preserve">Proposer au modèle un texte à analyser avec des contraintes puis utiliser un second prompt lui </w:t>
-      </w:r>
-      <w:proofErr w:type="gramStart"/>
-      <w:r>
-        <w:t>demandant</w:t>
-      </w:r>
-      <w:proofErr w:type="gramEnd"/>
-      <w:r>
-        <w:t xml:space="preserve"> de vérifier sa réponse précédente et de contrôler les informations non justifiées, les contradictions, les informations absentes, les éventuelles hallu</w:t>
-      </w:r>
-      <w:r>
-        <w:t xml:space="preserve">cinations et le respect des contraintes. </w:t>
+        <w:t xml:space="preserve">2) Proposer au modèle un texte à analyser avec des contraintes puis utiliser un second prompt lui demandant de vérifier sa réponse précédente et de contrôler les informations non justifiées, les contradictions, les informations absentes, les éventuelles hallucinations et le respect des contraintes. </w:t>
       </w:r>
     </w:p>
     <w:p>
@@ -1189,13 +1246,7 @@
         <w:rPr>
           <w:sz w:val="17"/>
         </w:rPr>
-        <w:t>conf</w:t>
-      </w:r>
-      <w:r>
-        <w:rPr>
-          <w:sz w:val="17"/>
-        </w:rPr>
-        <w:t>iance</w:t>
+        <w:t>confiance</w:t>
       </w:r>
       <w:r>
         <w:t xml:space="preserve">. Préciser les types des valeurs et les valeurs autorisées </w:t>
@@ -1271,7 +1322,6 @@
         <w:rPr>
           <w:sz w:val="17"/>
         </w:rPr>
-        <w:lastRenderedPageBreak/>
         <w:t xml:space="preserve">  "</w:t>
       </w:r>
       <w:proofErr w:type="spellStart"/>
@@ -1411,16 +1461,7 @@
         <w:ind w:right="0" w:hanging="338"/>
       </w:pPr>
       <w:r>
-        <w:t>Ajouter une validation e</w:t>
-      </w:r>
-      <w:r>
-        <w:t xml:space="preserve">n définissant les règles de sortie suivantes : format JSON valide ; aucune propriété supplémentaire ; sentiment </w:t>
-      </w:r>
-      <w:r>
-        <w:t xml:space="preserve">vaut </w:t>
-      </w:r>
-      <w:r>
-        <w:t xml:space="preserve">positif, </w:t>
+        <w:t xml:space="preserve">Ajouter une validation en définissant les règles de sortie suivantes : format JSON valide ; aucune propriété supplémentaire ; sentiment vaut positif, </w:t>
       </w:r>
       <w:proofErr w:type="spellStart"/>
       <w:r>
@@ -1437,10 +1478,7 @@
         <w:ind w:left="-5"/>
       </w:pPr>
       <w:r>
-        <w:t>Partie 5 – Prompts pour les appl</w:t>
-      </w:r>
-      <w:r>
-        <w:t xml:space="preserve">ications métier </w:t>
+        <w:t xml:space="preserve">Partie 5 – Prompts pour les applications métier </w:t>
       </w:r>
     </w:p>
     <w:p>
@@ -1452,10 +1490,7 @@
         <w:ind w:right="0" w:hanging="338"/>
       </w:pPr>
       <w:r>
-        <w:t>Créer un prompt permettant de résumer un document avec les contraintes : maximum 250 mots ; conserver les informations factuelles ; identifier les objectifs ; identifier les résultats ; identifier les recommandations ; n'inventer aucune in</w:t>
-      </w:r>
-      <w:r>
-        <w:t xml:space="preserve">formation. </w:t>
+        <w:t xml:space="preserve">Créer un prompt permettant de résumer un document avec les contraintes : maximum 250 mots ; conserver les informations factuelles ; identifier les objectifs ; identifier les résultats ; identifier les recommandations ; n'inventer aucune information. </w:t>
       </w:r>
     </w:p>
     <w:p>
@@ -1480,6 +1515,7 @@
         <w:ind w:right="0" w:hanging="338"/>
       </w:pPr>
       <w:r>
+        <w:lastRenderedPageBreak/>
         <w:t xml:space="preserve">Créer un prompt permettant de classer un ticket informatique dans une catégorie (réseau, logiciel, matériel, sécurité, accès, autre). La réponse est au format JSON avec les champs </w:t>
       </w:r>
       <w:proofErr w:type="spellStart"/>
@@ -1512,10 +1548,7 @@
         <w:ind w:right="0" w:hanging="338"/>
       </w:pPr>
       <w:r>
-        <w:t xml:space="preserve">Créer un prompt permettant d’extraire, à partir </w:t>
-      </w:r>
-      <w:r>
-        <w:t>d’une facture, les infos (</w:t>
+        <w:t>Créer un prompt permettant d’extraire, à partir d’une facture, les infos (</w:t>
       </w:r>
       <w:proofErr w:type="spellStart"/>
       <w:r>
@@ -1562,10 +1595,7 @@
         <w:ind w:right="0" w:hanging="338"/>
       </w:pPr>
       <w:r>
-        <w:t>Créer un prompt permettant de rédiger un email destiné à un client dont la livraison a pris du ret</w:t>
-      </w:r>
-      <w:r>
-        <w:t xml:space="preserve">ard avec les objectifs (reconnaître le retard, présenter des excuses, expliquer la situation sans inventer de cause et proposer une solution), le ton (professionnel, courtois et rassurant) et la longueur maximale (150 mots) </w:t>
+        <w:t xml:space="preserve">Créer un prompt permettant de rédiger un email destiné à un client dont la livraison a pris du retard avec les objectifs (reconnaître le retard, présenter des excuses, expliquer la situation sans inventer de cause et proposer une solution), le ton (professionnel, courtois et rassurant) et la longueur maximale (150 mots) </w:t>
       </w:r>
     </w:p>
     <w:p>
@@ -1589,13 +1619,7 @@
         <w:rPr>
           <w:lang w:val="en-CA"/>
         </w:rPr>
-        <w:t xml:space="preserve"> 6 – Prompt Engineering p</w:t>
-      </w:r>
-      <w:r>
-        <w:rPr>
-          <w:lang w:val="en-CA"/>
-        </w:rPr>
-        <w:t xml:space="preserve">our le Machine Learning </w:t>
+        <w:t xml:space="preserve"> 6 – Prompt Engineering pour le Machine Learning </w:t>
       </w:r>
     </w:p>
     <w:p>
@@ -1616,10 +1640,7 @@
       </w:r>
       <w:proofErr w:type="spellEnd"/>
       <w:r>
-        <w:t xml:space="preserve"> des capteurs, de proposer des stratégies (détection, traitement, risques associés) de traitement des valeurs manquantes, des doublons, des valeurs aberrantes, des variables catégoriel</w:t>
-      </w:r>
-      <w:r>
-        <w:t xml:space="preserve">les </w:t>
+        <w:t xml:space="preserve"> des capteurs, de proposer des stratégies (détection, traitement, risques associés) de traitement des valeurs manquantes, des doublons, des valeurs aberrantes, des variables catégorielles </w:t>
       </w:r>
     </w:p>
     <w:p>
@@ -1640,10 +1661,7 @@
       </w:r>
       <w:proofErr w:type="spellEnd"/>
       <w:r>
-        <w:t xml:space="preserve"> des capteurs, de proposer les visualisations les plus pertinentes pour comprendre la consommation énergétique d'un bâtiment. Et pour chaque visualisation indiquer le type de graphique, les variables util</w:t>
-      </w:r>
-      <w:r>
-        <w:t xml:space="preserve">isées, l’objectif et l’interprétation attendue. </w:t>
+        <w:t xml:space="preserve"> des capteurs, de proposer les visualisations les plus pertinentes pour comprendre la consommation énergétique d'un bâtiment. Et pour chaque visualisation indiquer le type de graphique, les variables utilisées, l’objectif et l’interprétation attendue. </w:t>
       </w:r>
     </w:p>
     <w:p>
@@ -1664,10 +1682,7 @@
       </w:r>
       <w:proofErr w:type="spellEnd"/>
       <w:r>
-        <w:t xml:space="preserve"> des capteurs, de proposer plusieurs modèles adaptés à la prédiction de la consommation énergétique d'un bâtiment. Pour chaque modèle, le LLM doit indiquer le p</w:t>
-      </w:r>
-      <w:r>
-        <w:t xml:space="preserve">rincipe, les avantages, les limites, le type de problème et les métriques pertinentes. </w:t>
+        <w:t xml:space="preserve"> des capteurs, de proposer plusieurs modèles adaptés à la prédiction de la consommation énergétique d'un bâtiment. Pour chaque modèle, le LLM doit indiquer le principe, les avantages, les limites, le type de problème et les métriques pertinentes. </w:t>
       </w:r>
     </w:p>
     <w:p>
@@ -1704,10 +1719,7 @@
       </w:r>
       <w:proofErr w:type="spellEnd"/>
       <w:r>
-        <w:t>, F1-score, ROC-AUC). Pour chacune, le LLM doit donner la définition,</w:t>
-      </w:r>
-      <w:r>
-        <w:t xml:space="preserve"> expliquer son interprétation, donner un exemple concret et indiquer dans quel contexte elle est particulièrement utile. </w:t>
+        <w:t xml:space="preserve">, F1-score, ROC-AUC). Pour chacune, le LLM doit donner la définition, expliquer son interprétation, donner un exemple concret et indiquer dans quel contexte elle est particulièrement utile. </w:t>
       </w:r>
     </w:p>
     <w:p>
@@ -1720,10 +1732,7 @@
         <w:ind w:right="0" w:hanging="338"/>
       </w:pPr>
       <w:r>
-        <w:t>Créer un prompt permettant d’expliquer les métriques de Régression (MAE, MSE, RMSE). Pour chacune, le LLM doit donner la définition, e</w:t>
-      </w:r>
-      <w:r>
-        <w:t xml:space="preserve">xpliquer son interprétation, donner un exemple concret et indiquer dans quel contexte elle est particulièrement utile. </w:t>
+        <w:t xml:space="preserve">Créer un prompt permettant d’expliquer les métriques de Régression (MAE, MSE, RMSE). Pour chacune, le LLM doit donner la définition, expliquer son interprétation, donner un exemple concret et indiquer dans quel contexte elle est particulièrement utile. </w:t>
       </w:r>
     </w:p>
     <w:p>
@@ -1732,7 +1741,6 @@
         <w:ind w:left="-5"/>
       </w:pPr>
       <w:r>
-        <w:lastRenderedPageBreak/>
         <w:t>Partie 7 – Prompt Engineering et RAG</w:t>
       </w:r>
       <w:r>
@@ -1772,13 +1780,7 @@
         <w:ind w:left="675" w:right="0"/>
       </w:pPr>
       <w:r>
-        <w:t>Prompt A : poser</w:t>
-      </w:r>
-      <w:r>
-        <w:t xml:space="preserve"> </w:t>
-      </w:r>
-      <w:r>
-        <w:t xml:space="preserve">la question sans fournir le document au LLM </w:t>
+        <w:t xml:space="preserve">Prompt A : poser la question sans fournir le document au LLM </w:t>
       </w:r>
     </w:p>
     <w:p>
@@ -1794,10 +1796,7 @@
         <w:ind w:left="675" w:right="0"/>
       </w:pPr>
       <w:r>
-        <w:t xml:space="preserve">Prompt C : poser la question en fournissant le document </w:t>
-      </w:r>
-      <w:r>
-        <w:t xml:space="preserve">avec les contraintes : utiliser uniquement le contexte fourni ; ne pas inventer une information absente ; signaler lorsqu'une information n'est pas trouvée et éventuellement citer la source ou le passage utilisé. </w:t>
+        <w:t xml:space="preserve">Prompt C : poser la question en fournissant le document avec les contraintes : utiliser uniquement le contexte fourni ; ne pas inventer une information absente ; signaler lorsqu'une information n'est pas trouvée et éventuellement citer la source ou le passage utilisé. </w:t>
       </w:r>
     </w:p>
     <w:p>
@@ -1879,10 +1878,7 @@
         <w:ind w:right="0"/>
       </w:pPr>
       <w:r>
-        <w:t>Prompt C : avec plus de composants de p</w:t>
-      </w:r>
-      <w:r>
-        <w:t xml:space="preserve">rompt </w:t>
+        <w:t xml:space="preserve">Prompt C : avec plus de composants de prompt </w:t>
       </w:r>
     </w:p>
     <w:p>
@@ -1895,6 +1891,7 @@
           <w:color w:val="2E74B5"/>
           <w:sz w:val="24"/>
         </w:rPr>
+        <w:lastRenderedPageBreak/>
         <w:t xml:space="preserve">Partie 9 : Bonus </w:t>
       </w:r>
     </w:p>
@@ -1948,10 +1945,7 @@
         <w:t xml:space="preserve"> </w:t>
       </w:r>
       <w:r>
-        <w:t>présentant la réalisation de l’ate</w:t>
-      </w:r>
-      <w:r>
-        <w:t>lier et tout autre fichier utile à l’atelier.</w:t>
+        <w:t>présentant la réalisation de l’atelier et tout autre fichier utile à l’atelier.</w:t>
       </w:r>
       <w:r>
         <w:rPr>
@@ -1991,13 +1985,7 @@
       </w:r>
       <w:proofErr w:type="gramEnd"/>
       <w:r>
-        <w:t xml:space="preserve"> le livrable, </w:t>
-      </w:r>
-      <w:r>
-        <w:t>d’abord vide</w:t>
-      </w:r>
-      <w:r>
-        <w:t xml:space="preserve">, sur un dépôt public de son compte </w:t>
+        <w:t xml:space="preserve"> le livrable, d’abord vide, sur un dépôt public de son compte </w:t>
       </w:r>
       <w:proofErr w:type="spellStart"/>
       <w:r>
@@ -2022,22 +2010,13 @@
       </w:r>
       <w:proofErr w:type="gramEnd"/>
       <w:r>
-        <w:t xml:space="preserve"> à jour le livrable </w:t>
-      </w:r>
-      <w:r>
-        <w:t>après chaque tâche accomplie</w:t>
-      </w:r>
-      <w:r>
-        <w:t>, avec un message de commit ex</w:t>
-      </w:r>
-      <w:r>
-        <w:t xml:space="preserve">plicite </w:t>
+        <w:t xml:space="preserve"> à jour le livrable après chaque tâche accomplie, avec un message de commit explicite </w:t>
       </w:r>
     </w:p>
     <w:sectPr>
-      <w:footerReference w:type="even" r:id="rId8"/>
-      <w:footerReference w:type="default" r:id="rId9"/>
-      <w:footerReference w:type="first" r:id="rId10"/>
+      <w:footerReference w:type="even" r:id="rId9"/>
+      <w:footerReference w:type="default" r:id="rId10"/>
+      <w:footerReference w:type="first" r:id="rId11"/>
       <w:pgSz w:w="12240" w:h="15840"/>
       <w:pgMar w:top="1404" w:right="1892" w:bottom="1567" w:left="1872" w:header="720" w:footer="681" w:gutter="0"/>
       <w:cols w:space="720"/>
@@ -2097,21 +2076,11 @@
     <w:r>
       <w:t>/</w:t>
     </w:r>
-    <w:r>
-      <w:fldChar w:fldCharType="begin"/>
-    </w:r>
-    <w:r>
-      <w:instrText xml:space="preserve"> NUMPAGES   \* MERGEFORMAT </w:instrText>
-    </w:r>
-    <w:r>
-      <w:fldChar w:fldCharType="separate"/>
-    </w:r>
-    <w:r>
-      <w:t>3</w:t>
-    </w:r>
-    <w:r>
-      <w:fldChar w:fldCharType="end"/>
-    </w:r>
+    <w:fldSimple w:instr=" NUMPAGES   \* MERGEFORMAT ">
+      <w:r>
+        <w:t>3</w:t>
+      </w:r>
+    </w:fldSimple>
     <w:r>
       <w:t xml:space="preserve"> </w:t>
     </w:r>
@@ -2154,21 +2123,11 @@
     <w:r>
       <w:t>/</w:t>
     </w:r>
-    <w:r>
-      <w:fldChar w:fldCharType="begin"/>
-    </w:r>
-    <w:r>
-      <w:instrText xml:space="preserve"> NUMPAGES   \* MERGEFORMAT </w:instrText>
-    </w:r>
-    <w:r>
-      <w:fldChar w:fldCharType="separate"/>
-    </w:r>
-    <w:r>
-      <w:t>3</w:t>
-    </w:r>
-    <w:r>
-      <w:fldChar w:fldCharType="end"/>
-    </w:r>
+    <w:fldSimple w:instr=" NUMPAGES   \* MERGEFORMAT ">
+      <w:r>
+        <w:t>3</w:t>
+      </w:r>
+    </w:fldSimple>
     <w:r>
       <w:t xml:space="preserve"> </w:t>
     </w:r>
@@ -2211,21 +2170,11 @@
     <w:r>
       <w:t>/</w:t>
     </w:r>
-    <w:r>
-      <w:fldChar w:fldCharType="begin"/>
-    </w:r>
-    <w:r>
-      <w:instrText xml:space="preserve"> NUMPAGES   \* MERGEFORMAT </w:instrText>
-    </w:r>
-    <w:r>
-      <w:fldChar w:fldCharType="separate"/>
-    </w:r>
-    <w:r>
-      <w:t>3</w:t>
-    </w:r>
-    <w:r>
-      <w:fldChar w:fldCharType="end"/>
-    </w:r>
+    <w:fldSimple w:instr=" NUMPAGES   \* MERGEFORMAT ">
+      <w:r>
+        <w:t>3</w:t>
+      </w:r>
+    </w:fldSimple>
     <w:r>
       <w:t xml:space="preserve"> </w:t>
     </w:r>
@@ -4070,6 +4019,17 @@
       <w:bCs/>
     </w:rPr>
   </w:style>
+  <w:style w:type="paragraph" w:styleId="Paragraphedeliste">
+    <w:name w:val="List Paragraph"/>
+    <w:basedOn w:val="Normal"/>
+    <w:uiPriority w:val="34"/>
+    <w:qFormat/>
+    <w:rsid w:val="00DB0D8F"/>
+    <w:pPr>
+      <w:ind w:left="720"/>
+      <w:contextualSpacing/>
+    </w:pPr>
+  </w:style>
 </w:styles>
 </file>
 

</xml_diff>

<commit_message>
ajout du prompting few-shot
</commit_message>
<xml_diff>
--- a/ai-business_assistant/atelier-prompt-engineering.docx
+++ b/ai-business_assistant/atelier-prompt-engineering.docx
@@ -1175,6 +1175,74 @@
     </w:p>
     <w:p>
       <w:pPr>
+        <w:spacing w:after="170" w:line="266" w:lineRule="auto"/>
+        <w:ind w:right="2342"/>
+      </w:pPr>
+      <w:r>
+        <w:rPr>
+          <w:rStyle w:val="lev"/>
+        </w:rPr>
+        <w:t>3) Few-shot</w:t>
+      </w:r>
+      <w:r>
+        <w:t xml:space="preserve"> (plusieurs exemples, couvrant les 3 classes)</w:t>
+      </w:r>
+    </w:p>
+    <w:p>
+      <w:pPr>
+        <w:spacing w:after="170" w:line="266" w:lineRule="auto"/>
+        <w:ind w:right="2342"/>
+      </w:pPr>
+      <w:r>
+        <w:rPr>
+          <w:noProof/>
+        </w:rPr>
+        <w:lastRenderedPageBreak/>
+        <w:drawing>
+          <wp:inline distT="0" distB="0" distL="0" distR="0" wp14:anchorId="29B98718" wp14:editId="4C9FEE99">
+            <wp:extent cx="5382260" cy="3525520"/>
+            <wp:effectExtent l="0" t="0" r="8890" b="0"/>
+            <wp:docPr id="4" name="Image 4"/>
+            <wp:cNvGraphicFramePr>
+              <a:graphicFrameLocks xmlns:a="http://schemas.openxmlformats.org/drawingml/2006/main" noChangeAspect="1"/>
+            </wp:cNvGraphicFramePr>
+            <a:graphic xmlns:a="http://schemas.openxmlformats.org/drawingml/2006/main">
+              <a:graphicData uri="http://schemas.openxmlformats.org/drawingml/2006/picture">
+                <pic:pic xmlns:pic="http://schemas.openxmlformats.org/drawingml/2006/picture">
+                  <pic:nvPicPr>
+                    <pic:cNvPr id="4" name="Capture d'écran 2026-09-10 084420.png"/>
+                    <pic:cNvPicPr/>
+                  </pic:nvPicPr>
+                  <pic:blipFill>
+                    <a:blip r:embed="rId10">
+                      <a:extLst>
+                        <a:ext uri="{28A0092B-C50C-407E-A947-70E740481C1C}">
+                          <a14:useLocalDpi xmlns:a14="http://schemas.microsoft.com/office/drawing/2010/main" val="0"/>
+                        </a:ext>
+                      </a:extLst>
+                    </a:blip>
+                    <a:stretch>
+                      <a:fillRect/>
+                    </a:stretch>
+                  </pic:blipFill>
+                  <pic:spPr>
+                    <a:xfrm>
+                      <a:off x="0" y="0"/>
+                      <a:ext cx="5382260" cy="3525520"/>
+                    </a:xfrm>
+                    <a:prstGeom prst="rect">
+                      <a:avLst/>
+                    </a:prstGeom>
+                  </pic:spPr>
+                </pic:pic>
+              </a:graphicData>
+            </a:graphic>
+          </wp:inline>
+        </w:drawing>
+      </w:r>
+    </w:p>
+    <w:p>
+      <w:pPr>
         <w:spacing w:after="32" w:line="271" w:lineRule="auto"/>
         <w:ind w:left="323" w:right="3627" w:hanging="338"/>
       </w:pPr>
@@ -1186,55 +1254,52 @@
         <w:t xml:space="preserve">Partie 3 – Prompt Engineering et raisonnement </w:t>
       </w:r>
       <w:r>
-        <w:t xml:space="preserve">1) </w:t>
+        <w:t xml:space="preserve">1) Décomposer le prompt suivant : </w:t>
+      </w:r>
+    </w:p>
+    <w:p>
+      <w:pPr>
+        <w:spacing w:after="33" w:line="266" w:lineRule="auto"/>
+        <w:ind w:left="660" w:right="0"/>
+      </w:pPr>
+      <w:r>
+        <w:t xml:space="preserve">« </w:t>
+      </w:r>
+      <w:r>
+        <w:rPr>
+          <w:sz w:val="17"/>
+        </w:rPr>
+        <w:t>Analyse ces avis clients et donne-moi les problèmes les plus importants ainsi que les recommandations</w:t>
+      </w:r>
+      <w:r>
+        <w:t xml:space="preserve">. »  </w:t>
+      </w:r>
+    </w:p>
+    <w:p>
+      <w:pPr>
+        <w:ind w:left="664" w:right="0" w:hanging="338"/>
+      </w:pPr>
+      <w:r>
+        <w:t xml:space="preserve">2) Proposer au modèle un texte à analyser avec des contraintes puis utiliser un second prompt lui demandant de vérifier sa réponse précédente et de contrôler les informations non justifiées, les contradictions, les informations absentes, les éventuelles hallucinations et le respect des contraintes. </w:t>
+      </w:r>
+    </w:p>
+    <w:p>
+      <w:pPr>
+        <w:spacing w:after="29" w:line="271" w:lineRule="auto"/>
+        <w:ind w:left="-5" w:right="5397"/>
+      </w:pPr>
+      <w:r>
+        <w:rPr>
+          <w:color w:val="2E74B5"/>
+          <w:sz w:val="24"/>
+        </w:rPr>
+        <w:t xml:space="preserve">Partie 4 – Sorties structurées </w:t>
+      </w:r>
+      <w:r>
+        <w:t xml:space="preserve">Le LLM retourne : </w:t>
       </w:r>
       <w:bookmarkStart w:id="0" w:name="_GoBack"/>
       <w:bookmarkEnd w:id="0"/>
-      <w:r>
-        <w:t xml:space="preserve">Décomposer le prompt suivant : </w:t>
-      </w:r>
-    </w:p>
-    <w:p>
-      <w:pPr>
-        <w:spacing w:after="33" w:line="266" w:lineRule="auto"/>
-        <w:ind w:left="660" w:right="0"/>
-      </w:pPr>
-      <w:r>
-        <w:t xml:space="preserve">« </w:t>
-      </w:r>
-      <w:r>
-        <w:rPr>
-          <w:sz w:val="17"/>
-        </w:rPr>
-        <w:t>Analyse ces avis clients et donne-moi les problèmes les plus importants ainsi que les recommandations</w:t>
-      </w:r>
-      <w:r>
-        <w:t xml:space="preserve">. »  </w:t>
-      </w:r>
-    </w:p>
-    <w:p>
-      <w:pPr>
-        <w:ind w:left="664" w:right="0" w:hanging="338"/>
-      </w:pPr>
-      <w:r>
-        <w:t xml:space="preserve">2) Proposer au modèle un texte à analyser avec des contraintes puis utiliser un second prompt lui demandant de vérifier sa réponse précédente et de contrôler les informations non justifiées, les contradictions, les informations absentes, les éventuelles hallucinations et le respect des contraintes. </w:t>
-      </w:r>
-    </w:p>
-    <w:p>
-      <w:pPr>
-        <w:spacing w:after="29" w:line="271" w:lineRule="auto"/>
-        <w:ind w:left="-5" w:right="5397"/>
-      </w:pPr>
-      <w:r>
-        <w:rPr>
-          <w:color w:val="2E74B5"/>
-          <w:sz w:val="24"/>
-        </w:rPr>
-        <w:t xml:space="preserve">Partie 4 – Sorties structurées </w:t>
-      </w:r>
-      <w:r>
-        <w:t xml:space="preserve">Le LLM retourne : </w:t>
-      </w:r>
     </w:p>
     <w:p>
       <w:pPr>
@@ -1346,7 +1411,6 @@
         <w:rPr>
           <w:sz w:val="17"/>
         </w:rPr>
-        <w:lastRenderedPageBreak/>
         <w:t xml:space="preserve">  "sentiment</w:t>
       </w:r>
       <w:proofErr w:type="gramStart"/>
@@ -1543,6 +1607,7 @@
         <w:ind w:left="-5"/>
       </w:pPr>
       <w:r>
+        <w:lastRenderedPageBreak/>
         <w:t xml:space="preserve">Partie 5 – Prompts pour les applications métier </w:t>
       </w:r>
     </w:p>
@@ -1805,7 +1870,6 @@
         <w:ind w:left="-5"/>
       </w:pPr>
       <w:r>
-        <w:lastRenderedPageBreak/>
         <w:t>Partie 7 – Prompt Engineering et RAG</w:t>
       </w:r>
       <w:r>
@@ -1874,6 +1938,7 @@
         <w:ind w:right="0" w:hanging="338"/>
       </w:pPr>
       <w:r>
+        <w:lastRenderedPageBreak/>
         <w:t xml:space="preserve">Comparer les résultats. </w:t>
       </w:r>
     </w:p>
@@ -2078,9 +2143,9 @@
       </w:r>
     </w:p>
     <w:sectPr>
-      <w:footerReference w:type="even" r:id="rId10"/>
-      <w:footerReference w:type="default" r:id="rId11"/>
-      <w:footerReference w:type="first" r:id="rId12"/>
+      <w:footerReference w:type="even" r:id="rId11"/>
+      <w:footerReference w:type="default" r:id="rId12"/>
+      <w:footerReference w:type="first" r:id="rId13"/>
       <w:pgSz w:w="12240" w:h="15840"/>
       <w:pgMar w:top="1404" w:right="1892" w:bottom="1567" w:left="1872" w:header="720" w:footer="681" w:gutter="0"/>
       <w:cols w:space="720"/>

</xml_diff>

<commit_message>
ajout du prompt structuré
</commit_message>
<xml_diff>
--- a/ai-business_assistant/atelier-prompt-engineering.docx
+++ b/ai-business_assistant/atelier-prompt-engineering.docx
@@ -1243,6 +1243,73 @@
     </w:p>
     <w:p>
       <w:pPr>
+        <w:spacing w:after="170" w:line="266" w:lineRule="auto"/>
+        <w:ind w:right="2342"/>
+      </w:pPr>
+      <w:r>
+        <w:rPr>
+          <w:rStyle w:val="lev"/>
+        </w:rPr>
+        <w:t>4) Prompt structuré</w:t>
+      </w:r>
+      <w:r>
+        <w:t xml:space="preserve"> (rôle + contexte + tâche + contraintes + format)</w:t>
+      </w:r>
+    </w:p>
+    <w:p>
+      <w:pPr>
+        <w:spacing w:after="170" w:line="266" w:lineRule="auto"/>
+        <w:ind w:right="2342"/>
+      </w:pPr>
+      <w:r>
+        <w:rPr>
+          <w:noProof/>
+        </w:rPr>
+        <w:drawing>
+          <wp:inline distT="0" distB="0" distL="0" distR="0" wp14:anchorId="7F23D6C4" wp14:editId="44011745">
+            <wp:extent cx="5382260" cy="3843020"/>
+            <wp:effectExtent l="0" t="0" r="8890" b="5080"/>
+            <wp:docPr id="5" name="Image 5"/>
+            <wp:cNvGraphicFramePr>
+              <a:graphicFrameLocks xmlns:a="http://schemas.openxmlformats.org/drawingml/2006/main" noChangeAspect="1"/>
+            </wp:cNvGraphicFramePr>
+            <a:graphic xmlns:a="http://schemas.openxmlformats.org/drawingml/2006/main">
+              <a:graphicData uri="http://schemas.openxmlformats.org/drawingml/2006/picture">
+                <pic:pic xmlns:pic="http://schemas.openxmlformats.org/drawingml/2006/picture">
+                  <pic:nvPicPr>
+                    <pic:cNvPr id="5" name="Capture d'écran 2026-09-10 084656.png"/>
+                    <pic:cNvPicPr/>
+                  </pic:nvPicPr>
+                  <pic:blipFill>
+                    <a:blip r:embed="rId11">
+                      <a:extLst>
+                        <a:ext uri="{28A0092B-C50C-407E-A947-70E740481C1C}">
+                          <a14:useLocalDpi xmlns:a14="http://schemas.microsoft.com/office/drawing/2010/main" val="0"/>
+                        </a:ext>
+                      </a:extLst>
+                    </a:blip>
+                    <a:stretch>
+                      <a:fillRect/>
+                    </a:stretch>
+                  </pic:blipFill>
+                  <pic:spPr>
+                    <a:xfrm>
+                      <a:off x="0" y="0"/>
+                      <a:ext cx="5382260" cy="3843020"/>
+                    </a:xfrm>
+                    <a:prstGeom prst="rect">
+                      <a:avLst/>
+                    </a:prstGeom>
+                  </pic:spPr>
+                </pic:pic>
+              </a:graphicData>
+            </a:graphic>
+          </wp:inline>
+        </w:drawing>
+      </w:r>
+    </w:p>
+    <w:p>
+      <w:pPr>
         <w:spacing w:after="32" w:line="271" w:lineRule="auto"/>
         <w:ind w:left="323" w:right="3627" w:hanging="338"/>
       </w:pPr>
@@ -1251,7 +1318,17 @@
           <w:color w:val="2E74B5"/>
           <w:sz w:val="24"/>
         </w:rPr>
-        <w:t xml:space="preserve">Partie 3 – Prompt Engineering et raisonnement </w:t>
+        <w:lastRenderedPageBreak/>
+        <w:t>Partie 3 – Prompt Engineering et r</w:t>
+      </w:r>
+      <w:bookmarkStart w:id="0" w:name="_GoBack"/>
+      <w:bookmarkEnd w:id="0"/>
+      <w:r>
+        <w:rPr>
+          <w:color w:val="2E74B5"/>
+          <w:sz w:val="24"/>
+        </w:rPr>
+        <w:t xml:space="preserve">aisonnement </w:t>
       </w:r>
       <w:r>
         <w:t xml:space="preserve">1) Décomposer le prompt suivant : </w:t>
@@ -1298,8 +1375,6 @@
       <w:r>
         <w:t xml:space="preserve">Le LLM retourne : </w:t>
       </w:r>
-      <w:bookmarkStart w:id="0" w:name="_GoBack"/>
-      <w:bookmarkEnd w:id="0"/>
     </w:p>
     <w:p>
       <w:pPr>
@@ -1607,7 +1682,6 @@
         <w:ind w:left="-5"/>
       </w:pPr>
       <w:r>
-        <w:lastRenderedPageBreak/>
         <w:t xml:space="preserve">Partie 5 – Prompts pour les applications métier </w:t>
       </w:r>
     </w:p>
@@ -1782,6 +1856,7 @@
         <w:ind w:right="0" w:hanging="338"/>
       </w:pPr>
       <w:r>
+        <w:lastRenderedPageBreak/>
         <w:t xml:space="preserve">Créer un prompt permettant, à partir du </w:t>
       </w:r>
       <w:proofErr w:type="spellStart"/>
@@ -1938,7 +2013,6 @@
         <w:ind w:right="0" w:hanging="338"/>
       </w:pPr>
       <w:r>
-        <w:lastRenderedPageBreak/>
         <w:t xml:space="preserve">Comparer les résultats. </w:t>
       </w:r>
     </w:p>
@@ -2143,9 +2217,9 @@
       </w:r>
     </w:p>
     <w:sectPr>
-      <w:footerReference w:type="even" r:id="rId11"/>
-      <w:footerReference w:type="default" r:id="rId12"/>
-      <w:footerReference w:type="first" r:id="rId13"/>
+      <w:footerReference w:type="even" r:id="rId12"/>
+      <w:footerReference w:type="default" r:id="rId13"/>
+      <w:footerReference w:type="first" r:id="rId14"/>
       <w:pgSz w:w="12240" w:h="15840"/>
       <w:pgMar w:top="1404" w:right="1892" w:bottom="1567" w:left="1872" w:header="720" w:footer="681" w:gutter="0"/>
       <w:cols w:space="720"/>

</xml_diff>

<commit_message>
comparaison des techniques de prompting
</commit_message>
<xml_diff>
--- a/ai-business_assistant/atelier-prompt-engineering.docx
+++ b/ai-business_assistant/atelier-prompt-engineering.docx
@@ -31,15 +31,7 @@
         <w:jc w:val="both"/>
       </w:pPr>
       <w:r>
-        <w:t xml:space="preserve">Une entreprise souhaite mettre en place « AI Business Assistant », un assistant IA polyvalent capable d'aider ses collaborateurs à exploiter des documents, analyser des données, faire du machine </w:t>
-      </w:r>
-      <w:proofErr w:type="spellStart"/>
-      <w:r>
-        <w:t>learning</w:t>
-      </w:r>
-      <w:proofErr w:type="spellEnd"/>
-      <w:r>
-        <w:t xml:space="preserve"> et produire des résultats structurés. </w:t>
+        <w:t xml:space="preserve">Une entreprise souhaite mettre en place « AI Business Assistant », un assistant IA polyvalent capable d'aider ses collaborateurs à exploiter des documents, analyser des données, faire du machine learning et produire des résultats structurés. </w:t>
       </w:r>
       <w:r>
         <w:rPr>
@@ -926,15 +918,7 @@
         <w:pStyle w:val="NormalWeb"/>
       </w:pPr>
       <w:r>
-        <w:t xml:space="preserve">Par rapport à une demande vague comme « analyse ces retours clients », la décomposition en composantes apporte une structure exploitable (facile à réutiliser dans une application ou un rapport) plutôt qu'un texte libre difficile à </w:t>
-      </w:r>
-      <w:proofErr w:type="spellStart"/>
-      <w:r>
-        <w:t>parser</w:t>
-      </w:r>
-      <w:proofErr w:type="spellEnd"/>
-      <w:r>
-        <w:t>, des contraintes explicites qui évitent les hallucinations et cadrent le raisonnement du modèle, et une réponse priorisée et actionnable, directement utile pour une équipe métier.</w:t>
+        <w:t>Par rapport à une demande vague comme « analyse ces retours clients », la décomposition en composantes apporte une structure exploitable (facile à réutiliser dans une application ou un rapport) plutôt qu'un texte libre difficile à parser, des contraintes explicites qui évitent les hallucinations et cadrent le raisonnement du modèle, et une réponse priorisée et actionnable, directement utile pour une équipe métier.</w:t>
       </w:r>
     </w:p>
     <w:p>
@@ -954,15 +938,7 @@
         <w:ind w:left="-5"/>
       </w:pPr>
       <w:r>
-        <w:t xml:space="preserve">Partie 2 - Comparer les techniques de </w:t>
-      </w:r>
-      <w:proofErr w:type="spellStart"/>
-      <w:r>
-        <w:t>prompting</w:t>
-      </w:r>
-      <w:proofErr w:type="spellEnd"/>
-      <w:r>
-        <w:t xml:space="preserve"> </w:t>
+        <w:t xml:space="preserve">Partie 2 - Comparer les techniques de prompting </w:t>
       </w:r>
     </w:p>
     <w:p>
@@ -972,32 +948,13 @@
         <w:jc w:val="both"/>
       </w:pPr>
       <w:r>
-        <w:t xml:space="preserve">Tester puis évaluer les résultats obtenus avec les techniques </w:t>
-      </w:r>
-      <w:proofErr w:type="spellStart"/>
-      <w:r>
-        <w:t>zero</w:t>
-      </w:r>
-      <w:proofErr w:type="spellEnd"/>
-      <w:r>
-        <w:t xml:space="preserve">-shot, one-shot, few-shot et un prompt structuré sur une demande du genre : </w:t>
-      </w:r>
-      <w:proofErr w:type="gramStart"/>
-      <w:r>
-        <w:t xml:space="preserve">«  </w:t>
+        <w:t xml:space="preserve">Tester puis évaluer les résultats obtenus avec les techniques zero-shot, one-shot, few-shot et un prompt structuré sur une demande du genre : «  </w:t>
       </w:r>
       <w:r>
         <w:rPr>
           <w:sz w:val="17"/>
         </w:rPr>
-        <w:t>Classer</w:t>
-      </w:r>
-      <w:proofErr w:type="gramEnd"/>
-      <w:r>
-        <w:rPr>
-          <w:sz w:val="17"/>
-        </w:rPr>
-        <w:t xml:space="preserve"> le commentaire suivant : </w:t>
+        <w:t xml:space="preserve">Classer le commentaire suivant : </w:t>
       </w:r>
     </w:p>
     <w:p>
@@ -1033,21 +990,7 @@
         <w:rPr>
           <w:rStyle w:val="lev"/>
         </w:rPr>
-        <w:t xml:space="preserve">1) </w:t>
-      </w:r>
-      <w:proofErr w:type="spellStart"/>
-      <w:r>
-        <w:rPr>
-          <w:rStyle w:val="lev"/>
-        </w:rPr>
-        <w:t>Zero</w:t>
-      </w:r>
-      <w:proofErr w:type="spellEnd"/>
-      <w:r>
-        <w:rPr>
-          <w:rStyle w:val="lev"/>
-        </w:rPr>
-        <w:t>-shot</w:t>
+        <w:t>1) Zero-shot</w:t>
       </w:r>
       <w:r>
         <w:t xml:space="preserve"> (aucun exemple, instruction directe)</w:t>
@@ -1310,6 +1253,211 @@
     </w:p>
     <w:p>
       <w:pPr>
+        <w:spacing w:before="100" w:beforeAutospacing="1" w:after="100" w:afterAutospacing="1" w:line="240" w:lineRule="auto"/>
+        <w:ind w:left="0" w:right="0" w:firstLine="0"/>
+        <w:rPr>
+          <w:color w:val="auto"/>
+          <w:sz w:val="24"/>
+          <w:szCs w:val="24"/>
+        </w:rPr>
+      </w:pPr>
+      <w:r>
+        <w:rPr>
+          <w:b/>
+          <w:bCs/>
+          <w:color w:val="auto"/>
+          <w:sz w:val="24"/>
+          <w:szCs w:val="24"/>
+        </w:rPr>
+        <w:t>Partie 2 – Comparer les techniques de prompting</w:t>
+      </w:r>
+    </w:p>
+    <w:p>
+      <w:pPr>
+        <w:spacing w:before="100" w:beforeAutospacing="1" w:after="100" w:afterAutospacing="1" w:line="240" w:lineRule="auto"/>
+        <w:ind w:left="0" w:right="0" w:firstLine="0"/>
+        <w:rPr>
+          <w:color w:val="auto"/>
+          <w:sz w:val="24"/>
+          <w:szCs w:val="24"/>
+        </w:rPr>
+      </w:pPr>
+      <w:bookmarkStart w:id="0" w:name="_GoBack"/>
+      <w:bookmarkEnd w:id="0"/>
+      <w:r>
+        <w:rPr>
+          <w:b/>
+          <w:bCs/>
+          <w:color w:val="auto"/>
+          <w:sz w:val="24"/>
+          <w:szCs w:val="24"/>
+        </w:rPr>
+        <w:lastRenderedPageBreak/>
+        <w:t>Résultats obtenus</w:t>
+      </w:r>
+    </w:p>
+    <w:p>
+      <w:pPr>
+        <w:spacing w:before="100" w:beforeAutospacing="1" w:after="100" w:afterAutospacing="1" w:line="240" w:lineRule="auto"/>
+        <w:ind w:left="0" w:right="0" w:firstLine="0"/>
+        <w:rPr>
+          <w:color w:val="auto"/>
+          <w:sz w:val="24"/>
+          <w:szCs w:val="24"/>
+        </w:rPr>
+      </w:pPr>
+      <w:r>
+        <w:rPr>
+          <w:color w:val="auto"/>
+          <w:sz w:val="24"/>
+          <w:szCs w:val="24"/>
+        </w:rPr>
+        <w:t>Zero-shot : Négatif. Le commentaire mentionne un point positif (« service rapide »), mais le problème récurrent de l'application (« plante régulièrement ») domine l'évaluation globale.</w:t>
+      </w:r>
+    </w:p>
+    <w:p>
+      <w:pPr>
+        <w:spacing w:before="100" w:beforeAutospacing="1" w:after="100" w:afterAutospacing="1" w:line="240" w:lineRule="auto"/>
+        <w:ind w:left="0" w:right="0" w:firstLine="0"/>
+        <w:rPr>
+          <w:color w:val="auto"/>
+          <w:sz w:val="24"/>
+          <w:szCs w:val="24"/>
+        </w:rPr>
+      </w:pPr>
+      <w:r>
+        <w:rPr>
+          <w:color w:val="auto"/>
+          <w:sz w:val="24"/>
+          <w:szCs w:val="24"/>
+        </w:rPr>
+        <w:t>One-shot : Négatif</w:t>
+      </w:r>
+    </w:p>
+    <w:p>
+      <w:pPr>
+        <w:spacing w:before="100" w:beforeAutospacing="1" w:after="100" w:afterAutospacing="1" w:line="240" w:lineRule="auto"/>
+        <w:ind w:left="0" w:right="0" w:firstLine="0"/>
+        <w:rPr>
+          <w:color w:val="auto"/>
+          <w:sz w:val="24"/>
+          <w:szCs w:val="24"/>
+        </w:rPr>
+      </w:pPr>
+      <w:r>
+        <w:rPr>
+          <w:color w:val="auto"/>
+          <w:sz w:val="24"/>
+          <w:szCs w:val="24"/>
+        </w:rPr>
+        <w:t>Few-shot : Négatif</w:t>
+      </w:r>
+    </w:p>
+    <w:p>
+      <w:pPr>
+        <w:spacing w:before="100" w:beforeAutospacing="1" w:after="100" w:afterAutospacing="1" w:line="240" w:lineRule="auto"/>
+        <w:ind w:left="0" w:right="0" w:firstLine="0"/>
+        <w:rPr>
+          <w:color w:val="auto"/>
+          <w:sz w:val="24"/>
+          <w:szCs w:val="24"/>
+        </w:rPr>
+      </w:pPr>
+      <w:r>
+        <w:rPr>
+          <w:color w:val="auto"/>
+          <w:sz w:val="24"/>
+          <w:szCs w:val="24"/>
+        </w:rPr>
+        <w:t>Structuré : Négatif</w:t>
+      </w:r>
+    </w:p>
+    <w:p>
+      <w:pPr>
+        <w:spacing w:before="100" w:beforeAutospacing="1" w:after="100" w:afterAutospacing="1" w:line="240" w:lineRule="auto"/>
+        <w:ind w:left="0" w:right="0" w:firstLine="0"/>
+        <w:rPr>
+          <w:color w:val="auto"/>
+          <w:sz w:val="24"/>
+          <w:szCs w:val="24"/>
+        </w:rPr>
+      </w:pPr>
+      <w:r>
+        <w:rPr>
+          <w:b/>
+          <w:bCs/>
+          <w:color w:val="auto"/>
+          <w:sz w:val="24"/>
+          <w:szCs w:val="24"/>
+        </w:rPr>
+        <w:t>Analyse comparative</w:t>
+      </w:r>
+    </w:p>
+    <w:p>
+      <w:pPr>
+        <w:spacing w:before="100" w:beforeAutospacing="1" w:after="100" w:afterAutospacing="1" w:line="240" w:lineRule="auto"/>
+        <w:ind w:left="0" w:right="0" w:firstLine="0"/>
+        <w:rPr>
+          <w:color w:val="auto"/>
+          <w:sz w:val="24"/>
+          <w:szCs w:val="24"/>
+        </w:rPr>
+      </w:pPr>
+      <w:r>
+        <w:rPr>
+          <w:color w:val="auto"/>
+          <w:sz w:val="24"/>
+          <w:szCs w:val="24"/>
+        </w:rPr>
+        <w:t>Les quatre techniques aboutissent à la même classification (négatif), ce qui confirme que le modèle identifie correctement le sentiment dominant même sur un commentaire mixte contenant à la fois un élément positif et un élément négatif.</w:t>
+      </w:r>
+    </w:p>
+    <w:p>
+      <w:pPr>
+        <w:spacing w:before="100" w:beforeAutospacing="1" w:after="100" w:afterAutospacing="1" w:line="240" w:lineRule="auto"/>
+        <w:ind w:left="0" w:right="0" w:firstLine="0"/>
+        <w:rPr>
+          <w:color w:val="auto"/>
+          <w:sz w:val="24"/>
+          <w:szCs w:val="24"/>
+        </w:rPr>
+      </w:pPr>
+      <w:r>
+        <w:rPr>
+          <w:color w:val="auto"/>
+          <w:sz w:val="24"/>
+          <w:szCs w:val="24"/>
+        </w:rPr>
+        <w:t>La différence principale se situe dans le format de la réponse. Le prompt zero-shot, ne précisant aucune contrainte de format, a produit une réponse accompagnée d'une justification, ce qui la rend moins directement exploitable par une application (nécessite un post-traitement pour extraire la classe). Les prompts one-shot et few-shot, en donnant un exemple de sortie courte, ont amené le modèle à reproduire ce même format concis, sans instruction explicite sur le format attendu. Le prompt structuré est celui qui offre le meilleur contrôle : la contrainte explicite « réponds uniquement avec le nom de la classe, sans phrase supplémentaire » garantit une sortie strictement conforme, immédiatement utilisable par du code.</w:t>
+      </w:r>
+    </w:p>
+    <w:p>
+      <w:pPr>
+        <w:spacing w:before="100" w:beforeAutospacing="1" w:after="100" w:afterAutospacing="1" w:line="240" w:lineRule="auto"/>
+        <w:ind w:left="0" w:right="0" w:firstLine="0"/>
+        <w:rPr>
+          <w:color w:val="auto"/>
+          <w:sz w:val="24"/>
+          <w:szCs w:val="24"/>
+        </w:rPr>
+      </w:pPr>
+      <w:r>
+        <w:rPr>
+          <w:color w:val="auto"/>
+          <w:sz w:val="24"/>
+          <w:szCs w:val="24"/>
+        </w:rPr>
+        <w:t>En résumé : le few-shot améliore la cohérence du format par imitation des exemples, mais seul le prompt structuré garantit ce format de manière fiable et explicite, ce qui en fait le plus adapté à un usage en application métier (où la sortie doit être parsée automatiquement).</w:t>
+      </w:r>
+    </w:p>
+    <w:p>
+      <w:pPr>
+        <w:spacing w:after="170" w:line="266" w:lineRule="auto"/>
+        <w:ind w:right="2342"/>
+      </w:pPr>
+    </w:p>
+    <w:p>
+      <w:pPr>
         <w:spacing w:after="32" w:line="271" w:lineRule="auto"/>
         <w:ind w:left="323" w:right="3627" w:hanging="338"/>
       </w:pPr>
@@ -1318,17 +1466,7 @@
           <w:color w:val="2E74B5"/>
           <w:sz w:val="24"/>
         </w:rPr>
-        <w:lastRenderedPageBreak/>
-        <w:t>Partie 3 – Prompt Engineering et r</w:t>
-      </w:r>
-      <w:bookmarkStart w:id="0" w:name="_GoBack"/>
-      <w:bookmarkEnd w:id="0"/>
-      <w:r>
-        <w:rPr>
-          <w:color w:val="2E74B5"/>
-          <w:sz w:val="24"/>
-        </w:rPr>
-        <w:t xml:space="preserve">aisonnement </w:t>
+        <w:t xml:space="preserve">Partie 3 – Prompt Engineering et raisonnement </w:t>
       </w:r>
       <w:r>
         <w:t xml:space="preserve">1) Décomposer le prompt suivant : </w:t>
@@ -1404,6 +1542,7 @@
         <w:ind w:right="0" w:hanging="338"/>
       </w:pPr>
       <w:r>
+        <w:lastRenderedPageBreak/>
         <w:t xml:space="preserve">Pour rendre cette réponse plus facile à exploiter par une application, créer un prompt demandant du JSON avec les champs </w:t>
       </w:r>
       <w:r>
@@ -1415,14 +1554,12 @@
       <w:r>
         <w:t xml:space="preserve">, </w:t>
       </w:r>
-      <w:proofErr w:type="spellStart"/>
       <w:r>
         <w:rPr>
           <w:sz w:val="17"/>
         </w:rPr>
         <w:t>categorie</w:t>
       </w:r>
-      <w:proofErr w:type="spellEnd"/>
       <w:r>
         <w:t xml:space="preserve">, </w:t>
       </w:r>
@@ -1435,14 +1572,12 @@
       <w:r>
         <w:t xml:space="preserve">, </w:t>
       </w:r>
-      <w:proofErr w:type="spellStart"/>
       <w:r>
         <w:rPr>
           <w:sz w:val="17"/>
         </w:rPr>
         <w:t>probleme</w:t>
       </w:r>
-      <w:proofErr w:type="spellEnd"/>
       <w:r>
         <w:t xml:space="preserve">, </w:t>
       </w:r>
@@ -1486,35 +1621,7 @@
         <w:rPr>
           <w:sz w:val="17"/>
         </w:rPr>
-        <w:t xml:space="preserve">  "sentiment</w:t>
-      </w:r>
-      <w:proofErr w:type="gramStart"/>
-      <w:r>
-        <w:rPr>
-          <w:sz w:val="17"/>
-        </w:rPr>
-        <w:t>":</w:t>
-      </w:r>
-      <w:proofErr w:type="gramEnd"/>
-      <w:r>
-        <w:rPr>
-          <w:sz w:val="17"/>
-        </w:rPr>
-        <w:t xml:space="preserve"> "</w:t>
-      </w:r>
-      <w:proofErr w:type="spellStart"/>
-      <w:r>
-        <w:rPr>
-          <w:sz w:val="17"/>
-        </w:rPr>
-        <w:t>negatif</w:t>
-      </w:r>
-      <w:proofErr w:type="spellEnd"/>
-      <w:r>
-        <w:rPr>
-          <w:sz w:val="17"/>
-        </w:rPr>
-        <w:t xml:space="preserve">", </w:t>
+        <w:t xml:space="preserve">  "sentiment": "negatif", </w:t>
       </w:r>
     </w:p>
     <w:p>
@@ -1526,29 +1633,7 @@
         <w:rPr>
           <w:sz w:val="17"/>
         </w:rPr>
-        <w:t xml:space="preserve">  "</w:t>
-      </w:r>
-      <w:proofErr w:type="spellStart"/>
-      <w:r>
-        <w:rPr>
-          <w:sz w:val="17"/>
-        </w:rPr>
-        <w:t>categorie</w:t>
-      </w:r>
-      <w:proofErr w:type="spellEnd"/>
-      <w:proofErr w:type="gramStart"/>
-      <w:r>
-        <w:rPr>
-          <w:sz w:val="17"/>
-        </w:rPr>
-        <w:t>":</w:t>
-      </w:r>
-      <w:proofErr w:type="gramEnd"/>
-      <w:r>
-        <w:rPr>
-          <w:sz w:val="17"/>
-        </w:rPr>
-        <w:t xml:space="preserve"> "livraison", </w:t>
+        <w:t xml:space="preserve">  "categorie": "livraison", </w:t>
       </w:r>
     </w:p>
     <w:p>
@@ -1560,21 +1645,7 @@
         <w:rPr>
           <w:sz w:val="17"/>
         </w:rPr>
-        <w:t xml:space="preserve">  "urgence</w:t>
-      </w:r>
-      <w:proofErr w:type="gramStart"/>
-      <w:r>
-        <w:rPr>
-          <w:sz w:val="17"/>
-        </w:rPr>
-        <w:t>":</w:t>
-      </w:r>
-      <w:proofErr w:type="gramEnd"/>
-      <w:r>
-        <w:rPr>
-          <w:sz w:val="17"/>
-        </w:rPr>
-        <w:t xml:space="preserve"> "moyenne", </w:t>
+        <w:t xml:space="preserve">  "urgence": "moyenne", </w:t>
       </w:r>
     </w:p>
     <w:p>
@@ -1586,29 +1657,7 @@
         <w:rPr>
           <w:sz w:val="17"/>
         </w:rPr>
-        <w:t xml:space="preserve">  "</w:t>
-      </w:r>
-      <w:proofErr w:type="spellStart"/>
-      <w:r>
-        <w:rPr>
-          <w:sz w:val="17"/>
-        </w:rPr>
-        <w:t>probleme</w:t>
-      </w:r>
-      <w:proofErr w:type="spellEnd"/>
-      <w:proofErr w:type="gramStart"/>
-      <w:r>
-        <w:rPr>
-          <w:sz w:val="17"/>
-        </w:rPr>
-        <w:t>":</w:t>
-      </w:r>
-      <w:proofErr w:type="gramEnd"/>
-      <w:r>
-        <w:rPr>
-          <w:sz w:val="17"/>
-        </w:rPr>
-        <w:t xml:space="preserve"> "Retard de livraison", </w:t>
+        <w:t xml:space="preserve">  "probleme": "Retard de livraison", </w:t>
       </w:r>
     </w:p>
     <w:p>
@@ -1620,21 +1669,7 @@
         <w:rPr>
           <w:sz w:val="17"/>
         </w:rPr>
-        <w:t xml:space="preserve">  "confiance</w:t>
-      </w:r>
-      <w:proofErr w:type="gramStart"/>
-      <w:r>
-        <w:rPr>
-          <w:sz w:val="17"/>
-        </w:rPr>
-        <w:t>":</w:t>
-      </w:r>
-      <w:proofErr w:type="gramEnd"/>
-      <w:r>
-        <w:rPr>
-          <w:sz w:val="17"/>
-        </w:rPr>
-        <w:t xml:space="preserve"> 0.91 </w:t>
+        <w:t xml:space="preserve">  "confiance": 0.91 </w:t>
       </w:r>
     </w:p>
     <w:p>
@@ -1665,15 +1700,7 @@
         <w:ind w:right="0" w:hanging="338"/>
       </w:pPr>
       <w:r>
-        <w:t xml:space="preserve">Ajouter une validation en définissant les règles de sortie suivantes : format JSON valide ; aucune propriété supplémentaire ; sentiment vaut positif, </w:t>
-      </w:r>
-      <w:proofErr w:type="spellStart"/>
-      <w:r>
-        <w:t>negatif</w:t>
-      </w:r>
-      <w:proofErr w:type="spellEnd"/>
-      <w:r>
-        <w:t xml:space="preserve"> ou neutre ; confiance est compris entre 0 et 1 ; urgence vaut faible, moyenne ou élevée. </w:t>
+        <w:t xml:space="preserve">Ajouter une validation en définissant les règles de sortie suivantes : format JSON valide ; aucune propriété supplémentaire ; sentiment vaut positif, negatif ou neutre ; confiance est compris entre 0 et 1 ; urgence vaut faible, moyenne ou élevée. </w:t>
       </w:r>
     </w:p>
     <w:p>
@@ -1721,14 +1748,12 @@
       <w:r>
         <w:t xml:space="preserve">Créer un prompt permettant de classer un ticket informatique dans une catégorie (réseau, logiciel, matériel, sécurité, accès, autre). La réponse est au format JSON avec les champs </w:t>
       </w:r>
-      <w:proofErr w:type="spellStart"/>
       <w:r>
         <w:rPr>
           <w:sz w:val="17"/>
         </w:rPr>
         <w:t>categorie</w:t>
       </w:r>
-      <w:proofErr w:type="spellEnd"/>
       <w:r>
         <w:t xml:space="preserve"> et </w:t>
       </w:r>
@@ -1751,40 +1776,14 @@
         <w:ind w:right="0" w:hanging="338"/>
       </w:pPr>
       <w:r>
-        <w:t>Créer un prompt permettant d’extraire, à partir d’une facture, les infos (</w:t>
-      </w:r>
-      <w:proofErr w:type="spellStart"/>
-      <w:r>
-        <w:t>numéro_facture</w:t>
-      </w:r>
-      <w:proofErr w:type="spellEnd"/>
-      <w:r>
-        <w:t xml:space="preserve">, date, client, </w:t>
-      </w:r>
-      <w:proofErr w:type="spellStart"/>
-      <w:r>
-        <w:t>montant_ht</w:t>
-      </w:r>
-      <w:proofErr w:type="spellEnd"/>
-      <w:r>
-        <w:t xml:space="preserve">, tva, </w:t>
-      </w:r>
-      <w:proofErr w:type="spellStart"/>
-      <w:r>
-        <w:t>montant_ttc</w:t>
-      </w:r>
-      <w:proofErr w:type="spellEnd"/>
-      <w:r>
-        <w:t xml:space="preserve">). Retourner uniquement un JSON valide avec </w:t>
-      </w:r>
-      <w:proofErr w:type="spellStart"/>
+        <w:t xml:space="preserve">Créer un prompt permettant d’extraire, à partir d’une facture, les infos (numéro_facture, date, client, montant_ht, tva, montant_ttc). Retourner uniquement un JSON valide avec </w:t>
+      </w:r>
       <w:r>
         <w:rPr>
           <w:sz w:val="17"/>
         </w:rPr>
         <w:t>null</w:t>
       </w:r>
-      <w:proofErr w:type="spellEnd"/>
       <w:r>
         <w:t xml:space="preserve"> si une info est absente </w:t>
       </w:r>
@@ -1810,19 +1809,11 @@
           <w:lang w:val="en-CA"/>
         </w:rPr>
       </w:pPr>
-      <w:proofErr w:type="spellStart"/>
       <w:r>
         <w:rPr>
           <w:lang w:val="en-CA"/>
         </w:rPr>
-        <w:t>Partie</w:t>
-      </w:r>
-      <w:proofErr w:type="spellEnd"/>
-      <w:r>
-        <w:rPr>
-          <w:lang w:val="en-CA"/>
-        </w:rPr>
-        <w:t xml:space="preserve"> 6 – Prompt Engineering pour le Machine Learning </w:t>
+        <w:t xml:space="preserve">Partie 6 – Prompt Engineering pour le Machine Learning </w:t>
       </w:r>
     </w:p>
     <w:p>
@@ -1835,15 +1826,7 @@
         <w:ind w:right="0" w:hanging="338"/>
       </w:pPr>
       <w:r>
-        <w:t xml:space="preserve">Créer un prompt permettant, à partir du </w:t>
-      </w:r>
-      <w:proofErr w:type="spellStart"/>
-      <w:r>
-        <w:t>dataset</w:t>
-      </w:r>
-      <w:proofErr w:type="spellEnd"/>
-      <w:r>
-        <w:t xml:space="preserve"> des capteurs, de proposer des stratégies (détection, traitement, risques associés) de traitement des valeurs manquantes, des doublons, des valeurs aberrantes, des variables catégorielles </w:t>
+        <w:t xml:space="preserve">Créer un prompt permettant, à partir du dataset des capteurs, de proposer des stratégies (détection, traitement, risques associés) de traitement des valeurs manquantes, des doublons, des valeurs aberrantes, des variables catégorielles </w:t>
       </w:r>
     </w:p>
     <w:p>
@@ -1856,16 +1839,7 @@
         <w:ind w:right="0" w:hanging="338"/>
       </w:pPr>
       <w:r>
-        <w:lastRenderedPageBreak/>
-        <w:t xml:space="preserve">Créer un prompt permettant, à partir du </w:t>
-      </w:r>
-      <w:proofErr w:type="spellStart"/>
-      <w:r>
-        <w:t>dataset</w:t>
-      </w:r>
-      <w:proofErr w:type="spellEnd"/>
-      <w:r>
-        <w:t xml:space="preserve"> des capteurs, de proposer les visualisations les plus pertinentes pour comprendre la consommation énergétique d'un bâtiment. Et pour chaque visualisation indiquer le type de graphique, les variables utilisées, l’objectif et l’interprétation attendue. </w:t>
+        <w:t xml:space="preserve">Créer un prompt permettant, à partir du dataset des capteurs, de proposer les visualisations les plus pertinentes pour comprendre la consommation énergétique d'un bâtiment. Et pour chaque visualisation indiquer le type de graphique, les variables utilisées, l’objectif et l’interprétation attendue. </w:t>
       </w:r>
     </w:p>
     <w:p>
@@ -1878,15 +1852,7 @@
         <w:ind w:right="0" w:hanging="338"/>
       </w:pPr>
       <w:r>
-        <w:t xml:space="preserve">Créer un prompt permettant, à partir du </w:t>
-      </w:r>
-      <w:proofErr w:type="spellStart"/>
-      <w:r>
-        <w:t>dataset</w:t>
-      </w:r>
-      <w:proofErr w:type="spellEnd"/>
-      <w:r>
-        <w:t xml:space="preserve"> des capteurs, de proposer plusieurs modèles adaptés à la prédiction de la consommation énergétique d'un bâtiment. Pour chaque modèle, le LLM doit indiquer le principe, les avantages, les limites, le type de problème et les métriques pertinentes. </w:t>
+        <w:t xml:space="preserve">Créer un prompt permettant, à partir du dataset des capteurs, de proposer plusieurs modèles adaptés à la prédiction de la consommation énergétique d'un bâtiment. Pour chaque modèle, le LLM doit indiquer le principe, les avantages, les limites, le type de problème et les métriques pertinentes. </w:t>
       </w:r>
     </w:p>
     <w:p>
@@ -1899,31 +1865,11 @@
         <w:ind w:right="0" w:hanging="338"/>
       </w:pPr>
       <w:r>
-        <w:t>Créer un prompt permettant d’expliquer les métriques de classification (</w:t>
-      </w:r>
-      <w:proofErr w:type="spellStart"/>
-      <w:r>
-        <w:t>Accuracy</w:t>
-      </w:r>
-      <w:proofErr w:type="spellEnd"/>
-      <w:r>
-        <w:t xml:space="preserve">, </w:t>
-      </w:r>
-      <w:proofErr w:type="spellStart"/>
-      <w:r>
-        <w:t>Precision</w:t>
-      </w:r>
-      <w:proofErr w:type="spellEnd"/>
-      <w:r>
-        <w:t xml:space="preserve">, </w:t>
-      </w:r>
-      <w:proofErr w:type="spellStart"/>
-      <w:r>
-        <w:t>Recall</w:t>
-      </w:r>
-      <w:proofErr w:type="spellEnd"/>
-      <w:r>
-        <w:t xml:space="preserve">, F1-score, ROC-AUC). Pour chacune, le LLM doit donner la définition, expliquer son interprétation, donner un exemple concret et indiquer dans quel contexte elle est particulièrement utile. </w:t>
+        <w:t xml:space="preserve">Créer un prompt permettant d’expliquer les métriques de classification (Accuracy, Precision, Recall, F1-score, ROC-AUC). Pour chacune, le LLM doit donner la définition, expliquer </w:t>
+      </w:r>
+      <w:r>
+        <w:lastRenderedPageBreak/>
+        <w:t xml:space="preserve">son interprétation, donner un exemple concret et indiquer dans quel contexte elle est particulièrement utile. </w:t>
       </w:r>
     </w:p>
     <w:p>
@@ -2128,16 +2074,8 @@
         <w:rPr>
           <w:sz w:val="19"/>
         </w:rPr>
-        <w:t>ai-</w:t>
-      </w:r>
-      <w:proofErr w:type="spellStart"/>
-      <w:r>
-        <w:rPr>
-          <w:sz w:val="19"/>
-        </w:rPr>
-        <w:t>business_assistant</w:t>
-      </w:r>
-      <w:proofErr w:type="spellEnd"/>
+        <w:t>ai-business_assistant</w:t>
+      </w:r>
       <w:r>
         <w:t xml:space="preserve"> contenant le fichier</w:t>
       </w:r>
@@ -2182,21 +2120,8 @@
         </w:numPr>
         <w:ind w:right="0" w:hanging="338"/>
       </w:pPr>
-      <w:proofErr w:type="gramStart"/>
-      <w:r>
-        <w:t>pousse</w:t>
-      </w:r>
-      <w:proofErr w:type="gramEnd"/>
-      <w:r>
-        <w:t xml:space="preserve"> le livrable, d’abord vide, sur un dépôt public de son compte </w:t>
-      </w:r>
-      <w:proofErr w:type="spellStart"/>
-      <w:r>
-        <w:t>Github</w:t>
-      </w:r>
-      <w:proofErr w:type="spellEnd"/>
-      <w:r>
-        <w:t xml:space="preserve"> personnel </w:t>
+      <w:r>
+        <w:t xml:space="preserve">pousse le livrable, d’abord vide, sur un dépôt public de son compte Github personnel </w:t>
       </w:r>
     </w:p>
     <w:p>
@@ -2207,13 +2132,8 @@
         </w:numPr>
         <w:ind w:right="0" w:hanging="338"/>
       </w:pPr>
-      <w:proofErr w:type="gramStart"/>
-      <w:r>
-        <w:t>met</w:t>
-      </w:r>
-      <w:proofErr w:type="gramEnd"/>
-      <w:r>
-        <w:t xml:space="preserve"> à jour le livrable après chaque tâche accomplie, avec un message de commit explicite </w:t>
+      <w:r>
+        <w:t xml:space="preserve">met à jour le livrable après chaque tâche accomplie, avec un message de commit explicite </w:t>
       </w:r>
     </w:p>
     <w:sectPr>

</xml_diff>

<commit_message>
Proposer au modèle un texte à analyser avec des contraintes puis utiliser un second prompt et lui demandant de vérifier sa réponse précédente
</commit_message>
<xml_diff>
--- a/ai-business_assistant/atelier-prompt-engineering.docx
+++ b/ai-business_assistant/atelier-prompt-engineering.docx
@@ -1698,45 +1698,537 @@
         <w:spacing w:after="33" w:line="266" w:lineRule="auto"/>
         <w:ind w:right="0"/>
       </w:pPr>
+      <w:r>
+        <w:t>Présente le résultat final sous la forme :</w:t>
+      </w:r>
+    </w:p>
+    <w:p>
+      <w:pPr>
+        <w:spacing w:after="33" w:line="266" w:lineRule="auto"/>
+        <w:ind w:right="0"/>
+      </w:pPr>
+      <w:r>
+        <w:t>1. Liste des problèmes prioritaires (du plus au moins important)</w:t>
+      </w:r>
+    </w:p>
+    <w:p>
+      <w:pPr>
+        <w:spacing w:after="33" w:line="266" w:lineRule="auto"/>
+        <w:ind w:right="0"/>
+      </w:pPr>
+      <w:r>
+        <w:t>2. Recommandation associée à chaque problème</w:t>
+      </w:r>
+    </w:p>
+    <w:p>
+      <w:pPr>
+        <w:spacing w:after="33" w:line="266" w:lineRule="auto"/>
+        <w:ind w:right="0"/>
+      </w:pPr>
+      <w:r>
+        <w:t xml:space="preserve">C'est la technique du </w:t>
+      </w:r>
+      <w:proofErr w:type="spellStart"/>
+      <w:r>
+        <w:rPr>
+          <w:rStyle w:val="lev"/>
+        </w:rPr>
+        <w:t>chain</w:t>
+      </w:r>
+      <w:proofErr w:type="spellEnd"/>
+      <w:r>
+        <w:rPr>
+          <w:rStyle w:val="lev"/>
+        </w:rPr>
+        <w:t>-of-</w:t>
+      </w:r>
+      <w:proofErr w:type="spellStart"/>
+      <w:r>
+        <w:rPr>
+          <w:rStyle w:val="lev"/>
+        </w:rPr>
+        <w:t>thought</w:t>
+      </w:r>
+      <w:proofErr w:type="spellEnd"/>
+      <w:r>
+        <w:rPr>
+          <w:rStyle w:val="lev"/>
+        </w:rPr>
+        <w:t xml:space="preserve"> guidé / décomposition en étapes</w:t>
+      </w:r>
+      <w:r>
+        <w:t xml:space="preserve"> : au lieu de demander un raisonnement complexe en une seule fois, on force le modèle à suivre un chemin logique explicite, ce qui réduit les oublis et améliore la cohérence de la réponse finale.</w:t>
+      </w:r>
+    </w:p>
+    <w:p>
+      <w:pPr>
+        <w:ind w:left="664" w:right="0" w:hanging="338"/>
+      </w:pPr>
+    </w:p>
+    <w:p>
+      <w:pPr>
+        <w:ind w:left="664" w:right="0" w:hanging="338"/>
+      </w:pPr>
+      <w:r>
+        <w:t xml:space="preserve">2) Proposer au modèle un texte à analyser avec des contraintes puis utiliser un second prompt lui demandant de vérifier sa réponse précédente et de contrôler les informations non justifiées, les contradictions, les informations absentes, les éventuelles hallucinations et le respect des contraintes. </w:t>
+      </w:r>
+    </w:p>
+    <w:p>
+      <w:pPr>
+        <w:spacing w:before="100" w:beforeAutospacing="1" w:after="100" w:afterAutospacing="1" w:line="240" w:lineRule="auto"/>
+        <w:ind w:left="0" w:right="0" w:firstLine="0"/>
+        <w:rPr>
+          <w:color w:val="auto"/>
+          <w:sz w:val="24"/>
+          <w:szCs w:val="24"/>
+        </w:rPr>
+      </w:pPr>
+      <w:r>
+        <w:rPr>
+          <w:color w:val="auto"/>
+          <w:sz w:val="24"/>
+          <w:szCs w:val="24"/>
+        </w:rPr>
+        <w:t>Prompt 1 (analyse initiale)</w:t>
+      </w:r>
+    </w:p>
+    <w:p>
+      <w:pPr>
+        <w:spacing w:before="100" w:beforeAutospacing="1" w:after="100" w:afterAutospacing="1" w:line="240" w:lineRule="auto"/>
+        <w:ind w:left="0" w:right="0" w:firstLine="0"/>
+        <w:rPr>
+          <w:color w:val="auto"/>
+          <w:sz w:val="24"/>
+          <w:szCs w:val="24"/>
+        </w:rPr>
+      </w:pPr>
+      <w:r>
+        <w:rPr>
+          <w:color w:val="auto"/>
+          <w:sz w:val="24"/>
+          <w:szCs w:val="24"/>
+        </w:rPr>
+        <w:t>Voici des avis clients d'un restaurant :</w:t>
+      </w:r>
+    </w:p>
+    <w:p>
+      <w:pPr>
+        <w:spacing w:before="100" w:beforeAutospacing="1" w:after="100" w:afterAutospacing="1" w:line="240" w:lineRule="auto"/>
+        <w:ind w:left="720" w:right="0" w:firstLine="0"/>
+        <w:rPr>
+          <w:color w:val="auto"/>
+          <w:sz w:val="24"/>
+          <w:szCs w:val="24"/>
+        </w:rPr>
+      </w:pPr>
+      <w:r>
+        <w:rPr>
+          <w:color w:val="auto"/>
+          <w:sz w:val="24"/>
+          <w:szCs w:val="24"/>
+        </w:rPr>
+        <w:t>"Le plat était délicieux mais on a attendu 45 minutes avant d'être servis."</w:t>
+      </w:r>
+    </w:p>
+    <w:p>
+      <w:pPr>
+        <w:spacing w:before="100" w:beforeAutospacing="1" w:after="100" w:afterAutospacing="1" w:line="240" w:lineRule="auto"/>
+        <w:ind w:left="720" w:right="0" w:firstLine="0"/>
+        <w:rPr>
+          <w:color w:val="auto"/>
+          <w:sz w:val="24"/>
+          <w:szCs w:val="24"/>
+        </w:rPr>
+      </w:pPr>
+      <w:r>
+        <w:rPr>
+          <w:color w:val="auto"/>
+          <w:sz w:val="24"/>
+          <w:szCs w:val="24"/>
+        </w:rPr>
+        <w:t>"Excellent accueil, le personnel est très souriant et attentionné."</w:t>
+      </w:r>
+    </w:p>
+    <w:p>
+      <w:pPr>
+        <w:spacing w:before="100" w:beforeAutospacing="1" w:after="100" w:afterAutospacing="1" w:line="240" w:lineRule="auto"/>
+        <w:ind w:left="720" w:right="0" w:firstLine="0"/>
+        <w:rPr>
+          <w:color w:val="auto"/>
+          <w:sz w:val="24"/>
+          <w:szCs w:val="24"/>
+        </w:rPr>
+      </w:pPr>
+      <w:r>
+        <w:rPr>
+          <w:color w:val="auto"/>
+          <w:sz w:val="24"/>
+          <w:szCs w:val="24"/>
+        </w:rPr>
+        <w:t>"J'ai trouvé un cheveu dans mon assiette, très décevant."</w:t>
+      </w:r>
+    </w:p>
+    <w:p>
+      <w:pPr>
+        <w:spacing w:before="100" w:beforeAutospacing="1" w:after="100" w:afterAutospacing="1" w:line="240" w:lineRule="auto"/>
+        <w:ind w:left="720" w:right="0" w:firstLine="0"/>
+        <w:rPr>
+          <w:color w:val="auto"/>
+          <w:sz w:val="24"/>
+          <w:szCs w:val="24"/>
+        </w:rPr>
+      </w:pPr>
+      <w:r>
+        <w:rPr>
+          <w:color w:val="auto"/>
+          <w:sz w:val="24"/>
+          <w:szCs w:val="24"/>
+        </w:rPr>
+        <w:t>"Rapport qualité-prix correct, rien d'exceptionnel mais ça passe."</w:t>
+      </w:r>
+    </w:p>
+    <w:p>
+      <w:pPr>
+        <w:spacing w:before="100" w:beforeAutospacing="1" w:after="100" w:afterAutospacing="1" w:line="240" w:lineRule="auto"/>
+        <w:ind w:left="720" w:right="0" w:firstLine="0"/>
+        <w:rPr>
+          <w:color w:val="auto"/>
+          <w:sz w:val="24"/>
+          <w:szCs w:val="24"/>
+        </w:rPr>
+      </w:pPr>
+      <w:r>
+        <w:rPr>
+          <w:color w:val="auto"/>
+          <w:sz w:val="24"/>
+          <w:szCs w:val="24"/>
+        </w:rPr>
+        <w:t>"La salle est bruyante, difficile de discuter tranquillement."</w:t>
+      </w:r>
+    </w:p>
+    <w:p>
+      <w:pPr>
+        <w:spacing w:before="100" w:beforeAutospacing="1" w:after="100" w:afterAutospacing="1" w:line="240" w:lineRule="auto"/>
+        <w:ind w:left="720" w:right="0" w:firstLine="0"/>
+        <w:rPr>
+          <w:color w:val="auto"/>
+          <w:sz w:val="24"/>
+          <w:szCs w:val="24"/>
+        </w:rPr>
+      </w:pPr>
+      <w:r>
+        <w:rPr>
+          <w:color w:val="auto"/>
+          <w:sz w:val="24"/>
+          <w:szCs w:val="24"/>
+        </w:rPr>
+        <w:t>"Réservation facile en ligne, tout s'est bien passé."</w:t>
+      </w:r>
+    </w:p>
+    <w:p>
+      <w:pPr>
+        <w:spacing w:before="100" w:beforeAutospacing="1" w:after="100" w:afterAutospacing="1" w:line="240" w:lineRule="auto"/>
+        <w:ind w:left="0" w:right="0" w:firstLine="0"/>
+        <w:rPr>
+          <w:color w:val="auto"/>
+          <w:sz w:val="24"/>
+          <w:szCs w:val="24"/>
+        </w:rPr>
+      </w:pPr>
+      <w:r>
+        <w:rPr>
+          <w:color w:val="auto"/>
+          <w:sz w:val="24"/>
+          <w:szCs w:val="24"/>
+        </w:rPr>
+        <w:t>Analyse ces avis et donne les 3 problèmes les plus importants ainsi qu'une recommandation pour chacun. Ne te base que sur les avis fournis, n'invente rien.</w:t>
+      </w:r>
+    </w:p>
+    <w:p>
+      <w:pPr>
+        <w:spacing w:before="100" w:beforeAutospacing="1" w:after="100" w:afterAutospacing="1" w:line="240" w:lineRule="auto"/>
+        <w:ind w:left="0" w:right="0" w:firstLine="0"/>
+        <w:rPr>
+          <w:color w:val="auto"/>
+          <w:sz w:val="24"/>
+          <w:szCs w:val="24"/>
+        </w:rPr>
+      </w:pPr>
+      <w:r>
+        <w:rPr>
+          <w:noProof/>
+          <w:color w:val="auto"/>
+          <w:sz w:val="24"/>
+          <w:szCs w:val="24"/>
+        </w:rPr>
+        <w:lastRenderedPageBreak/>
+        <w:drawing>
+          <wp:inline distT="0" distB="0" distL="0" distR="0" wp14:anchorId="5E9D0DC5" wp14:editId="5E34AB16">
+            <wp:extent cx="5382260" cy="2197735"/>
+            <wp:effectExtent l="0" t="0" r="8890" b="0"/>
+            <wp:docPr id="6" name="Image 6"/>
+            <wp:cNvGraphicFramePr>
+              <a:graphicFrameLocks xmlns:a="http://schemas.openxmlformats.org/drawingml/2006/main" noChangeAspect="1"/>
+            </wp:cNvGraphicFramePr>
+            <a:graphic xmlns:a="http://schemas.openxmlformats.org/drawingml/2006/main">
+              <a:graphicData uri="http://schemas.openxmlformats.org/drawingml/2006/picture">
+                <pic:pic xmlns:pic="http://schemas.openxmlformats.org/drawingml/2006/picture">
+                  <pic:nvPicPr>
+                    <pic:cNvPr id="6" name="Capture d'écran 2026-09-10 091555.png"/>
+                    <pic:cNvPicPr/>
+                  </pic:nvPicPr>
+                  <pic:blipFill>
+                    <a:blip r:embed="rId12">
+                      <a:extLst>
+                        <a:ext uri="{28A0092B-C50C-407E-A947-70E740481C1C}">
+                          <a14:useLocalDpi xmlns:a14="http://schemas.microsoft.com/office/drawing/2010/main" val="0"/>
+                        </a:ext>
+                      </a:extLst>
+                    </a:blip>
+                    <a:stretch>
+                      <a:fillRect/>
+                    </a:stretch>
+                  </pic:blipFill>
+                  <pic:spPr>
+                    <a:xfrm>
+                      <a:off x="0" y="0"/>
+                      <a:ext cx="5382260" cy="2197735"/>
+                    </a:xfrm>
+                    <a:prstGeom prst="rect">
+                      <a:avLst/>
+                    </a:prstGeom>
+                  </pic:spPr>
+                </pic:pic>
+              </a:graphicData>
+            </a:graphic>
+          </wp:inline>
+        </w:drawing>
+      </w:r>
+    </w:p>
+    <w:p>
+      <w:pPr>
+        <w:spacing w:before="100" w:beforeAutospacing="1" w:after="100" w:afterAutospacing="1" w:line="240" w:lineRule="auto"/>
+        <w:ind w:left="0" w:right="0" w:firstLine="0"/>
+        <w:rPr>
+          <w:color w:val="auto"/>
+          <w:sz w:val="24"/>
+          <w:szCs w:val="24"/>
+        </w:rPr>
+      </w:pPr>
+      <w:r>
+        <w:rPr>
+          <w:color w:val="auto"/>
+          <w:sz w:val="24"/>
+          <w:szCs w:val="24"/>
+        </w:rPr>
+        <w:t>Prompt 2 (vérification de la réponse précédente)</w:t>
+      </w:r>
+    </w:p>
+    <w:p>
+      <w:pPr>
+        <w:spacing w:before="100" w:beforeAutospacing="1" w:after="100" w:afterAutospacing="1" w:line="240" w:lineRule="auto"/>
+        <w:ind w:left="0" w:right="0" w:firstLine="0"/>
+        <w:rPr>
+          <w:color w:val="auto"/>
+          <w:sz w:val="24"/>
+          <w:szCs w:val="24"/>
+        </w:rPr>
+      </w:pPr>
+      <w:r>
+        <w:rPr>
+          <w:color w:val="auto"/>
+          <w:sz w:val="24"/>
+          <w:szCs w:val="24"/>
+        </w:rPr>
+        <w:t>Relis ta réponse précédente et vérifie-la selon les points suivants :</w:t>
+      </w:r>
+    </w:p>
+    <w:p>
+      <w:pPr>
+        <w:spacing w:before="100" w:beforeAutospacing="1" w:after="100" w:afterAutospacing="1" w:line="240" w:lineRule="auto"/>
+        <w:ind w:left="720" w:right="0" w:firstLine="0"/>
+        <w:rPr>
+          <w:color w:val="auto"/>
+          <w:sz w:val="24"/>
+          <w:szCs w:val="24"/>
+        </w:rPr>
+      </w:pPr>
+      <w:r>
+        <w:rPr>
+          <w:color w:val="auto"/>
+          <w:sz w:val="24"/>
+          <w:szCs w:val="24"/>
+        </w:rPr>
+        <w:t>Informations non justifiées : chaque problème mentionné est-il bien appuyé par au moins un avis fourni ?</w:t>
+      </w:r>
+    </w:p>
+    <w:p>
+      <w:pPr>
+        <w:spacing w:before="100" w:beforeAutospacing="1" w:after="100" w:afterAutospacing="1" w:line="240" w:lineRule="auto"/>
+        <w:ind w:left="720" w:right="0" w:firstLine="0"/>
+        <w:rPr>
+          <w:color w:val="auto"/>
+          <w:sz w:val="24"/>
+          <w:szCs w:val="24"/>
+        </w:rPr>
+      </w:pPr>
+      <w:r>
+        <w:rPr>
+          <w:color w:val="auto"/>
+          <w:sz w:val="24"/>
+          <w:szCs w:val="24"/>
+        </w:rPr>
+        <w:t>Contradictions : y a-t-il des incohérences entre les problèmes identifiés et les recommandations proposées ?</w:t>
+      </w:r>
+    </w:p>
+    <w:p>
+      <w:pPr>
+        <w:spacing w:before="100" w:beforeAutospacing="1" w:after="100" w:afterAutospacing="1" w:line="240" w:lineRule="auto"/>
+        <w:ind w:left="720" w:right="0" w:firstLine="0"/>
+        <w:rPr>
+          <w:color w:val="auto"/>
+          <w:sz w:val="24"/>
+          <w:szCs w:val="24"/>
+        </w:rPr>
+      </w:pPr>
+      <w:r>
+        <w:rPr>
+          <w:color w:val="auto"/>
+          <w:sz w:val="24"/>
+          <w:szCs w:val="24"/>
+        </w:rPr>
+        <w:t>Informations absentes : as-tu oublié un problème important pourtant présent dans les avis ?</w:t>
+      </w:r>
+    </w:p>
+    <w:p>
+      <w:pPr>
+        <w:spacing w:before="100" w:beforeAutospacing="1" w:after="100" w:afterAutospacing="1" w:line="240" w:lineRule="auto"/>
+        <w:ind w:left="720" w:right="0" w:firstLine="0"/>
+        <w:rPr>
+          <w:color w:val="auto"/>
+          <w:sz w:val="24"/>
+          <w:szCs w:val="24"/>
+        </w:rPr>
+      </w:pPr>
+      <w:r>
+        <w:rPr>
+          <w:color w:val="auto"/>
+          <w:sz w:val="24"/>
+          <w:szCs w:val="24"/>
+        </w:rPr>
+        <w:t>Hallucinations : as-tu inventé un détail (chiffre, cause, fait) qui n'était pas dans les avis d'origine ?</w:t>
+      </w:r>
+    </w:p>
+    <w:p>
+      <w:pPr>
+        <w:spacing w:before="100" w:beforeAutospacing="1" w:after="100" w:afterAutospacing="1" w:line="240" w:lineRule="auto"/>
+        <w:ind w:left="720" w:right="0" w:firstLine="0"/>
+        <w:rPr>
+          <w:color w:val="auto"/>
+          <w:sz w:val="24"/>
+          <w:szCs w:val="24"/>
+        </w:rPr>
+      </w:pPr>
+      <w:r>
+        <w:rPr>
+          <w:color w:val="auto"/>
+          <w:sz w:val="24"/>
+          <w:szCs w:val="24"/>
+        </w:rPr>
+        <w:t>Respect des contraintes : ta réponse respecte-t-elle bien la consigne initiale (3 problèmes, une recommandation chacun, rien d'inventé) ?</w:t>
+      </w:r>
+    </w:p>
+    <w:p>
+      <w:pPr>
+        <w:spacing w:before="100" w:beforeAutospacing="1" w:after="100" w:afterAutospacing="1" w:line="240" w:lineRule="auto"/>
+        <w:ind w:left="0" w:right="0" w:firstLine="0"/>
+        <w:rPr>
+          <w:color w:val="auto"/>
+          <w:sz w:val="24"/>
+          <w:szCs w:val="24"/>
+        </w:rPr>
+      </w:pPr>
+      <w:r>
+        <w:rPr>
+          <w:color w:val="auto"/>
+          <w:sz w:val="24"/>
+          <w:szCs w:val="24"/>
+        </w:rPr>
+        <w:t>Corrige ta réponse si nécessaire et indique explicitement ce que tu as changé, ou confirme qu'aucune correction n'est nécessaire.</w:t>
+      </w:r>
+    </w:p>
+    <w:p>
+      <w:pPr>
+        <w:spacing w:before="100" w:beforeAutospacing="1" w:after="100" w:afterAutospacing="1" w:line="240" w:lineRule="auto"/>
+        <w:ind w:left="0" w:right="0" w:firstLine="0"/>
+        <w:rPr>
+          <w:color w:val="auto"/>
+          <w:sz w:val="24"/>
+          <w:szCs w:val="24"/>
+        </w:rPr>
+      </w:pPr>
+      <w:r>
+        <w:rPr>
+          <w:noProof/>
+          <w:color w:val="auto"/>
+          <w:sz w:val="24"/>
+          <w:szCs w:val="24"/>
+        </w:rPr>
+        <w:lastRenderedPageBreak/>
+        <w:drawing>
+          <wp:inline distT="0" distB="0" distL="0" distR="0" wp14:anchorId="3A127BF6" wp14:editId="61E801B6">
+            <wp:extent cx="5382260" cy="2506345"/>
+            <wp:effectExtent l="0" t="0" r="8890" b="8255"/>
+            <wp:docPr id="7" name="Image 7"/>
+            <wp:cNvGraphicFramePr>
+              <a:graphicFrameLocks xmlns:a="http://schemas.openxmlformats.org/drawingml/2006/main" noChangeAspect="1"/>
+            </wp:cNvGraphicFramePr>
+            <a:graphic xmlns:a="http://schemas.openxmlformats.org/drawingml/2006/main">
+              <a:graphicData uri="http://schemas.openxmlformats.org/drawingml/2006/picture">
+                <pic:pic xmlns:pic="http://schemas.openxmlformats.org/drawingml/2006/picture">
+                  <pic:nvPicPr>
+                    <pic:cNvPr id="7" name="Capture d'écran 2026-09-10 091748.png"/>
+                    <pic:cNvPicPr/>
+                  </pic:nvPicPr>
+                  <pic:blipFill>
+                    <a:blip r:embed="rId13">
+                      <a:extLst>
+                        <a:ext uri="{28A0092B-C50C-407E-A947-70E740481C1C}">
+                          <a14:useLocalDpi xmlns:a14="http://schemas.microsoft.com/office/drawing/2010/main" val="0"/>
+                        </a:ext>
+                      </a:extLst>
+                    </a:blip>
+                    <a:stretch>
+                      <a:fillRect/>
+                    </a:stretch>
+                  </pic:blipFill>
+                  <pic:spPr>
+                    <a:xfrm>
+                      <a:off x="0" y="0"/>
+                      <a:ext cx="5382260" cy="2506345"/>
+                    </a:xfrm>
+                    <a:prstGeom prst="rect">
+                      <a:avLst/>
+                    </a:prstGeom>
+                  </pic:spPr>
+                </pic:pic>
+              </a:graphicData>
+            </a:graphic>
+          </wp:inline>
+        </w:drawing>
+      </w:r>
       <w:bookmarkStart w:id="0" w:name="_GoBack"/>
       <w:bookmarkEnd w:id="0"/>
-      <w:r>
-        <w:t>Présente le résultat final sous la forme :</w:t>
-      </w:r>
-    </w:p>
-    <w:p>
-      <w:pPr>
-        <w:spacing w:after="33" w:line="266" w:lineRule="auto"/>
+    </w:p>
+    <w:p>
+      <w:pPr>
         <w:ind w:right="0"/>
       </w:pPr>
-      <w:r>
-        <w:t>1. Liste des problèmes prioritaires (du plus au moins important)</w:t>
-      </w:r>
-    </w:p>
-    <w:p>
-      <w:pPr>
-        <w:spacing w:after="33" w:line="266" w:lineRule="auto"/>
-        <w:ind w:right="0"/>
-      </w:pPr>
-      <w:r>
-        <w:t>2. Recommandation associée à chaque problème</w:t>
-      </w:r>
     </w:p>
     <w:p>
       <w:pPr>
         <w:ind w:left="664" w:right="0" w:hanging="338"/>
       </w:pPr>
-      <w:r>
-        <w:t xml:space="preserve">2) Proposer au modèle un texte à analyser avec des contraintes puis utiliser un second prompt lui </w:t>
-      </w:r>
-      <w:proofErr w:type="gramStart"/>
-      <w:r>
-        <w:t>demandant</w:t>
-      </w:r>
-      <w:proofErr w:type="gramEnd"/>
-      <w:r>
-        <w:t xml:space="preserve"> de vérifier sa réponse précédente et de contrôler les informations non justifiées, les contradictions, les informations absentes, les éventuelles hallucinations et le respect des contraintes. </w:t>
-      </w:r>
     </w:p>
     <w:p>
       <w:pPr>
@@ -2129,6 +2621,7 @@
         <w:ind w:right="0" w:hanging="338"/>
       </w:pPr>
       <w:r>
+        <w:lastRenderedPageBreak/>
         <w:t>Créer un prompt permettant d’extraire, à partir d’une facture, les infos (</w:t>
       </w:r>
       <w:proofErr w:type="spellStart"/>
@@ -2193,7 +2686,6 @@
         <w:rPr>
           <w:lang w:val="en-CA"/>
         </w:rPr>
-        <w:lastRenderedPageBreak/>
         <w:t>Partie</w:t>
       </w:r>
       <w:proofErr w:type="spellEnd"/>
@@ -2491,6 +2983,7 @@
         <w:ind w:left="-5"/>
       </w:pPr>
       <w:r>
+        <w:lastRenderedPageBreak/>
         <w:t xml:space="preserve">Livrable attendu </w:t>
       </w:r>
     </w:p>
@@ -2595,9 +3088,9 @@
       </w:r>
     </w:p>
     <w:sectPr>
-      <w:footerReference w:type="even" r:id="rId12"/>
-      <w:footerReference w:type="default" r:id="rId13"/>
-      <w:footerReference w:type="first" r:id="rId14"/>
+      <w:footerReference w:type="even" r:id="rId14"/>
+      <w:footerReference w:type="default" r:id="rId15"/>
+      <w:footerReference w:type="first" r:id="rId16"/>
       <w:pgSz w:w="12240" w:h="15840"/>
       <w:pgMar w:top="1404" w:right="1892" w:bottom="1567" w:left="1872" w:header="720" w:footer="681" w:gutter="0"/>
       <w:cols w:space="720"/>
@@ -3337,6 +3830,119 @@
     </w:lvl>
   </w:abstractNum>
   <w:abstractNum w:abstractNumId="3" w15:restartNumberingAfterBreak="0">
+    <w:nsid w:val="290B42B9"/>
+    <w:multiLevelType w:val="multilevel"/>
+    <w:tmpl w:val="0F8CD368"/>
+    <w:lvl w:ilvl="0">
+      <w:start w:val="1"/>
+      <w:numFmt w:val="decimal"/>
+      <w:lvlText w:val="%1."/>
+      <w:lvlJc w:val="left"/>
+      <w:pPr>
+        <w:tabs>
+          <w:tab w:val="num" w:pos="720"/>
+        </w:tabs>
+        <w:ind w:left="720" w:hanging="360"/>
+      </w:pPr>
+    </w:lvl>
+    <w:lvl w:ilvl="1" w:tentative="1">
+      <w:start w:val="1"/>
+      <w:numFmt w:val="decimal"/>
+      <w:lvlText w:val="%2."/>
+      <w:lvlJc w:val="left"/>
+      <w:pPr>
+        <w:tabs>
+          <w:tab w:val="num" w:pos="1440"/>
+        </w:tabs>
+        <w:ind w:left="1440" w:hanging="360"/>
+      </w:pPr>
+    </w:lvl>
+    <w:lvl w:ilvl="2" w:tentative="1">
+      <w:start w:val="1"/>
+      <w:numFmt w:val="decimal"/>
+      <w:lvlText w:val="%3."/>
+      <w:lvlJc w:val="left"/>
+      <w:pPr>
+        <w:tabs>
+          <w:tab w:val="num" w:pos="2160"/>
+        </w:tabs>
+        <w:ind w:left="2160" w:hanging="360"/>
+      </w:pPr>
+    </w:lvl>
+    <w:lvl w:ilvl="3" w:tentative="1">
+      <w:start w:val="1"/>
+      <w:numFmt w:val="decimal"/>
+      <w:lvlText w:val="%4."/>
+      <w:lvlJc w:val="left"/>
+      <w:pPr>
+        <w:tabs>
+          <w:tab w:val="num" w:pos="2880"/>
+        </w:tabs>
+        <w:ind w:left="2880" w:hanging="360"/>
+      </w:pPr>
+    </w:lvl>
+    <w:lvl w:ilvl="4" w:tentative="1">
+      <w:start w:val="1"/>
+      <w:numFmt w:val="decimal"/>
+      <w:lvlText w:val="%5."/>
+      <w:lvlJc w:val="left"/>
+      <w:pPr>
+        <w:tabs>
+          <w:tab w:val="num" w:pos="3600"/>
+        </w:tabs>
+        <w:ind w:left="3600" w:hanging="360"/>
+      </w:pPr>
+    </w:lvl>
+    <w:lvl w:ilvl="5" w:tentative="1">
+      <w:start w:val="1"/>
+      <w:numFmt w:val="decimal"/>
+      <w:lvlText w:val="%6."/>
+      <w:lvlJc w:val="left"/>
+      <w:pPr>
+        <w:tabs>
+          <w:tab w:val="num" w:pos="4320"/>
+        </w:tabs>
+        <w:ind w:left="4320" w:hanging="360"/>
+      </w:pPr>
+    </w:lvl>
+    <w:lvl w:ilvl="6" w:tentative="1">
+      <w:start w:val="1"/>
+      <w:numFmt w:val="decimal"/>
+      <w:lvlText w:val="%7."/>
+      <w:lvlJc w:val="left"/>
+      <w:pPr>
+        <w:tabs>
+          <w:tab w:val="num" w:pos="5040"/>
+        </w:tabs>
+        <w:ind w:left="5040" w:hanging="360"/>
+      </w:pPr>
+    </w:lvl>
+    <w:lvl w:ilvl="7" w:tentative="1">
+      <w:start w:val="1"/>
+      <w:numFmt w:val="decimal"/>
+      <w:lvlText w:val="%8."/>
+      <w:lvlJc w:val="left"/>
+      <w:pPr>
+        <w:tabs>
+          <w:tab w:val="num" w:pos="5760"/>
+        </w:tabs>
+        <w:ind w:left="5760" w:hanging="360"/>
+      </w:pPr>
+    </w:lvl>
+    <w:lvl w:ilvl="8" w:tentative="1">
+      <w:start w:val="1"/>
+      <w:numFmt w:val="decimal"/>
+      <w:lvlText w:val="%9."/>
+      <w:lvlJc w:val="left"/>
+      <w:pPr>
+        <w:tabs>
+          <w:tab w:val="num" w:pos="6480"/>
+        </w:tabs>
+        <w:ind w:left="6480" w:hanging="360"/>
+      </w:pPr>
+    </w:lvl>
+  </w:abstractNum>
+  <w:abstractNum w:abstractNumId="4" w15:restartNumberingAfterBreak="0">
     <w:nsid w:val="32DF46D2"/>
     <w:multiLevelType w:val="hybridMultilevel"/>
     <w:tmpl w:val="4F40D602"/>
@@ -3548,7 +4154,7 @@
       </w:rPr>
     </w:lvl>
   </w:abstractNum>
-  <w:abstractNum w:abstractNumId="4" w15:restartNumberingAfterBreak="0">
+  <w:abstractNum w:abstractNumId="5" w15:restartNumberingAfterBreak="0">
     <w:nsid w:val="4E2221DD"/>
     <w:multiLevelType w:val="hybridMultilevel"/>
     <w:tmpl w:val="AD9EFD40"/>
@@ -3760,7 +4366,7 @@
       </w:rPr>
     </w:lvl>
   </w:abstractNum>
-  <w:abstractNum w:abstractNumId="5" w15:restartNumberingAfterBreak="0">
+  <w:abstractNum w:abstractNumId="6" w15:restartNumberingAfterBreak="0">
     <w:nsid w:val="51A61F96"/>
     <w:multiLevelType w:val="multilevel"/>
     <w:tmpl w:val="C6A42D10"/>
@@ -3873,7 +4479,120 @@
       </w:pPr>
     </w:lvl>
   </w:abstractNum>
-  <w:abstractNum w:abstractNumId="6" w15:restartNumberingAfterBreak="0">
+  <w:abstractNum w:abstractNumId="7" w15:restartNumberingAfterBreak="0">
+    <w:nsid w:val="690534B6"/>
+    <w:multiLevelType w:val="multilevel"/>
+    <w:tmpl w:val="B950AE76"/>
+    <w:lvl w:ilvl="0">
+      <w:start w:val="1"/>
+      <w:numFmt w:val="decimal"/>
+      <w:lvlText w:val="%1."/>
+      <w:lvlJc w:val="left"/>
+      <w:pPr>
+        <w:tabs>
+          <w:tab w:val="num" w:pos="720"/>
+        </w:tabs>
+        <w:ind w:left="720" w:hanging="360"/>
+      </w:pPr>
+    </w:lvl>
+    <w:lvl w:ilvl="1" w:tentative="1">
+      <w:start w:val="1"/>
+      <w:numFmt w:val="decimal"/>
+      <w:lvlText w:val="%2."/>
+      <w:lvlJc w:val="left"/>
+      <w:pPr>
+        <w:tabs>
+          <w:tab w:val="num" w:pos="1440"/>
+        </w:tabs>
+        <w:ind w:left="1440" w:hanging="360"/>
+      </w:pPr>
+    </w:lvl>
+    <w:lvl w:ilvl="2" w:tentative="1">
+      <w:start w:val="1"/>
+      <w:numFmt w:val="decimal"/>
+      <w:lvlText w:val="%3."/>
+      <w:lvlJc w:val="left"/>
+      <w:pPr>
+        <w:tabs>
+          <w:tab w:val="num" w:pos="2160"/>
+        </w:tabs>
+        <w:ind w:left="2160" w:hanging="360"/>
+      </w:pPr>
+    </w:lvl>
+    <w:lvl w:ilvl="3" w:tentative="1">
+      <w:start w:val="1"/>
+      <w:numFmt w:val="decimal"/>
+      <w:lvlText w:val="%4."/>
+      <w:lvlJc w:val="left"/>
+      <w:pPr>
+        <w:tabs>
+          <w:tab w:val="num" w:pos="2880"/>
+        </w:tabs>
+        <w:ind w:left="2880" w:hanging="360"/>
+      </w:pPr>
+    </w:lvl>
+    <w:lvl w:ilvl="4" w:tentative="1">
+      <w:start w:val="1"/>
+      <w:numFmt w:val="decimal"/>
+      <w:lvlText w:val="%5."/>
+      <w:lvlJc w:val="left"/>
+      <w:pPr>
+        <w:tabs>
+          <w:tab w:val="num" w:pos="3600"/>
+        </w:tabs>
+        <w:ind w:left="3600" w:hanging="360"/>
+      </w:pPr>
+    </w:lvl>
+    <w:lvl w:ilvl="5" w:tentative="1">
+      <w:start w:val="1"/>
+      <w:numFmt w:val="decimal"/>
+      <w:lvlText w:val="%6."/>
+      <w:lvlJc w:val="left"/>
+      <w:pPr>
+        <w:tabs>
+          <w:tab w:val="num" w:pos="4320"/>
+        </w:tabs>
+        <w:ind w:left="4320" w:hanging="360"/>
+      </w:pPr>
+    </w:lvl>
+    <w:lvl w:ilvl="6" w:tentative="1">
+      <w:start w:val="1"/>
+      <w:numFmt w:val="decimal"/>
+      <w:lvlText w:val="%7."/>
+      <w:lvlJc w:val="left"/>
+      <w:pPr>
+        <w:tabs>
+          <w:tab w:val="num" w:pos="5040"/>
+        </w:tabs>
+        <w:ind w:left="5040" w:hanging="360"/>
+      </w:pPr>
+    </w:lvl>
+    <w:lvl w:ilvl="7" w:tentative="1">
+      <w:start w:val="1"/>
+      <w:numFmt w:val="decimal"/>
+      <w:lvlText w:val="%8."/>
+      <w:lvlJc w:val="left"/>
+      <w:pPr>
+        <w:tabs>
+          <w:tab w:val="num" w:pos="5760"/>
+        </w:tabs>
+        <w:ind w:left="5760" w:hanging="360"/>
+      </w:pPr>
+    </w:lvl>
+    <w:lvl w:ilvl="8" w:tentative="1">
+      <w:start w:val="1"/>
+      <w:numFmt w:val="decimal"/>
+      <w:lvlText w:val="%9."/>
+      <w:lvlJc w:val="left"/>
+      <w:pPr>
+        <w:tabs>
+          <w:tab w:val="num" w:pos="6480"/>
+        </w:tabs>
+        <w:ind w:left="6480" w:hanging="360"/>
+      </w:pPr>
+    </w:lvl>
+  </w:abstractNum>
+  <w:abstractNum w:abstractNumId="8" w15:restartNumberingAfterBreak="0">
     <w:nsid w:val="7A393BE8"/>
     <w:multiLevelType w:val="hybridMultilevel"/>
     <w:tmpl w:val="CD582658"/>
@@ -4089,22 +4808,28 @@
     <w:abstractNumId w:val="0"/>
   </w:num>
   <w:num w:numId="2">
-    <w:abstractNumId w:val="3"/>
+    <w:abstractNumId w:val="4"/>
   </w:num>
   <w:num w:numId="3">
     <w:abstractNumId w:val="1"/>
   </w:num>
   <w:num w:numId="4">
-    <w:abstractNumId w:val="6"/>
+    <w:abstractNumId w:val="8"/>
   </w:num>
   <w:num w:numId="5">
-    <w:abstractNumId w:val="4"/>
+    <w:abstractNumId w:val="5"/>
   </w:num>
   <w:num w:numId="6">
-    <w:abstractNumId w:val="5"/>
+    <w:abstractNumId w:val="6"/>
   </w:num>
   <w:num w:numId="7">
     <w:abstractNumId w:val="2"/>
+  </w:num>
+  <w:num w:numId="8">
+    <w:abstractNumId w:val="3"/>
+  </w:num>
+  <w:num w:numId="9">
+    <w:abstractNumId w:val="7"/>
   </w:num>
 </w:numbering>
 </file>

</xml_diff>

<commit_message>
ajout du format JSON pour les réponses du modèle
</commit_message>
<xml_diff>
--- a/ai-business_assistant/atelier-prompt-engineering.docx
+++ b/ai-business_assistant/atelier-prompt-engineering.docx
@@ -2217,8 +2217,6 @@
           </wp:inline>
         </w:drawing>
       </w:r>
-      <w:bookmarkStart w:id="0" w:name="_GoBack"/>
-      <w:bookmarkEnd w:id="0"/>
     </w:p>
     <w:p>
       <w:pPr>
@@ -2511,6 +2509,9 @@
       <w:pPr>
         <w:spacing w:after="4" w:line="266" w:lineRule="auto"/>
         <w:ind w:left="660" w:right="0"/>
+        <w:rPr>
+          <w:sz w:val="19"/>
+        </w:rPr>
       </w:pPr>
       <w:r>
         <w:rPr>
@@ -2524,6 +2525,61 @@
         </w:rPr>
         <w:t xml:space="preserve"> </w:t>
       </w:r>
+    </w:p>
+    <w:p>
+      <w:pPr>
+        <w:spacing w:after="4" w:line="266" w:lineRule="auto"/>
+        <w:ind w:right="0"/>
+      </w:pPr>
+      <w:r>
+        <w:rPr>
+          <w:noProof/>
+        </w:rPr>
+        <w:lastRenderedPageBreak/>
+        <w:drawing>
+          <wp:inline distT="0" distB="0" distL="0" distR="0" wp14:anchorId="5DE64048" wp14:editId="442AC74A">
+            <wp:extent cx="5382260" cy="3967480"/>
+            <wp:effectExtent l="0" t="0" r="8890" b="0"/>
+            <wp:docPr id="8" name="Image 8"/>
+            <wp:cNvGraphicFramePr>
+              <a:graphicFrameLocks xmlns:a="http://schemas.openxmlformats.org/drawingml/2006/main" noChangeAspect="1"/>
+            </wp:cNvGraphicFramePr>
+            <a:graphic xmlns:a="http://schemas.openxmlformats.org/drawingml/2006/main">
+              <a:graphicData uri="http://schemas.openxmlformats.org/drawingml/2006/picture">
+                <pic:pic xmlns:pic="http://schemas.openxmlformats.org/drawingml/2006/picture">
+                  <pic:nvPicPr>
+                    <pic:cNvPr id="8" name="Capture d'écran 2026-09-10 093028.png"/>
+                    <pic:cNvPicPr/>
+                  </pic:nvPicPr>
+                  <pic:blipFill>
+                    <a:blip r:embed="rId14">
+                      <a:extLst>
+                        <a:ext uri="{28A0092B-C50C-407E-A947-70E740481C1C}">
+                          <a14:useLocalDpi xmlns:a14="http://schemas.microsoft.com/office/drawing/2010/main" val="0"/>
+                        </a:ext>
+                      </a:extLst>
+                    </a:blip>
+                    <a:stretch>
+                      <a:fillRect/>
+                    </a:stretch>
+                  </pic:blipFill>
+                  <pic:spPr>
+                    <a:xfrm>
+                      <a:off x="0" y="0"/>
+                      <a:ext cx="5382260" cy="3967480"/>
+                    </a:xfrm>
+                    <a:prstGeom prst="rect">
+                      <a:avLst/>
+                    </a:prstGeom>
+                  </pic:spPr>
+                </pic:pic>
+              </a:graphicData>
+            </a:graphic>
+          </wp:inline>
+        </w:drawing>
+      </w:r>
+      <w:bookmarkStart w:id="0" w:name="_GoBack"/>
+      <w:bookmarkEnd w:id="0"/>
     </w:p>
     <w:p>
       <w:pPr>
@@ -2621,7 +2677,6 @@
         <w:ind w:right="0" w:hanging="338"/>
       </w:pPr>
       <w:r>
-        <w:lastRenderedPageBreak/>
         <w:t>Créer un prompt permettant d’extraire, à partir d’une facture, les infos (</w:t>
       </w:r>
       <w:proofErr w:type="spellStart"/>
@@ -2686,6 +2741,7 @@
         <w:rPr>
           <w:lang w:val="en-CA"/>
         </w:rPr>
+        <w:lastRenderedPageBreak/>
         <w:t>Partie</w:t>
       </w:r>
       <w:proofErr w:type="spellEnd"/>
@@ -2983,7 +3039,6 @@
         <w:ind w:left="-5"/>
       </w:pPr>
       <w:r>
-        <w:lastRenderedPageBreak/>
         <w:t xml:space="preserve">Livrable attendu </w:t>
       </w:r>
     </w:p>
@@ -3088,9 +3143,9 @@
       </w:r>
     </w:p>
     <w:sectPr>
-      <w:footerReference w:type="even" r:id="rId14"/>
-      <w:footerReference w:type="default" r:id="rId15"/>
-      <w:footerReference w:type="first" r:id="rId16"/>
+      <w:footerReference w:type="even" r:id="rId15"/>
+      <w:footerReference w:type="default" r:id="rId16"/>
+      <w:footerReference w:type="first" r:id="rId17"/>
       <w:pgSz w:w="12240" w:h="15840"/>
       <w:pgMar w:top="1404" w:right="1892" w:bottom="1567" w:left="1872" w:header="720" w:footer="681" w:gutter="0"/>
       <w:cols w:space="720"/>

</xml_diff>

<commit_message>
ajout du format JSON pour les réponses du modèle et ajout validation definissant les regles de sortie
</commit_message>
<xml_diff>
--- a/ai-business_assistant/atelier-prompt-engineering.docx
+++ b/ai-business_assistant/atelier-prompt-engineering.docx
@@ -2578,8 +2578,6 @@
           </wp:inline>
         </w:drawing>
       </w:r>
-      <w:bookmarkStart w:id="0" w:name="_GoBack"/>
-      <w:bookmarkEnd w:id="0"/>
     </w:p>
     <w:p>
       <w:pPr>
@@ -2604,6 +2602,269 @@
     </w:p>
     <w:p>
       <w:pPr>
+        <w:spacing w:after="160"/>
+        <w:ind w:left="664" w:right="0" w:firstLine="0"/>
+      </w:pPr>
+      <w:r>
+        <w:t xml:space="preserve">Prompt : </w:t>
+      </w:r>
+      <w:r>
+        <w:t>Analyse le commentaire client suivant et retourne le résultat au format JSON avec les champs suivants :</w:t>
+      </w:r>
+    </w:p>
+    <w:p>
+      <w:pPr>
+        <w:spacing w:after="160"/>
+        <w:ind w:left="664" w:right="0" w:firstLine="0"/>
+      </w:pPr>
+    </w:p>
+    <w:p>
+      <w:pPr>
+        <w:spacing w:after="160"/>
+        <w:ind w:left="664" w:right="0" w:firstLine="0"/>
+      </w:pPr>
+      <w:proofErr w:type="gramStart"/>
+      <w:r>
+        <w:t>sentiment</w:t>
+      </w:r>
+      <w:proofErr w:type="gramEnd"/>
+      <w:r>
+        <w:t xml:space="preserve"> : texte, valeur parmi positif, </w:t>
+      </w:r>
+      <w:proofErr w:type="spellStart"/>
+      <w:r>
+        <w:t>negatif</w:t>
+      </w:r>
+      <w:proofErr w:type="spellEnd"/>
+      <w:r>
+        <w:t>, neutre</w:t>
+      </w:r>
+    </w:p>
+    <w:p>
+      <w:pPr>
+        <w:spacing w:after="160"/>
+        <w:ind w:left="664" w:right="0" w:firstLine="0"/>
+      </w:pPr>
+      <w:proofErr w:type="spellStart"/>
+      <w:proofErr w:type="gramStart"/>
+      <w:r>
+        <w:t>categorie</w:t>
+      </w:r>
+      <w:proofErr w:type="spellEnd"/>
+      <w:proofErr w:type="gramEnd"/>
+      <w:r>
+        <w:t xml:space="preserve"> : texte décrivant le thème principal du commentaire, par exemple livraison, produit, service, application</w:t>
+      </w:r>
+    </w:p>
+    <w:p>
+      <w:pPr>
+        <w:spacing w:after="160"/>
+        <w:ind w:left="664" w:right="0" w:firstLine="0"/>
+      </w:pPr>
+      <w:proofErr w:type="gramStart"/>
+      <w:r>
+        <w:t>urgence</w:t>
+      </w:r>
+      <w:proofErr w:type="gramEnd"/>
+      <w:r>
+        <w:t xml:space="preserve"> : texte, valeur parmi faible, moyenne, élevée</w:t>
+      </w:r>
+    </w:p>
+    <w:p>
+      <w:pPr>
+        <w:spacing w:after="160"/>
+        <w:ind w:left="664" w:right="0" w:firstLine="0"/>
+      </w:pPr>
+      <w:proofErr w:type="spellStart"/>
+      <w:proofErr w:type="gramStart"/>
+      <w:r>
+        <w:t>probleme</w:t>
+      </w:r>
+      <w:proofErr w:type="spellEnd"/>
+      <w:proofErr w:type="gramEnd"/>
+      <w:r>
+        <w:t xml:space="preserve"> : texte résumant le problème principal en une courte phrase</w:t>
+      </w:r>
+    </w:p>
+    <w:p>
+      <w:pPr>
+        <w:spacing w:after="160"/>
+        <w:ind w:left="664" w:right="0" w:firstLine="0"/>
+      </w:pPr>
+      <w:proofErr w:type="gramStart"/>
+      <w:r>
+        <w:t>confiance</w:t>
+      </w:r>
+      <w:proofErr w:type="gramEnd"/>
+      <w:r>
+        <w:t xml:space="preserve"> : nombre décimal entre 0 et 1 représentant le niveau de certitude de l'analyse</w:t>
+      </w:r>
+    </w:p>
+    <w:p>
+      <w:pPr>
+        <w:spacing w:after="160"/>
+        <w:ind w:left="664" w:right="0" w:firstLine="0"/>
+      </w:pPr>
+    </w:p>
+    <w:p>
+      <w:pPr>
+        <w:spacing w:after="160"/>
+        <w:ind w:left="664" w:right="0" w:firstLine="0"/>
+      </w:pPr>
+      <w:r>
+        <w:t>Applique en plus les règles de sortie suivantes :</w:t>
+      </w:r>
+    </w:p>
+    <w:p>
+      <w:pPr>
+        <w:spacing w:after="160"/>
+        <w:ind w:left="664" w:right="0" w:firstLine="0"/>
+      </w:pPr>
+    </w:p>
+    <w:p>
+      <w:pPr>
+        <w:spacing w:after="160"/>
+        <w:ind w:left="664" w:right="0" w:firstLine="0"/>
+      </w:pPr>
+      <w:r>
+        <w:t>Le résultat doit être un JSON valide, sans aucun texte avant ou après</w:t>
+      </w:r>
+    </w:p>
+    <w:p>
+      <w:pPr>
+        <w:spacing w:after="160"/>
+        <w:ind w:left="664" w:right="0" w:firstLine="0"/>
+      </w:pPr>
+      <w:r>
+        <w:lastRenderedPageBreak/>
+        <w:t xml:space="preserve">Aucune propriété supplémentaire ne doit être ajoutée en dehors de sentiment, </w:t>
+      </w:r>
+      <w:proofErr w:type="spellStart"/>
+      <w:r>
+        <w:t>categorie</w:t>
+      </w:r>
+      <w:proofErr w:type="spellEnd"/>
+      <w:r>
+        <w:t xml:space="preserve">, urgence, </w:t>
+      </w:r>
+      <w:proofErr w:type="spellStart"/>
+      <w:r>
+        <w:t>probleme</w:t>
+      </w:r>
+      <w:proofErr w:type="spellEnd"/>
+      <w:r>
+        <w:t>, confiance</w:t>
+      </w:r>
+    </w:p>
+    <w:p>
+      <w:pPr>
+        <w:spacing w:after="160"/>
+        <w:ind w:left="664" w:right="0" w:firstLine="0"/>
+      </w:pPr>
+      <w:r>
+        <w:t xml:space="preserve">Le champ sentiment doit valoir uniquement positif, </w:t>
+      </w:r>
+      <w:proofErr w:type="spellStart"/>
+      <w:r>
+        <w:t>negatif</w:t>
+      </w:r>
+      <w:proofErr w:type="spellEnd"/>
+      <w:r>
+        <w:t xml:space="preserve"> ou neutre</w:t>
+      </w:r>
+    </w:p>
+    <w:p>
+      <w:pPr>
+        <w:spacing w:after="160"/>
+        <w:ind w:left="664" w:right="0" w:firstLine="0"/>
+      </w:pPr>
+      <w:r>
+        <w:t>Le champ confiance doit être un nombre compris entre 0 et 1</w:t>
+      </w:r>
+    </w:p>
+    <w:p>
+      <w:pPr>
+        <w:spacing w:after="160"/>
+        <w:ind w:left="664" w:right="0" w:firstLine="0"/>
+      </w:pPr>
+      <w:r>
+        <w:t>Le champ urgence doit valoir uniquement faible</w:t>
+      </w:r>
+      <w:bookmarkStart w:id="0" w:name="_GoBack"/>
+      <w:bookmarkEnd w:id="0"/>
+      <w:r>
+        <w:t>, moyenne ou élevée</w:t>
+      </w:r>
+    </w:p>
+    <w:p>
+      <w:pPr>
+        <w:spacing w:after="160"/>
+        <w:ind w:left="664" w:right="0" w:firstLine="0"/>
+      </w:pPr>
+    </w:p>
+    <w:p>
+      <w:pPr>
+        <w:spacing w:after="160"/>
+        <w:ind w:left="664" w:right="0" w:firstLine="0"/>
+      </w:pPr>
+      <w:r>
+        <w:t>Commentaire : "Le commentaire semble plutôt négatif. Le client est mécontent du délai de livraison."</w:t>
+      </w:r>
+    </w:p>
+    <w:p>
+      <w:pPr>
+        <w:spacing w:after="160"/>
+        <w:ind w:left="664" w:right="0" w:firstLine="0"/>
+      </w:pPr>
+      <w:r>
+        <w:rPr>
+          <w:noProof/>
+        </w:rPr>
+        <w:drawing>
+          <wp:inline distT="0" distB="0" distL="0" distR="0" wp14:anchorId="38D4B587" wp14:editId="204FA17F">
+            <wp:extent cx="5382260" cy="1899285"/>
+            <wp:effectExtent l="0" t="0" r="8890" b="5715"/>
+            <wp:docPr id="9" name="Image 9"/>
+            <wp:cNvGraphicFramePr>
+              <a:graphicFrameLocks xmlns:a="http://schemas.openxmlformats.org/drawingml/2006/main" noChangeAspect="1"/>
+            </wp:cNvGraphicFramePr>
+            <a:graphic xmlns:a="http://schemas.openxmlformats.org/drawingml/2006/main">
+              <a:graphicData uri="http://schemas.openxmlformats.org/drawingml/2006/picture">
+                <pic:pic xmlns:pic="http://schemas.openxmlformats.org/drawingml/2006/picture">
+                  <pic:nvPicPr>
+                    <pic:cNvPr id="9" name="Capture d'écran 2026-09-10 093535.png"/>
+                    <pic:cNvPicPr/>
+                  </pic:nvPicPr>
+                  <pic:blipFill>
+                    <a:blip r:embed="rId15">
+                      <a:extLst>
+                        <a:ext uri="{28A0092B-C50C-407E-A947-70E740481C1C}">
+                          <a14:useLocalDpi xmlns:a14="http://schemas.microsoft.com/office/drawing/2010/main" val="0"/>
+                        </a:ext>
+                      </a:extLst>
+                    </a:blip>
+                    <a:stretch>
+                      <a:fillRect/>
+                    </a:stretch>
+                  </pic:blipFill>
+                  <pic:spPr>
+                    <a:xfrm>
+                      <a:off x="0" y="0"/>
+                      <a:ext cx="5382260" cy="1899285"/>
+                    </a:xfrm>
+                    <a:prstGeom prst="rect">
+                      <a:avLst/>
+                    </a:prstGeom>
+                  </pic:spPr>
+                </pic:pic>
+              </a:graphicData>
+            </a:graphic>
+          </wp:inline>
+        </w:drawing>
+      </w:r>
+    </w:p>
+    <w:p>
+      <w:pPr>
         <w:pStyle w:val="Titre1"/>
         <w:ind w:left="-5"/>
       </w:pPr>
@@ -2741,7 +3002,6 @@
         <w:rPr>
           <w:lang w:val="en-CA"/>
         </w:rPr>
-        <w:lastRenderedPageBreak/>
         <w:t>Partie</w:t>
       </w:r>
       <w:proofErr w:type="spellEnd"/>
@@ -2791,7 +3051,11 @@
       </w:r>
       <w:proofErr w:type="spellEnd"/>
       <w:r>
-        <w:t xml:space="preserve"> des capteurs, de proposer les visualisations les plus pertinentes pour comprendre la consommation énergétique d'un bâtiment. Et pour chaque visualisation indiquer le type de graphique, les variables utilisées, l’objectif et l’interprétation attendue. </w:t>
+        <w:t xml:space="preserve"> des capteurs, de proposer les visualisations les plus pertinentes pour comprendre la consommation énergétique d'un bâtiment. Et pour </w:t>
+      </w:r>
+      <w:r>
+        <w:lastRenderedPageBreak/>
+        <w:t xml:space="preserve">chaque visualisation indiquer le type de graphique, les variables utilisées, l’objectif et l’interprétation attendue. </w:t>
       </w:r>
     </w:p>
     <w:p>
@@ -3143,9 +3407,9 @@
       </w:r>
     </w:p>
     <w:sectPr>
-      <w:footerReference w:type="even" r:id="rId15"/>
-      <w:footerReference w:type="default" r:id="rId16"/>
-      <w:footerReference w:type="first" r:id="rId17"/>
+      <w:footerReference w:type="even" r:id="rId16"/>
+      <w:footerReference w:type="default" r:id="rId17"/>
+      <w:footerReference w:type="first" r:id="rId18"/>
       <w:pgSz w:w="12240" w:h="15840"/>
       <w:pgMar w:top="1404" w:right="1892" w:bottom="1567" w:left="1872" w:header="720" w:footer="681" w:gutter="0"/>
       <w:cols w:space="720"/>

</xml_diff>

<commit_message>
prompt permettant de résumer un document
</commit_message>
<xml_diff>
--- a/ai-business_assistant/atelier-prompt-engineering.docx
+++ b/ai-business_assistant/atelier-prompt-engineering.docx
@@ -2788,12 +2788,7 @@
         <w:ind w:left="664" w:right="0" w:firstLine="0"/>
       </w:pPr>
       <w:r>
-        <w:t>Le champ urgence doit valoir uniquement faible</w:t>
-      </w:r>
-      <w:bookmarkStart w:id="0" w:name="_GoBack"/>
-      <w:bookmarkEnd w:id="0"/>
-      <w:r>
-        <w:t>, moyenne ou élevée</w:t>
+        <w:t>Le champ urgence doit valoir uniquement faible, moyenne ou élevée</w:t>
       </w:r>
     </w:p>
     <w:p>
@@ -2886,6 +2881,155 @@
     </w:p>
     <w:p>
       <w:pPr>
+        <w:pStyle w:val="NormalWeb"/>
+      </w:pPr>
+      <w:r>
+        <w:t>Prompt utilisé :</w:t>
+      </w:r>
+    </w:p>
+    <w:p>
+      <w:pPr>
+        <w:spacing w:before="100" w:beforeAutospacing="1" w:after="100" w:afterAutospacing="1" w:line="240" w:lineRule="auto"/>
+        <w:ind w:left="0" w:right="0" w:firstLine="0"/>
+        <w:rPr>
+          <w:color w:val="auto"/>
+          <w:sz w:val="24"/>
+          <w:szCs w:val="24"/>
+        </w:rPr>
+      </w:pPr>
+      <w:r>
+        <w:rPr>
+          <w:color w:val="auto"/>
+          <w:sz w:val="24"/>
+          <w:szCs w:val="24"/>
+        </w:rPr>
+        <w:t>Résume le document suivant en respectant les contraintes ci-dessous :</w:t>
+      </w:r>
+    </w:p>
+    <w:p>
+      <w:pPr>
+        <w:spacing w:before="100" w:beforeAutospacing="1" w:after="100" w:afterAutospacing="1" w:line="240" w:lineRule="auto"/>
+        <w:ind w:left="0" w:right="0" w:firstLine="0"/>
+        <w:rPr>
+          <w:color w:val="auto"/>
+          <w:sz w:val="24"/>
+          <w:szCs w:val="24"/>
+        </w:rPr>
+      </w:pPr>
+      <w:r>
+        <w:rPr>
+          <w:color w:val="auto"/>
+          <w:sz w:val="24"/>
+          <w:szCs w:val="24"/>
+        </w:rPr>
+        <w:t>Contraintes : le résumé ne doit pas dépasser 250 mots, conserve uniquement les informations factuelles présentes dans le document, identifie clairement les objectifs mentionnés, identifie clairement les résultats obtenus, identifie clairement les recommandations formulées, n'invente aucune information absente du document.</w:t>
+      </w:r>
+    </w:p>
+    <w:p>
+      <w:pPr>
+        <w:spacing w:before="100" w:beforeAutospacing="1" w:after="100" w:afterAutospacing="1" w:line="240" w:lineRule="auto"/>
+        <w:ind w:left="0" w:right="0" w:firstLine="0"/>
+        <w:rPr>
+          <w:color w:val="auto"/>
+          <w:sz w:val="24"/>
+          <w:szCs w:val="24"/>
+        </w:rPr>
+      </w:pPr>
+      <w:r>
+        <w:rPr>
+          <w:color w:val="auto"/>
+          <w:sz w:val="24"/>
+          <w:szCs w:val="24"/>
+        </w:rPr>
+        <w:t>Format de sortie : Objectifs, Résultats, Recommandations.</w:t>
+      </w:r>
+    </w:p>
+    <w:p>
+      <w:pPr>
+        <w:spacing w:before="100" w:beforeAutospacing="1" w:after="100" w:afterAutospacing="1" w:line="240" w:lineRule="auto"/>
+        <w:ind w:left="0" w:right="0" w:firstLine="0"/>
+        <w:rPr>
+          <w:color w:val="auto"/>
+          <w:sz w:val="24"/>
+          <w:szCs w:val="24"/>
+        </w:rPr>
+      </w:pPr>
+      <w:r>
+        <w:rPr>
+          <w:color w:val="auto"/>
+          <w:sz w:val="24"/>
+          <w:szCs w:val="24"/>
+        </w:rPr>
+        <w:t>Document utilisé :</w:t>
+      </w:r>
+      <w:r>
+        <w:rPr>
+          <w:color w:val="auto"/>
+          <w:sz w:val="24"/>
+          <w:szCs w:val="24"/>
+        </w:rPr>
+        <w:t> …</w:t>
+      </w:r>
+    </w:p>
+    <w:p>
+      <w:pPr>
+        <w:ind w:left="326" w:right="0" w:firstLine="0"/>
+      </w:pPr>
+      <w:r>
+        <w:rPr>
+          <w:noProof/>
+        </w:rPr>
+        <w:lastRenderedPageBreak/>
+        <w:drawing>
+          <wp:inline distT="0" distB="0" distL="0" distR="0" wp14:anchorId="277B14D8" wp14:editId="2BAAC3FC">
+            <wp:extent cx="5382260" cy="2030730"/>
+            <wp:effectExtent l="0" t="0" r="8890" b="7620"/>
+            <wp:docPr id="10" name="Image 10"/>
+            <wp:cNvGraphicFramePr>
+              <a:graphicFrameLocks xmlns:a="http://schemas.openxmlformats.org/drawingml/2006/main" noChangeAspect="1"/>
+            </wp:cNvGraphicFramePr>
+            <a:graphic xmlns:a="http://schemas.openxmlformats.org/drawingml/2006/main">
+              <a:graphicData uri="http://schemas.openxmlformats.org/drawingml/2006/picture">
+                <pic:pic xmlns:pic="http://schemas.openxmlformats.org/drawingml/2006/picture">
+                  <pic:nvPicPr>
+                    <pic:cNvPr id="10" name="Capture d'écran 2026-09-10 094750.png"/>
+                    <pic:cNvPicPr/>
+                  </pic:nvPicPr>
+                  <pic:blipFill>
+                    <a:blip r:embed="rId16">
+                      <a:extLst>
+                        <a:ext uri="{28A0092B-C50C-407E-A947-70E740481C1C}">
+                          <a14:useLocalDpi xmlns:a14="http://schemas.microsoft.com/office/drawing/2010/main" val="0"/>
+                        </a:ext>
+                      </a:extLst>
+                    </a:blip>
+                    <a:stretch>
+                      <a:fillRect/>
+                    </a:stretch>
+                  </pic:blipFill>
+                  <pic:spPr>
+                    <a:xfrm>
+                      <a:off x="0" y="0"/>
+                      <a:ext cx="5382260" cy="2030730"/>
+                    </a:xfrm>
+                    <a:prstGeom prst="rect">
+                      <a:avLst/>
+                    </a:prstGeom>
+                  </pic:spPr>
+                </pic:pic>
+              </a:graphicData>
+            </a:graphic>
+          </wp:inline>
+        </w:drawing>
+      </w:r>
+    </w:p>
+    <w:p>
+      <w:pPr>
+        <w:ind w:left="326" w:right="0" w:firstLine="0"/>
+      </w:pPr>
+    </w:p>
+    <w:p>
+      <w:pPr>
         <w:numPr>
           <w:ilvl w:val="0"/>
           <w:numId w:val="2"/>
@@ -2895,6 +3039,8 @@
       <w:r>
         <w:t xml:space="preserve">Créer un prompt permettant de traduire un document français en anglais avec les contraintes : conserver le sens ; conserver la structure ; conserver les termes techniques ; ne pas résumer ; ne rajoute aucune information </w:t>
       </w:r>
+      <w:bookmarkStart w:id="0" w:name="_GoBack"/>
+      <w:bookmarkEnd w:id="0"/>
     </w:p>
     <w:p>
       <w:pPr>
@@ -3051,11 +3197,7 @@
       </w:r>
       <w:proofErr w:type="spellEnd"/>
       <w:r>
-        <w:t xml:space="preserve"> des capteurs, de proposer les visualisations les plus pertinentes pour comprendre la consommation énergétique d'un bâtiment. Et pour </w:t>
-      </w:r>
-      <w:r>
-        <w:lastRenderedPageBreak/>
-        <w:t xml:space="preserve">chaque visualisation indiquer le type de graphique, les variables utilisées, l’objectif et l’interprétation attendue. </w:t>
+        <w:t xml:space="preserve"> des capteurs, de proposer les visualisations les plus pertinentes pour comprendre la consommation énergétique d'un bâtiment. Et pour chaque visualisation indiquer le type de graphique, les variables utilisées, l’objectif et l’interprétation attendue. </w:t>
       </w:r>
     </w:p>
     <w:p>
@@ -3135,6 +3277,7 @@
         <w:ind w:left="-5"/>
       </w:pPr>
       <w:r>
+        <w:lastRenderedPageBreak/>
         <w:t>Partie 7 – Prompt Engineering et RAG</w:t>
       </w:r>
       <w:r>
@@ -3407,9 +3550,9 @@
       </w:r>
     </w:p>
     <w:sectPr>
-      <w:footerReference w:type="even" r:id="rId16"/>
-      <w:footerReference w:type="default" r:id="rId17"/>
-      <w:footerReference w:type="first" r:id="rId18"/>
+      <w:footerReference w:type="even" r:id="rId17"/>
+      <w:footerReference w:type="default" r:id="rId18"/>
+      <w:footerReference w:type="first" r:id="rId19"/>
       <w:pgSz w:w="12240" w:h="15840"/>
       <w:pgMar w:top="1404" w:right="1892" w:bottom="1567" w:left="1872" w:header="720" w:footer="681" w:gutter="0"/>
       <w:cols w:space="720"/>

</xml_diff>

<commit_message>
un prompt permettant de traduire un document français en anglais
</commit_message>
<xml_diff>
--- a/ai-business_assistant/atelier-prompt-engineering.docx
+++ b/ai-business_assistant/atelier-prompt-engineering.docx
@@ -3039,8 +3039,195 @@
       <w:r>
         <w:t xml:space="preserve">Créer un prompt permettant de traduire un document français en anglais avec les contraintes : conserver le sens ; conserver la structure ; conserver les termes techniques ; ne pas résumer ; ne rajoute aucune information </w:t>
       </w:r>
+    </w:p>
+    <w:p>
+      <w:pPr>
+        <w:pStyle w:val="NormalWeb"/>
+      </w:pPr>
+      <w:r>
+        <w:t xml:space="preserve"> </w:t>
+      </w:r>
+      <w:proofErr w:type="gramStart"/>
+      <w:r>
+        <w:t>t</w:t>
+      </w:r>
+      <w:r>
+        <w:t>raduis</w:t>
+      </w:r>
+      <w:proofErr w:type="gramEnd"/>
+      <w:r>
+        <w:t xml:space="preserve"> le document suivant du français vers l'anglais en respectant les contraintes ci-dessous :</w:t>
+      </w:r>
+    </w:p>
+    <w:p>
+      <w:pPr>
+        <w:spacing w:before="100" w:beforeAutospacing="1" w:after="100" w:afterAutospacing="1" w:line="240" w:lineRule="auto"/>
+        <w:ind w:left="0" w:right="0" w:firstLine="0"/>
+        <w:rPr>
+          <w:color w:val="auto"/>
+          <w:sz w:val="24"/>
+          <w:szCs w:val="24"/>
+        </w:rPr>
+      </w:pPr>
+      <w:r>
+        <w:rPr>
+          <w:color w:val="auto"/>
+          <w:sz w:val="24"/>
+          <w:szCs w:val="24"/>
+        </w:rPr>
+        <w:t>Contraintes :</w:t>
+      </w:r>
+      <w:r>
+        <w:rPr>
+          <w:color w:val="auto"/>
+          <w:sz w:val="24"/>
+          <w:szCs w:val="24"/>
+        </w:rPr>
+        <w:br/>
+        <w:t>Conserve fidèlement le sens du texte original</w:t>
+      </w:r>
+      <w:r>
+        <w:rPr>
+          <w:color w:val="auto"/>
+          <w:sz w:val="24"/>
+          <w:szCs w:val="24"/>
+        </w:rPr>
+        <w:br/>
+        <w:t>Conserve la structure du document (paragraphes, ordre des idées)</w:t>
+      </w:r>
+      <w:r>
+        <w:rPr>
+          <w:color w:val="auto"/>
+          <w:sz w:val="24"/>
+          <w:szCs w:val="24"/>
+        </w:rPr>
+        <w:br/>
+        <w:t>Conserve les termes techniques tels quels ou utilise leur équivalent technique standard en anglais</w:t>
+      </w:r>
+      <w:r>
+        <w:rPr>
+          <w:color w:val="auto"/>
+          <w:sz w:val="24"/>
+          <w:szCs w:val="24"/>
+        </w:rPr>
+        <w:br/>
+        <w:t>Ne résume pas le texte, traduis-le intégralement</w:t>
+      </w:r>
+      <w:r>
+        <w:rPr>
+          <w:color w:val="auto"/>
+          <w:sz w:val="24"/>
+          <w:szCs w:val="24"/>
+        </w:rPr>
+        <w:br/>
+        <w:t>N'ajoute aucune information absente du texte original</w:t>
+      </w:r>
+    </w:p>
+    <w:p>
+      <w:pPr>
+        <w:spacing w:before="100" w:beforeAutospacing="1" w:after="100" w:afterAutospacing="1" w:line="240" w:lineRule="auto"/>
+        <w:ind w:left="0" w:right="0" w:firstLine="0"/>
+        <w:rPr>
+          <w:color w:val="auto"/>
+          <w:sz w:val="24"/>
+          <w:szCs w:val="24"/>
+        </w:rPr>
+      </w:pPr>
+      <w:r>
+        <w:rPr>
+          <w:color w:val="auto"/>
+          <w:sz w:val="24"/>
+          <w:szCs w:val="24"/>
+        </w:rPr>
+        <w:t>Document à traduire :</w:t>
+      </w:r>
+    </w:p>
+    <w:p>
+      <w:pPr>
+        <w:spacing w:before="100" w:beforeAutospacing="1" w:after="100" w:afterAutospacing="1" w:line="240" w:lineRule="auto"/>
+        <w:ind w:left="0" w:right="0" w:firstLine="0"/>
+        <w:rPr>
+          <w:color w:val="auto"/>
+          <w:sz w:val="24"/>
+          <w:szCs w:val="24"/>
+        </w:rPr>
+      </w:pPr>
+      <w:r>
+        <w:rPr>
+          <w:color w:val="auto"/>
+          <w:sz w:val="24"/>
+          <w:szCs w:val="24"/>
+        </w:rPr>
+        <w:t>L'application mobile permet aux utilisateurs de consulter en temps réel l'état de leurs commandes grâce à une synchronisation automatique avec le serveur principal. Chaque commande est associée à un identifiant unique et à un statut mis à jour toutes les cinq minutes. En cas d'anomalie, comme une rupture de stock ou un retard de livraison, une notification push est envoyée à l'utilisateur. Le système d'authentification repose sur un jeton d'accès valable 24 heures, renouvelé automatiquement via un jeton de rafraîchissement. Cette architecture garantit une expérience fluide tout en limitant la charge sur les serveurs.</w:t>
+      </w:r>
+    </w:p>
+    <w:p>
+      <w:pPr>
+        <w:spacing w:before="100" w:beforeAutospacing="1" w:after="100" w:afterAutospacing="1" w:line="240" w:lineRule="auto"/>
+        <w:ind w:left="0" w:right="0" w:firstLine="0"/>
+        <w:rPr>
+          <w:color w:val="auto"/>
+          <w:sz w:val="24"/>
+          <w:szCs w:val="24"/>
+        </w:rPr>
+      </w:pPr>
+      <w:r>
+        <w:rPr>
+          <w:noProof/>
+          <w:color w:val="auto"/>
+          <w:sz w:val="24"/>
+          <w:szCs w:val="24"/>
+        </w:rPr>
+        <w:lastRenderedPageBreak/>
+        <w:drawing>
+          <wp:inline distT="0" distB="0" distL="0" distR="0" wp14:anchorId="40BD882B" wp14:editId="616F35DD">
+            <wp:extent cx="5382260" cy="2994660"/>
+            <wp:effectExtent l="0" t="0" r="8890" b="0"/>
+            <wp:docPr id="11" name="Image 11"/>
+            <wp:cNvGraphicFramePr>
+              <a:graphicFrameLocks xmlns:a="http://schemas.openxmlformats.org/drawingml/2006/main" noChangeAspect="1"/>
+            </wp:cNvGraphicFramePr>
+            <a:graphic xmlns:a="http://schemas.openxmlformats.org/drawingml/2006/main">
+              <a:graphicData uri="http://schemas.openxmlformats.org/drawingml/2006/picture">
+                <pic:pic xmlns:pic="http://schemas.openxmlformats.org/drawingml/2006/picture">
+                  <pic:nvPicPr>
+                    <pic:cNvPr id="11" name="Capture d'écran 2026-09-10 095426.png"/>
+                    <pic:cNvPicPr/>
+                  </pic:nvPicPr>
+                  <pic:blipFill>
+                    <a:blip r:embed="rId17">
+                      <a:extLst>
+                        <a:ext uri="{28A0092B-C50C-407E-A947-70E740481C1C}">
+                          <a14:useLocalDpi xmlns:a14="http://schemas.microsoft.com/office/drawing/2010/main" val="0"/>
+                        </a:ext>
+                      </a:extLst>
+                    </a:blip>
+                    <a:stretch>
+                      <a:fillRect/>
+                    </a:stretch>
+                  </pic:blipFill>
+                  <pic:spPr>
+                    <a:xfrm>
+                      <a:off x="0" y="0"/>
+                      <a:ext cx="5382260" cy="2994660"/>
+                    </a:xfrm>
+                    <a:prstGeom prst="rect">
+                      <a:avLst/>
+                    </a:prstGeom>
+                  </pic:spPr>
+                </pic:pic>
+              </a:graphicData>
+            </a:graphic>
+          </wp:inline>
+        </w:drawing>
+      </w:r>
       <w:bookmarkStart w:id="0" w:name="_GoBack"/>
       <w:bookmarkEnd w:id="0"/>
+    </w:p>
+    <w:p>
+      <w:pPr>
+        <w:ind w:left="326" w:right="0" w:firstLine="0"/>
+      </w:pPr>
     </w:p>
     <w:p>
       <w:pPr>
@@ -3052,7 +3239,15 @@
         <w:ind w:right="0" w:hanging="338"/>
       </w:pPr>
       <w:r>
-        <w:t xml:space="preserve">Créer un prompt permettant de classer un ticket informatique dans une catégorie (réseau, logiciel, matériel, sécurité, accès, autre). La réponse est au format JSON avec les champs </w:t>
+        <w:t xml:space="preserve">Créer un prompt permettant de classer un ticket informatique dans une catégorie (réseau, </w:t>
+      </w:r>
+      <w:proofErr w:type="gramStart"/>
+      <w:r>
+        <w:t>logiciel</w:t>
+      </w:r>
+      <w:proofErr w:type="gramEnd"/>
+      <w:r>
+        <w:t xml:space="preserve">, matériel, sécurité, accès, autre). La réponse est au format JSON avec les champs </w:t>
       </w:r>
       <w:proofErr w:type="spellStart"/>
       <w:r>
@@ -3268,6 +3463,7 @@
         <w:ind w:right="0" w:hanging="338"/>
       </w:pPr>
       <w:r>
+        <w:lastRenderedPageBreak/>
         <w:t xml:space="preserve">Créer un prompt permettant d’expliquer les métriques de Régression (MAE, MSE, RMSE). Pour chacune, le LLM doit donner la définition, expliquer son interprétation, donner un exemple concret et indiquer dans quel contexte elle est particulièrement utile. </w:t>
       </w:r>
     </w:p>
@@ -3277,7 +3473,6 @@
         <w:ind w:left="-5"/>
       </w:pPr>
       <w:r>
-        <w:lastRenderedPageBreak/>
         <w:t>Partie 7 – Prompt Engineering et RAG</w:t>
       </w:r>
       <w:r>
@@ -3550,9 +3745,9 @@
       </w:r>
     </w:p>
     <w:sectPr>
-      <w:footerReference w:type="even" r:id="rId17"/>
-      <w:footerReference w:type="default" r:id="rId18"/>
-      <w:footerReference w:type="first" r:id="rId19"/>
+      <w:footerReference w:type="even" r:id="rId18"/>
+      <w:footerReference w:type="default" r:id="rId19"/>
+      <w:footerReference w:type="first" r:id="rId20"/>
       <w:pgSz w:w="12240" w:h="15840"/>
       <w:pgMar w:top="1404" w:right="1892" w:bottom="1567" w:left="1872" w:header="720" w:footer="681" w:gutter="0"/>
       <w:cols w:space="720"/>

</xml_diff>

<commit_message>
prompt permettant d’extraire les informations d'une facture et return en json
</commit_message>
<xml_diff>
--- a/ai-business_assistant/atelier-prompt-engineering.docx
+++ b/ai-business_assistant/atelier-prompt-engineering.docx
@@ -3042,6 +3042,11 @@
     </w:p>
     <w:p>
       <w:pPr>
+        <w:ind w:left="664" w:right="0" w:firstLine="0"/>
+      </w:pPr>
+    </w:p>
+    <w:p>
+      <w:pPr>
         <w:pStyle w:val="NormalWeb"/>
       </w:pPr>
       <w:r>
@@ -3221,8 +3226,6 @@
           </wp:inline>
         </w:drawing>
       </w:r>
-      <w:bookmarkStart w:id="0" w:name="_GoBack"/>
-      <w:bookmarkEnd w:id="0"/>
     </w:p>
     <w:p>
       <w:pPr>
@@ -3272,6 +3275,453 @@
     </w:p>
     <w:p>
       <w:pPr>
+        <w:spacing w:after="4" w:line="294" w:lineRule="auto"/>
+        <w:ind w:left="664" w:right="0" w:firstLine="0"/>
+      </w:pPr>
+      <w:r>
+        <w:rPr>
+          <w:noProof/>
+        </w:rPr>
+        <w:drawing>
+          <wp:inline distT="0" distB="0" distL="0" distR="0" wp14:anchorId="36452BEF" wp14:editId="2ABF4681">
+            <wp:extent cx="5382260" cy="3130550"/>
+            <wp:effectExtent l="0" t="0" r="8890" b="0"/>
+            <wp:docPr id="12" name="Image 12"/>
+            <wp:cNvGraphicFramePr>
+              <a:graphicFrameLocks xmlns:a="http://schemas.openxmlformats.org/drawingml/2006/main" noChangeAspect="1"/>
+            </wp:cNvGraphicFramePr>
+            <a:graphic xmlns:a="http://schemas.openxmlformats.org/drawingml/2006/main">
+              <a:graphicData uri="http://schemas.openxmlformats.org/drawingml/2006/picture">
+                <pic:pic xmlns:pic="http://schemas.openxmlformats.org/drawingml/2006/picture">
+                  <pic:nvPicPr>
+                    <pic:cNvPr id="12" name="Capture d'écran 2026-09-10 102258.png"/>
+                    <pic:cNvPicPr/>
+                  </pic:nvPicPr>
+                  <pic:blipFill>
+                    <a:blip r:embed="rId18">
+                      <a:extLst>
+                        <a:ext uri="{28A0092B-C50C-407E-A947-70E740481C1C}">
+                          <a14:useLocalDpi xmlns:a14="http://schemas.microsoft.com/office/drawing/2010/main" val="0"/>
+                        </a:ext>
+                      </a:extLst>
+                    </a:blip>
+                    <a:stretch>
+                      <a:fillRect/>
+                    </a:stretch>
+                  </pic:blipFill>
+                  <pic:spPr>
+                    <a:xfrm>
+                      <a:off x="0" y="0"/>
+                      <a:ext cx="5382260" cy="3130550"/>
+                    </a:xfrm>
+                    <a:prstGeom prst="rect">
+                      <a:avLst/>
+                    </a:prstGeom>
+                  </pic:spPr>
+                </pic:pic>
+              </a:graphicData>
+            </a:graphic>
+          </wp:inline>
+        </w:drawing>
+      </w:r>
+    </w:p>
+    <w:p>
+      <w:pPr>
+        <w:spacing w:after="4" w:line="294" w:lineRule="auto"/>
+        <w:ind w:left="664" w:right="0" w:firstLine="0"/>
+      </w:pPr>
+    </w:p>
+    <w:p>
+      <w:pPr>
+        <w:ind w:left="664" w:right="0" w:firstLine="0"/>
+      </w:pPr>
+      <w:r>
+        <w:t>Créer un prompt permettant d’extraire, à partir d’une facture, les infos (</w:t>
+      </w:r>
+      <w:proofErr w:type="spellStart"/>
+      <w:r>
+        <w:t>numéro_facture</w:t>
+      </w:r>
+      <w:proofErr w:type="spellEnd"/>
+      <w:r>
+        <w:t xml:space="preserve">, date, client, </w:t>
+      </w:r>
+      <w:proofErr w:type="spellStart"/>
+      <w:r>
+        <w:t>montant_ht</w:t>
+      </w:r>
+      <w:proofErr w:type="spellEnd"/>
+      <w:r>
+        <w:t xml:space="preserve">, tva, </w:t>
+      </w:r>
+      <w:proofErr w:type="spellStart"/>
+      <w:r>
+        <w:t>montant_ttc</w:t>
+      </w:r>
+      <w:proofErr w:type="spellEnd"/>
+      <w:r>
+        <w:t xml:space="preserve">). Retourner uniquement un JSON valide avec </w:t>
+      </w:r>
+      <w:proofErr w:type="spellStart"/>
+      <w:r>
+        <w:rPr>
+          <w:sz w:val="17"/>
+        </w:rPr>
+        <w:t>null</w:t>
+      </w:r>
+      <w:proofErr w:type="spellEnd"/>
+      <w:r>
+        <w:t xml:space="preserve"> si une info est absente </w:t>
+      </w:r>
+    </w:p>
+    <w:p>
+      <w:pPr>
+        <w:ind w:left="664" w:right="0" w:firstLine="0"/>
+      </w:pPr>
+      <w:r>
+        <w:t>Extrait les informations suivantes à partir de la facture ci-dessous et retourne uniquement un JSON valide avec exactement ces champs :</w:t>
+      </w:r>
+    </w:p>
+    <w:p>
+      <w:pPr>
+        <w:ind w:left="664" w:right="0" w:firstLine="0"/>
+      </w:pPr>
+    </w:p>
+    <w:p>
+      <w:pPr>
+        <w:ind w:left="664" w:right="0" w:firstLine="0"/>
+      </w:pPr>
+      <w:proofErr w:type="spellStart"/>
+      <w:proofErr w:type="gramStart"/>
+      <w:r>
+        <w:t>numero</w:t>
+      </w:r>
+      <w:proofErr w:type="gramEnd"/>
+      <w:r>
+        <w:t>_facture</w:t>
+      </w:r>
+      <w:proofErr w:type="spellEnd"/>
+      <w:r>
+        <w:t xml:space="preserve"> : texte</w:t>
+      </w:r>
+    </w:p>
+    <w:p>
+      <w:pPr>
+        <w:ind w:left="664" w:right="0" w:firstLine="0"/>
+      </w:pPr>
+    </w:p>
+    <w:p>
+      <w:pPr>
+        <w:ind w:left="664" w:right="0" w:firstLine="0"/>
+      </w:pPr>
+      <w:proofErr w:type="gramStart"/>
+      <w:r>
+        <w:t>date</w:t>
+      </w:r>
+      <w:proofErr w:type="gramEnd"/>
+      <w:r>
+        <w:t xml:space="preserve"> : texte au format JJ/MM/AAAA</w:t>
+      </w:r>
+    </w:p>
+    <w:p>
+      <w:pPr>
+        <w:ind w:left="664" w:right="0" w:firstLine="0"/>
+      </w:pPr>
+    </w:p>
+    <w:p>
+      <w:pPr>
+        <w:ind w:left="664" w:right="0" w:firstLine="0"/>
+      </w:pPr>
+      <w:proofErr w:type="gramStart"/>
+      <w:r>
+        <w:t>client</w:t>
+      </w:r>
+      <w:proofErr w:type="gramEnd"/>
+      <w:r>
+        <w:t xml:space="preserve"> : texte</w:t>
+      </w:r>
+    </w:p>
+    <w:p>
+      <w:pPr>
+        <w:ind w:left="664" w:right="0" w:firstLine="0"/>
+      </w:pPr>
+    </w:p>
+    <w:p>
+      <w:pPr>
+        <w:ind w:left="664" w:right="0" w:firstLine="0"/>
+      </w:pPr>
+      <w:proofErr w:type="spellStart"/>
+      <w:proofErr w:type="gramStart"/>
+      <w:r>
+        <w:t>montant</w:t>
+      </w:r>
+      <w:proofErr w:type="gramEnd"/>
+      <w:r>
+        <w:t>_ht</w:t>
+      </w:r>
+      <w:proofErr w:type="spellEnd"/>
+      <w:r>
+        <w:t xml:space="preserve"> : nombre décimal</w:t>
+      </w:r>
+    </w:p>
+    <w:p>
+      <w:pPr>
+        <w:ind w:left="664" w:right="0" w:firstLine="0"/>
+      </w:pPr>
+    </w:p>
+    <w:p>
+      <w:pPr>
+        <w:ind w:left="664" w:right="0" w:firstLine="0"/>
+      </w:pPr>
+      <w:proofErr w:type="gramStart"/>
+      <w:r>
+        <w:t>tva</w:t>
+      </w:r>
+      <w:proofErr w:type="gramEnd"/>
+      <w:r>
+        <w:t xml:space="preserve"> : nombre décimal</w:t>
+      </w:r>
+    </w:p>
+    <w:p>
+      <w:pPr>
+        <w:ind w:left="664" w:right="0" w:firstLine="0"/>
+      </w:pPr>
+    </w:p>
+    <w:p>
+      <w:pPr>
+        <w:ind w:left="664" w:right="0" w:firstLine="0"/>
+      </w:pPr>
+      <w:proofErr w:type="spellStart"/>
+      <w:proofErr w:type="gramStart"/>
+      <w:r>
+        <w:t>montant</w:t>
+      </w:r>
+      <w:proofErr w:type="gramEnd"/>
+      <w:r>
+        <w:t>_ttc</w:t>
+      </w:r>
+      <w:proofErr w:type="spellEnd"/>
+      <w:r>
+        <w:t xml:space="preserve"> : nombre décimal</w:t>
+      </w:r>
+    </w:p>
+    <w:p>
+      <w:pPr>
+        <w:ind w:left="664" w:right="0" w:firstLine="0"/>
+      </w:pPr>
+    </w:p>
+    <w:p>
+      <w:pPr>
+        <w:ind w:left="664" w:right="0" w:firstLine="0"/>
+      </w:pPr>
+      <w:r>
+        <w:t xml:space="preserve">Si une information est absente du document, indique </w:t>
+      </w:r>
+      <w:proofErr w:type="spellStart"/>
+      <w:r>
+        <w:t>null</w:t>
+      </w:r>
+      <w:proofErr w:type="spellEnd"/>
+      <w:r>
+        <w:t xml:space="preserve"> pour le champ correspondant. Ne retourne rien d'autre que le JSON.</w:t>
+      </w:r>
+    </w:p>
+    <w:p>
+      <w:pPr>
+        <w:ind w:left="664" w:right="0" w:firstLine="0"/>
+      </w:pPr>
+    </w:p>
+    <w:p>
+      <w:pPr>
+        <w:ind w:left="664" w:right="0" w:firstLine="0"/>
+      </w:pPr>
+      <w:r>
+        <w:t>Facture :</w:t>
+      </w:r>
+    </w:p>
+    <w:p>
+      <w:pPr>
+        <w:ind w:left="664" w:right="0" w:firstLine="0"/>
+      </w:pPr>
+    </w:p>
+    <w:p>
+      <w:pPr>
+        <w:ind w:left="664" w:right="0" w:firstLine="0"/>
+      </w:pPr>
+      <w:r>
+        <w:t>Facture n° FA-2026-0347</w:t>
+      </w:r>
+    </w:p>
+    <w:p>
+      <w:pPr>
+        <w:ind w:left="664" w:right="0" w:firstLine="0"/>
+      </w:pPr>
+    </w:p>
+    <w:p>
+      <w:pPr>
+        <w:ind w:left="664" w:right="0" w:firstLine="0"/>
+      </w:pPr>
+      <w:r>
+        <w:t>Date d'émission : 03/09/2026</w:t>
+      </w:r>
+    </w:p>
+    <w:p>
+      <w:pPr>
+        <w:ind w:left="664" w:right="0" w:firstLine="0"/>
+      </w:pPr>
+    </w:p>
+    <w:p>
+      <w:pPr>
+        <w:ind w:left="664" w:right="0" w:firstLine="0"/>
+      </w:pPr>
+      <w:r>
+        <w:t>Client : Établissement Diop et Fils</w:t>
+      </w:r>
+    </w:p>
+    <w:p>
+      <w:pPr>
+        <w:ind w:left="664" w:right="0" w:firstLine="0"/>
+      </w:pPr>
+    </w:p>
+    <w:p>
+      <w:pPr>
+        <w:ind w:left="664" w:right="0" w:firstLine="0"/>
+      </w:pPr>
+      <w:r>
+        <w:t>Adresse : Route de Rufisque, Dakar</w:t>
+      </w:r>
+    </w:p>
+    <w:p>
+      <w:pPr>
+        <w:ind w:left="664" w:right="0" w:firstLine="0"/>
+      </w:pPr>
+    </w:p>
+    <w:p>
+      <w:pPr>
+        <w:ind w:left="664" w:right="0" w:firstLine="0"/>
+      </w:pPr>
+      <w:r>
+        <w:t>Détail :</w:t>
+      </w:r>
+    </w:p>
+    <w:p>
+      <w:pPr>
+        <w:ind w:left="664" w:right="0" w:firstLine="0"/>
+      </w:pPr>
+    </w:p>
+    <w:p>
+      <w:pPr>
+        <w:ind w:left="664" w:right="0" w:firstLine="0"/>
+      </w:pPr>
+      <w:r>
+        <w:t>Prestation de développement web : 850 000 FCFA</w:t>
+      </w:r>
+    </w:p>
+    <w:p>
+      <w:pPr>
+        <w:ind w:left="664" w:right="0" w:firstLine="0"/>
+      </w:pPr>
+    </w:p>
+    <w:p>
+      <w:pPr>
+        <w:ind w:left="664" w:right="0" w:firstLine="0"/>
+      </w:pPr>
+      <w:r>
+        <w:t>Maintenance mensuelle : 150 000 FCFA</w:t>
+      </w:r>
+    </w:p>
+    <w:p>
+      <w:pPr>
+        <w:ind w:left="664" w:right="0" w:firstLine="0"/>
+      </w:pPr>
+    </w:p>
+    <w:p>
+      <w:pPr>
+        <w:ind w:left="664" w:right="0" w:firstLine="0"/>
+      </w:pPr>
+      <w:r>
+        <w:t>Montant HT : 1 000 000 FCFA</w:t>
+      </w:r>
+    </w:p>
+    <w:p>
+      <w:pPr>
+        <w:ind w:left="664" w:right="0" w:firstLine="0"/>
+      </w:pPr>
+    </w:p>
+    <w:p>
+      <w:pPr>
+        <w:ind w:left="664" w:right="0" w:firstLine="0"/>
+      </w:pPr>
+      <w:r>
+        <w:t>TVA (18%) : 180 000 FCFA</w:t>
+      </w:r>
+    </w:p>
+    <w:p>
+      <w:pPr>
+        <w:ind w:left="664" w:right="0" w:firstLine="0"/>
+      </w:pPr>
+    </w:p>
+    <w:p>
+      <w:pPr>
+        <w:ind w:left="664" w:right="0" w:firstLine="0"/>
+      </w:pPr>
+      <w:r>
+        <w:t>Merci de régler sous 30 jours.</w:t>
+      </w:r>
+    </w:p>
+    <w:p>
+      <w:pPr>
+        <w:ind w:left="664" w:right="0" w:firstLine="0"/>
+      </w:pPr>
+      <w:r>
+        <w:rPr>
+          <w:noProof/>
+        </w:rPr>
+        <w:drawing>
+          <wp:inline distT="0" distB="0" distL="0" distR="0" wp14:anchorId="6AF87150" wp14:editId="1E1EF0AC">
+            <wp:extent cx="5382260" cy="1606550"/>
+            <wp:effectExtent l="0" t="0" r="8890" b="0"/>
+            <wp:docPr id="13" name="Image 13"/>
+            <wp:cNvGraphicFramePr>
+              <a:graphicFrameLocks xmlns:a="http://schemas.openxmlformats.org/drawingml/2006/main" noChangeAspect="1"/>
+            </wp:cNvGraphicFramePr>
+            <a:graphic xmlns:a="http://schemas.openxmlformats.org/drawingml/2006/main">
+              <a:graphicData uri="http://schemas.openxmlformats.org/drawingml/2006/picture">
+                <pic:pic xmlns:pic="http://schemas.openxmlformats.org/drawingml/2006/picture">
+                  <pic:nvPicPr>
+                    <pic:cNvPr id="13" name="Capture d'écran 2026-09-10 102647.png"/>
+                    <pic:cNvPicPr/>
+                  </pic:nvPicPr>
+                  <pic:blipFill>
+                    <a:blip r:embed="rId19">
+                      <a:extLst>
+                        <a:ext uri="{28A0092B-C50C-407E-A947-70E740481C1C}">
+                          <a14:useLocalDpi xmlns:a14="http://schemas.microsoft.com/office/drawing/2010/main" val="0"/>
+                        </a:ext>
+                      </a:extLst>
+                    </a:blip>
+                    <a:stretch>
+                      <a:fillRect/>
+                    </a:stretch>
+                  </pic:blipFill>
+                  <pic:spPr>
+                    <a:xfrm>
+                      <a:off x="0" y="0"/>
+                      <a:ext cx="5382260" cy="1606550"/>
+                    </a:xfrm>
+                    <a:prstGeom prst="rect">
+                      <a:avLst/>
+                    </a:prstGeom>
+                  </pic:spPr>
+                </pic:pic>
+              </a:graphicData>
+            </a:graphic>
+          </wp:inline>
+        </w:drawing>
+      </w:r>
+    </w:p>
+    <w:p>
+      <w:pPr>
         <w:numPr>
           <w:ilvl w:val="0"/>
           <w:numId w:val="2"/>
@@ -3279,54 +3729,13 @@
         <w:ind w:right="0" w:hanging="338"/>
       </w:pPr>
       <w:r>
-        <w:t>Créer un prompt permettant d’extraire, à partir d’une facture, les infos (</w:t>
-      </w:r>
-      <w:proofErr w:type="spellStart"/>
-      <w:r>
-        <w:t>numéro_facture</w:t>
-      </w:r>
-      <w:proofErr w:type="spellEnd"/>
-      <w:r>
-        <w:t xml:space="preserve">, date, client, </w:t>
-      </w:r>
-      <w:proofErr w:type="spellStart"/>
-      <w:r>
-        <w:t>montant_ht</w:t>
-      </w:r>
-      <w:proofErr w:type="spellEnd"/>
-      <w:r>
-        <w:t xml:space="preserve">, tva, </w:t>
-      </w:r>
-      <w:proofErr w:type="spellStart"/>
-      <w:r>
-        <w:t>montant_ttc</w:t>
-      </w:r>
-      <w:proofErr w:type="spellEnd"/>
-      <w:r>
-        <w:t xml:space="preserve">). Retourner uniquement un JSON valide avec </w:t>
-      </w:r>
-      <w:proofErr w:type="spellStart"/>
-      <w:r>
-        <w:rPr>
-          <w:sz w:val="17"/>
-        </w:rPr>
-        <w:t>null</w:t>
-      </w:r>
-      <w:proofErr w:type="spellEnd"/>
-      <w:r>
-        <w:t xml:space="preserve"> si une info est absente </w:t>
-      </w:r>
-    </w:p>
-    <w:p>
-      <w:pPr>
-        <w:numPr>
-          <w:ilvl w:val="0"/>
-          <w:numId w:val="2"/>
-        </w:numPr>
-        <w:ind w:right="0" w:hanging="338"/>
-      </w:pPr>
-      <w:r>
-        <w:t xml:space="preserve">Créer un prompt permettant de rédiger un email destiné à un client dont la livraison a pris du retard avec les objectifs (reconnaître le retard, présenter des excuses, expliquer la situation sans inventer de cause et proposer une solution), le ton (professionnel, courtois et rassurant) et la longueur maximale (150 mots) </w:t>
+        <w:lastRenderedPageBreak/>
+        <w:t>Créer un prompt permettant de rédiger un email destiné à un client dont la livraison a pris du retard avec les objectifs (reconnaître le retard, présenter des excuses, expliquer la situation sans inventer de cause et proposer une solution), le ton (professionnel, courtois et rassurant) et la longueur</w:t>
+      </w:r>
+      <w:bookmarkStart w:id="0" w:name="_GoBack"/>
+      <w:bookmarkEnd w:id="0"/>
+      <w:r>
+        <w:t xml:space="preserve"> maximale (150 mots) </w:t>
       </w:r>
     </w:p>
     <w:p>
@@ -3463,7 +3872,6 @@
         <w:ind w:right="0" w:hanging="338"/>
       </w:pPr>
       <w:r>
-        <w:lastRenderedPageBreak/>
         <w:t xml:space="preserve">Créer un prompt permettant d’expliquer les métriques de Régression (MAE, MSE, RMSE). Pour chacune, le LLM doit donner la définition, expliquer son interprétation, donner un exemple concret et indiquer dans quel contexte elle est particulièrement utile. </w:t>
       </w:r>
     </w:p>
@@ -3691,6 +4099,7 @@
         <w:ind w:left="-5"/>
       </w:pPr>
       <w:r>
+        <w:lastRenderedPageBreak/>
         <w:t xml:space="preserve">Modalité de livraison </w:t>
       </w:r>
     </w:p>
@@ -3745,9 +4154,9 @@
       </w:r>
     </w:p>
     <w:sectPr>
-      <w:footerReference w:type="even" r:id="rId18"/>
-      <w:footerReference w:type="default" r:id="rId19"/>
-      <w:footerReference w:type="first" r:id="rId20"/>
+      <w:footerReference w:type="even" r:id="rId20"/>
+      <w:footerReference w:type="default" r:id="rId21"/>
+      <w:footerReference w:type="first" r:id="rId22"/>
       <w:pgSz w:w="12240" w:h="15840"/>
       <w:pgMar w:top="1404" w:right="1892" w:bottom="1567" w:left="1872" w:header="720" w:footer="681" w:gutter="0"/>
       <w:cols w:space="720"/>

</xml_diff>

<commit_message>
prompt permettant de rédiger un email destiné à un client
</commit_message>
<xml_diff>
--- a/ai-business_assistant/atelier-prompt-engineering.docx
+++ b/ai-business_assistant/atelier-prompt-engineering.docx
@@ -31,15 +31,7 @@
         <w:jc w:val="both"/>
       </w:pPr>
       <w:r>
-        <w:t xml:space="preserve">Une entreprise souhaite mettre en place « AI Business Assistant », un assistant IA polyvalent capable d'aider ses collaborateurs à exploiter des documents, analyser des données, faire du machine </w:t>
-      </w:r>
-      <w:proofErr w:type="spellStart"/>
-      <w:r>
-        <w:t>learning</w:t>
-      </w:r>
-      <w:proofErr w:type="spellEnd"/>
-      <w:r>
-        <w:t xml:space="preserve"> et produire des résultats structurés. </w:t>
+        <w:t xml:space="preserve">Une entreprise souhaite mettre en place « AI Business Assistant », un assistant IA polyvalent capable d'aider ses collaborateurs à exploiter des documents, analyser des données, faire du machine learning et produire des résultats structurés. </w:t>
       </w:r>
       <w:r>
         <w:rPr>
@@ -926,15 +918,7 @@
         <w:pStyle w:val="NormalWeb"/>
       </w:pPr>
       <w:r>
-        <w:t xml:space="preserve">Par rapport à une demande vague comme « analyse ces retours clients », la décomposition en composantes apporte une structure exploitable (facile à réutiliser dans une application ou un rapport) plutôt qu'un texte libre difficile à </w:t>
-      </w:r>
-      <w:proofErr w:type="spellStart"/>
-      <w:r>
-        <w:t>parser</w:t>
-      </w:r>
-      <w:proofErr w:type="spellEnd"/>
-      <w:r>
-        <w:t>, des contraintes explicites qui évitent les hallucinations et cadrent le raisonnement du modèle, et une réponse priorisée et actionnable, directement utile pour une équipe métier.</w:t>
+        <w:t>Par rapport à une demande vague comme « analyse ces retours clients », la décomposition en composantes apporte une structure exploitable (facile à réutiliser dans une application ou un rapport) plutôt qu'un texte libre difficile à parser, des contraintes explicites qui évitent les hallucinations et cadrent le raisonnement du modèle, et une réponse priorisée et actionnable, directement utile pour une équipe métier.</w:t>
       </w:r>
     </w:p>
     <w:p>
@@ -954,15 +938,7 @@
         <w:ind w:left="-5"/>
       </w:pPr>
       <w:r>
-        <w:t xml:space="preserve">Partie 2 - Comparer les techniques de </w:t>
-      </w:r>
-      <w:proofErr w:type="spellStart"/>
-      <w:r>
-        <w:t>prompting</w:t>
-      </w:r>
-      <w:proofErr w:type="spellEnd"/>
-      <w:r>
-        <w:t xml:space="preserve"> </w:t>
+        <w:t xml:space="preserve">Partie 2 - Comparer les techniques de prompting </w:t>
       </w:r>
     </w:p>
     <w:p>
@@ -972,15 +948,7 @@
         <w:jc w:val="both"/>
       </w:pPr>
       <w:r>
-        <w:t xml:space="preserve">Tester puis évaluer les résultats obtenus avec les techniques </w:t>
-      </w:r>
-      <w:proofErr w:type="spellStart"/>
-      <w:r>
-        <w:t>zero</w:t>
-      </w:r>
-      <w:proofErr w:type="spellEnd"/>
-      <w:r>
-        <w:t xml:space="preserve">-shot, one-shot, few-shot et un prompt structuré sur une demande du genre : </w:t>
+        <w:t xml:space="preserve">Tester puis évaluer les résultats obtenus avec les techniques zero-shot, one-shot, few-shot et un prompt structuré sur une demande du genre : </w:t>
       </w:r>
       <w:proofErr w:type="gramStart"/>
       <w:r>
@@ -1033,21 +1001,7 @@
         <w:rPr>
           <w:rStyle w:val="lev"/>
         </w:rPr>
-        <w:t xml:space="preserve">1) </w:t>
-      </w:r>
-      <w:proofErr w:type="spellStart"/>
-      <w:r>
-        <w:rPr>
-          <w:rStyle w:val="lev"/>
-        </w:rPr>
-        <w:t>Zero</w:t>
-      </w:r>
-      <w:proofErr w:type="spellEnd"/>
-      <w:r>
-        <w:rPr>
-          <w:rStyle w:val="lev"/>
-        </w:rPr>
-        <w:t>-shot</w:t>
+        <w:t>1) Zero-shot</w:t>
       </w:r>
       <w:r>
         <w:t xml:space="preserve"> (aucun exemple, instruction directe)</w:t>
@@ -1326,9 +1280,19 @@
           <w:sz w:val="24"/>
           <w:szCs w:val="24"/>
         </w:rPr>
-        <w:t xml:space="preserve">Partie 2 – Comparer les techniques de </w:t>
-      </w:r>
-      <w:proofErr w:type="spellStart"/>
+        <w:t>Partie 2 – Comparer les techniques de prompting</w:t>
+      </w:r>
+    </w:p>
+    <w:p>
+      <w:pPr>
+        <w:spacing w:before="100" w:beforeAutospacing="1" w:after="100" w:afterAutospacing="1" w:line="240" w:lineRule="auto"/>
+        <w:ind w:left="0" w:right="0" w:firstLine="0"/>
+        <w:rPr>
+          <w:color w:val="auto"/>
+          <w:sz w:val="24"/>
+          <w:szCs w:val="24"/>
+        </w:rPr>
+      </w:pPr>
       <w:r>
         <w:rPr>
           <w:b/>
@@ -1337,9 +1301,9 @@
           <w:sz w:val="24"/>
           <w:szCs w:val="24"/>
         </w:rPr>
-        <w:t>prompting</w:t>
-      </w:r>
-      <w:proofErr w:type="spellEnd"/>
+        <w:lastRenderedPageBreak/>
+        <w:t>Résultats obtenus</w:t>
+      </w:r>
     </w:p>
     <w:p>
       <w:pPr>
@@ -1353,14 +1317,89 @@
       </w:pPr>
       <w:r>
         <w:rPr>
+          <w:color w:val="auto"/>
+          <w:sz w:val="24"/>
+          <w:szCs w:val="24"/>
+        </w:rPr>
+        <w:t>Zero-shot : Négatif. Le commentaire mentionne un point positif (« service rapide »), mais le problème récurrent de l'application (« plante régulièrement ») domine l'évaluation globale.</w:t>
+      </w:r>
+    </w:p>
+    <w:p>
+      <w:pPr>
+        <w:spacing w:before="100" w:beforeAutospacing="1" w:after="100" w:afterAutospacing="1" w:line="240" w:lineRule="auto"/>
+        <w:ind w:left="0" w:right="0" w:firstLine="0"/>
+        <w:rPr>
+          <w:color w:val="auto"/>
+          <w:sz w:val="24"/>
+          <w:szCs w:val="24"/>
+        </w:rPr>
+      </w:pPr>
+      <w:r>
+        <w:rPr>
+          <w:color w:val="auto"/>
+          <w:sz w:val="24"/>
+          <w:szCs w:val="24"/>
+        </w:rPr>
+        <w:t>One-shot : Négatif</w:t>
+      </w:r>
+    </w:p>
+    <w:p>
+      <w:pPr>
+        <w:spacing w:before="100" w:beforeAutospacing="1" w:after="100" w:afterAutospacing="1" w:line="240" w:lineRule="auto"/>
+        <w:ind w:left="0" w:right="0" w:firstLine="0"/>
+        <w:rPr>
+          <w:color w:val="auto"/>
+          <w:sz w:val="24"/>
+          <w:szCs w:val="24"/>
+        </w:rPr>
+      </w:pPr>
+      <w:r>
+        <w:rPr>
+          <w:color w:val="auto"/>
+          <w:sz w:val="24"/>
+          <w:szCs w:val="24"/>
+        </w:rPr>
+        <w:t>Few-shot : Négatif</w:t>
+      </w:r>
+    </w:p>
+    <w:p>
+      <w:pPr>
+        <w:spacing w:before="100" w:beforeAutospacing="1" w:after="100" w:afterAutospacing="1" w:line="240" w:lineRule="auto"/>
+        <w:ind w:left="0" w:right="0" w:firstLine="0"/>
+        <w:rPr>
+          <w:color w:val="auto"/>
+          <w:sz w:val="24"/>
+          <w:szCs w:val="24"/>
+        </w:rPr>
+      </w:pPr>
+      <w:r>
+        <w:rPr>
+          <w:color w:val="auto"/>
+          <w:sz w:val="24"/>
+          <w:szCs w:val="24"/>
+        </w:rPr>
+        <w:t>Structuré : Négatif</w:t>
+      </w:r>
+    </w:p>
+    <w:p>
+      <w:pPr>
+        <w:spacing w:before="100" w:beforeAutospacing="1" w:after="100" w:afterAutospacing="1" w:line="240" w:lineRule="auto"/>
+        <w:ind w:left="0" w:right="0" w:firstLine="0"/>
+        <w:rPr>
+          <w:color w:val="auto"/>
+          <w:sz w:val="24"/>
+          <w:szCs w:val="24"/>
+        </w:rPr>
+      </w:pPr>
+      <w:r>
+        <w:rPr>
           <w:b/>
           <w:bCs/>
           <w:color w:val="auto"/>
           <w:sz w:val="24"/>
           <w:szCs w:val="24"/>
         </w:rPr>
-        <w:lastRenderedPageBreak/>
-        <w:t>Résultats obtenus</w:t>
+        <w:t>Analyse comparative</w:t>
       </w:r>
     </w:p>
     <w:p>
@@ -1373,23 +1412,13 @@
           <w:szCs w:val="24"/>
         </w:rPr>
       </w:pPr>
-      <w:proofErr w:type="spellStart"/>
-      <w:r>
-        <w:rPr>
-          <w:color w:val="auto"/>
-          <w:sz w:val="24"/>
-          <w:szCs w:val="24"/>
-        </w:rPr>
-        <w:t>Zero</w:t>
-      </w:r>
-      <w:proofErr w:type="spellEnd"/>
-      <w:r>
-        <w:rPr>
-          <w:color w:val="auto"/>
-          <w:sz w:val="24"/>
-          <w:szCs w:val="24"/>
-        </w:rPr>
-        <w:t>-shot : Négatif. Le commentaire mentionne un point positif (« service rapide »), mais le problème récurrent de l'application (« plante régulièrement ») domine l'évaluation globale.</w:t>
+      <w:r>
+        <w:rPr>
+          <w:color w:val="auto"/>
+          <w:sz w:val="24"/>
+          <w:szCs w:val="24"/>
+        </w:rPr>
+        <w:t>Les quatre techniques aboutissent à la même classification (négatif), ce qui confirme que le modèle identifie correctement le sentiment dominant même sur un commentaire mixte contenant à la fois un élément positif et un élément négatif.</w:t>
       </w:r>
     </w:p>
     <w:p>
@@ -1408,7 +1437,25 @@
           <w:sz w:val="24"/>
           <w:szCs w:val="24"/>
         </w:rPr>
-        <w:t>One-shot : Négatif</w:t>
+        <w:t xml:space="preserve">La différence principale se situe dans le format de la réponse. Le prompt zero-shot, ne précisant aucune contrainte de format, a produit une réponse accompagnée d'une justification, ce qui la rend moins directement exploitable par une application (nécessite un post-traitement pour extraire la classe). Les prompts one-shot et few-shot, en donnant un exemple de sortie courte, ont amené le modèle à reproduire ce même format concis, sans instruction explicite sur le format attendu. Le prompt structuré est celui qui offre le meilleur contrôle : la contrainte explicite « </w:t>
+      </w:r>
+      <w:proofErr w:type="gramStart"/>
+      <w:r>
+        <w:rPr>
+          <w:color w:val="auto"/>
+          <w:sz w:val="24"/>
+          <w:szCs w:val="24"/>
+        </w:rPr>
+        <w:t>réponds</w:t>
+      </w:r>
+      <w:proofErr w:type="gramEnd"/>
+      <w:r>
+        <w:rPr>
+          <w:color w:val="auto"/>
+          <w:sz w:val="24"/>
+          <w:szCs w:val="24"/>
+        </w:rPr>
+        <w:t xml:space="preserve"> uniquement avec le nom de la classe, sans phrase supplémentaire » garantit une sortie strictement conforme, immédiatement utilisable par du code.</w:t>
       </w:r>
     </w:p>
     <w:p>
@@ -1427,158 +1474,7 @@
           <w:sz w:val="24"/>
           <w:szCs w:val="24"/>
         </w:rPr>
-        <w:t>Few-shot : Négatif</w:t>
-      </w:r>
-    </w:p>
-    <w:p>
-      <w:pPr>
-        <w:spacing w:before="100" w:beforeAutospacing="1" w:after="100" w:afterAutospacing="1" w:line="240" w:lineRule="auto"/>
-        <w:ind w:left="0" w:right="0" w:firstLine="0"/>
-        <w:rPr>
-          <w:color w:val="auto"/>
-          <w:sz w:val="24"/>
-          <w:szCs w:val="24"/>
-        </w:rPr>
-      </w:pPr>
-      <w:r>
-        <w:rPr>
-          <w:color w:val="auto"/>
-          <w:sz w:val="24"/>
-          <w:szCs w:val="24"/>
-        </w:rPr>
-        <w:t>Structuré : Négatif</w:t>
-      </w:r>
-    </w:p>
-    <w:p>
-      <w:pPr>
-        <w:spacing w:before="100" w:beforeAutospacing="1" w:after="100" w:afterAutospacing="1" w:line="240" w:lineRule="auto"/>
-        <w:ind w:left="0" w:right="0" w:firstLine="0"/>
-        <w:rPr>
-          <w:color w:val="auto"/>
-          <w:sz w:val="24"/>
-          <w:szCs w:val="24"/>
-        </w:rPr>
-      </w:pPr>
-      <w:r>
-        <w:rPr>
-          <w:b/>
-          <w:bCs/>
-          <w:color w:val="auto"/>
-          <w:sz w:val="24"/>
-          <w:szCs w:val="24"/>
-        </w:rPr>
-        <w:t>Analyse comparative</w:t>
-      </w:r>
-    </w:p>
-    <w:p>
-      <w:pPr>
-        <w:spacing w:before="100" w:beforeAutospacing="1" w:after="100" w:afterAutospacing="1" w:line="240" w:lineRule="auto"/>
-        <w:ind w:left="0" w:right="0" w:firstLine="0"/>
-        <w:rPr>
-          <w:color w:val="auto"/>
-          <w:sz w:val="24"/>
-          <w:szCs w:val="24"/>
-        </w:rPr>
-      </w:pPr>
-      <w:r>
-        <w:rPr>
-          <w:color w:val="auto"/>
-          <w:sz w:val="24"/>
-          <w:szCs w:val="24"/>
-        </w:rPr>
-        <w:t>Les quatre techniques aboutissent à la même classification (négatif), ce qui confirme que le modèle identifie correctement le sentiment dominant même sur un commentaire mixte contenant à la fois un élément positif et un élément négatif.</w:t>
-      </w:r>
-    </w:p>
-    <w:p>
-      <w:pPr>
-        <w:spacing w:before="100" w:beforeAutospacing="1" w:after="100" w:afterAutospacing="1" w:line="240" w:lineRule="auto"/>
-        <w:ind w:left="0" w:right="0" w:firstLine="0"/>
-        <w:rPr>
-          <w:color w:val="auto"/>
-          <w:sz w:val="24"/>
-          <w:szCs w:val="24"/>
-        </w:rPr>
-      </w:pPr>
-      <w:r>
-        <w:rPr>
-          <w:color w:val="auto"/>
-          <w:sz w:val="24"/>
-          <w:szCs w:val="24"/>
-        </w:rPr>
-        <w:t xml:space="preserve">La différence principale se situe dans le format de la réponse. Le prompt </w:t>
-      </w:r>
-      <w:proofErr w:type="spellStart"/>
-      <w:r>
-        <w:rPr>
-          <w:color w:val="auto"/>
-          <w:sz w:val="24"/>
-          <w:szCs w:val="24"/>
-        </w:rPr>
-        <w:t>zero</w:t>
-      </w:r>
-      <w:proofErr w:type="spellEnd"/>
-      <w:r>
-        <w:rPr>
-          <w:color w:val="auto"/>
-          <w:sz w:val="24"/>
-          <w:szCs w:val="24"/>
-        </w:rPr>
-        <w:t xml:space="preserve">-shot, ne précisant aucune contrainte de format, a produit une réponse accompagnée d'une justification, ce qui la rend moins directement exploitable par une application (nécessite un post-traitement pour extraire la classe). Les prompts one-shot et few-shot, en donnant un exemple de sortie courte, ont amené le modèle à reproduire ce même format concis, sans instruction explicite sur le format attendu. Le prompt structuré est celui qui offre le meilleur contrôle : la contrainte explicite « </w:t>
-      </w:r>
-      <w:proofErr w:type="gramStart"/>
-      <w:r>
-        <w:rPr>
-          <w:color w:val="auto"/>
-          <w:sz w:val="24"/>
-          <w:szCs w:val="24"/>
-        </w:rPr>
-        <w:t>réponds</w:t>
-      </w:r>
-      <w:proofErr w:type="gramEnd"/>
-      <w:r>
-        <w:rPr>
-          <w:color w:val="auto"/>
-          <w:sz w:val="24"/>
-          <w:szCs w:val="24"/>
-        </w:rPr>
-        <w:t xml:space="preserve"> uniquement avec le nom de la classe, sans phrase supplémentaire » garantit une sortie strictement conforme, immédiatement utilisable par du code.</w:t>
-      </w:r>
-    </w:p>
-    <w:p>
-      <w:pPr>
-        <w:spacing w:before="100" w:beforeAutospacing="1" w:after="100" w:afterAutospacing="1" w:line="240" w:lineRule="auto"/>
-        <w:ind w:left="0" w:right="0" w:firstLine="0"/>
-        <w:rPr>
-          <w:color w:val="auto"/>
-          <w:sz w:val="24"/>
-          <w:szCs w:val="24"/>
-        </w:rPr>
-      </w:pPr>
-      <w:r>
-        <w:rPr>
-          <w:color w:val="auto"/>
-          <w:sz w:val="24"/>
-          <w:szCs w:val="24"/>
-        </w:rPr>
-        <w:t xml:space="preserve">En résumé : le few-shot améliore la cohérence du format par imitation des exemples, mais seul le prompt structuré garantit ce format de manière fiable et explicite, ce qui en fait le plus adapté à un usage en application métier (où la sortie doit être </w:t>
-      </w:r>
-      <w:proofErr w:type="spellStart"/>
-      <w:r>
-        <w:rPr>
-          <w:color w:val="auto"/>
-          <w:sz w:val="24"/>
-          <w:szCs w:val="24"/>
-        </w:rPr>
-        <w:t>parsée</w:t>
-      </w:r>
-      <w:proofErr w:type="spellEnd"/>
-      <w:r>
-        <w:rPr>
-          <w:color w:val="auto"/>
-          <w:sz w:val="24"/>
-          <w:szCs w:val="24"/>
-        </w:rPr>
-        <w:t xml:space="preserve"> automatiquement).</w:t>
+        <w:t>En résumé : le few-shot améliore la cohérence du format par imitation des exemples, mais seul le prompt structuré garantit ce format de manière fiable et explicite, ce qui en fait le plus adapté à un usage en application métier (où la sortie doit être parsée automatiquement).</w:t>
       </w:r>
     </w:p>
     <w:p>
@@ -1728,33 +1624,11 @@
       <w:r>
         <w:t xml:space="preserve">C'est la technique du </w:t>
       </w:r>
-      <w:proofErr w:type="spellStart"/>
       <w:r>
         <w:rPr>
           <w:rStyle w:val="lev"/>
         </w:rPr>
-        <w:t>chain</w:t>
-      </w:r>
-      <w:proofErr w:type="spellEnd"/>
-      <w:r>
-        <w:rPr>
-          <w:rStyle w:val="lev"/>
-        </w:rPr>
-        <w:t>-of-</w:t>
-      </w:r>
-      <w:proofErr w:type="spellStart"/>
-      <w:r>
-        <w:rPr>
-          <w:rStyle w:val="lev"/>
-        </w:rPr>
-        <w:t>thought</w:t>
-      </w:r>
-      <w:proofErr w:type="spellEnd"/>
-      <w:r>
-        <w:rPr>
-          <w:rStyle w:val="lev"/>
-        </w:rPr>
-        <w:t xml:space="preserve"> guidé / décomposition en étapes</w:t>
+        <w:t>chain-of-thought guidé / décomposition en étapes</w:t>
       </w:r>
       <w:r>
         <w:t xml:space="preserve"> : au lieu de demander un raisonnement complexe en une seule fois, on force le modèle à suivre un chemin logique explicite, ce qui réduit les oublis et améliore la cohérence de la réponse finale.</w:t>
@@ -2283,14 +2157,12 @@
       <w:r>
         <w:t xml:space="preserve">, </w:t>
       </w:r>
-      <w:proofErr w:type="spellStart"/>
       <w:r>
         <w:rPr>
           <w:sz w:val="17"/>
         </w:rPr>
         <w:t>categorie</w:t>
       </w:r>
-      <w:proofErr w:type="spellEnd"/>
       <w:r>
         <w:t xml:space="preserve">, </w:t>
       </w:r>
@@ -2303,14 +2175,12 @@
       <w:r>
         <w:t xml:space="preserve">, </w:t>
       </w:r>
-      <w:proofErr w:type="spellStart"/>
       <w:r>
         <w:rPr>
           <w:sz w:val="17"/>
         </w:rPr>
         <w:t>probleme</w:t>
       </w:r>
-      <w:proofErr w:type="spellEnd"/>
       <w:r>
         <w:t xml:space="preserve">, </w:t>
       </w:r>
@@ -2368,21 +2238,7 @@
         <w:rPr>
           <w:sz w:val="17"/>
         </w:rPr>
-        <w:t xml:space="preserve"> "</w:t>
-      </w:r>
-      <w:proofErr w:type="spellStart"/>
-      <w:r>
-        <w:rPr>
-          <w:sz w:val="17"/>
-        </w:rPr>
-        <w:t>negatif</w:t>
-      </w:r>
-      <w:proofErr w:type="spellEnd"/>
-      <w:r>
-        <w:rPr>
-          <w:sz w:val="17"/>
-        </w:rPr>
-        <w:t xml:space="preserve">", </w:t>
+        <w:t xml:space="preserve"> "negatif", </w:t>
       </w:r>
     </w:p>
     <w:p>
@@ -2394,16 +2250,8 @@
         <w:rPr>
           <w:sz w:val="17"/>
         </w:rPr>
-        <w:t xml:space="preserve">  "</w:t>
-      </w:r>
-      <w:proofErr w:type="spellStart"/>
-      <w:r>
-        <w:rPr>
-          <w:sz w:val="17"/>
-        </w:rPr>
-        <w:t>categorie</w:t>
-      </w:r>
-      <w:proofErr w:type="spellEnd"/>
+        <w:t xml:space="preserve">  "categorie</w:t>
+      </w:r>
       <w:proofErr w:type="gramStart"/>
       <w:r>
         <w:rPr>
@@ -2454,16 +2302,8 @@
         <w:rPr>
           <w:sz w:val="17"/>
         </w:rPr>
-        <w:t xml:space="preserve">  "</w:t>
-      </w:r>
-      <w:proofErr w:type="spellStart"/>
-      <w:r>
-        <w:rPr>
-          <w:sz w:val="17"/>
-        </w:rPr>
-        <w:t>probleme</w:t>
-      </w:r>
-      <w:proofErr w:type="spellEnd"/>
+        <w:t xml:space="preserve">  "probleme</w:t>
+      </w:r>
       <w:proofErr w:type="gramStart"/>
       <w:r>
         <w:rPr>
@@ -2589,15 +2429,7 @@
         <w:ind w:right="0" w:hanging="338"/>
       </w:pPr>
       <w:r>
-        <w:t xml:space="preserve">Ajouter une validation en définissant les règles de sortie suivantes : format JSON valide ; aucune propriété supplémentaire ; sentiment vaut positif, </w:t>
-      </w:r>
-      <w:proofErr w:type="spellStart"/>
-      <w:r>
-        <w:t>negatif</w:t>
-      </w:r>
-      <w:proofErr w:type="spellEnd"/>
-      <w:r>
-        <w:t xml:space="preserve"> ou neutre ; confiance est compris entre 0 et 1 ; urgence vaut faible, moyenne ou élevée. </w:t>
+        <w:t xml:space="preserve">Ajouter une validation en définissant les règles de sortie suivantes : format JSON valide ; aucune propriété supplémentaire ; sentiment vaut positif, negatif ou neutre ; confiance est compris entre 0 et 1 ; urgence vaut faible, moyenne ou élevée. </w:t>
       </w:r>
     </w:p>
     <w:p>
@@ -2629,15 +2461,7 @@
       </w:r>
       <w:proofErr w:type="gramEnd"/>
       <w:r>
-        <w:t xml:space="preserve"> : texte, valeur parmi positif, </w:t>
-      </w:r>
-      <w:proofErr w:type="spellStart"/>
-      <w:r>
-        <w:t>negatif</w:t>
-      </w:r>
-      <w:proofErr w:type="spellEnd"/>
-      <w:r>
-        <w:t>, neutre</w:t>
+        <w:t xml:space="preserve"> : texte, valeur parmi positif, negatif, neutre</w:t>
       </w:r>
     </w:p>
     <w:p>
@@ -2645,12 +2469,10 @@
         <w:spacing w:after="160"/>
         <w:ind w:left="664" w:right="0" w:firstLine="0"/>
       </w:pPr>
-      <w:proofErr w:type="spellStart"/>
       <w:proofErr w:type="gramStart"/>
       <w:r>
         <w:t>categorie</w:t>
       </w:r>
-      <w:proofErr w:type="spellEnd"/>
       <w:proofErr w:type="gramEnd"/>
       <w:r>
         <w:t xml:space="preserve"> : texte décrivant le thème principal du commentaire, par exemple livraison, produit, service, application</w:t>
@@ -2675,12 +2497,10 @@
         <w:spacing w:after="160"/>
         <w:ind w:left="664" w:right="0" w:firstLine="0"/>
       </w:pPr>
-      <w:proofErr w:type="spellStart"/>
       <w:proofErr w:type="gramStart"/>
       <w:r>
         <w:t>probleme</w:t>
       </w:r>
-      <w:proofErr w:type="spellEnd"/>
       <w:proofErr w:type="gramEnd"/>
       <w:r>
         <w:t xml:space="preserve"> : texte résumant le problème principal en une courte phrase</w:t>
@@ -2737,23 +2557,7 @@
       </w:pPr>
       <w:r>
         <w:lastRenderedPageBreak/>
-        <w:t xml:space="preserve">Aucune propriété supplémentaire ne doit être ajoutée en dehors de sentiment, </w:t>
-      </w:r>
-      <w:proofErr w:type="spellStart"/>
-      <w:r>
-        <w:t>categorie</w:t>
-      </w:r>
-      <w:proofErr w:type="spellEnd"/>
-      <w:r>
-        <w:t xml:space="preserve">, urgence, </w:t>
-      </w:r>
-      <w:proofErr w:type="spellStart"/>
-      <w:r>
-        <w:t>probleme</w:t>
-      </w:r>
-      <w:proofErr w:type="spellEnd"/>
-      <w:r>
-        <w:t>, confiance</w:t>
+        <w:t>Aucune propriété supplémentaire ne doit être ajoutée en dehors de sentiment, categorie, urgence, probleme, confiance</w:t>
       </w:r>
     </w:p>
     <w:p>
@@ -2762,15 +2566,7 @@
         <w:ind w:left="664" w:right="0" w:firstLine="0"/>
       </w:pPr>
       <w:r>
-        <w:t xml:space="preserve">Le champ sentiment doit valoir uniquement positif, </w:t>
-      </w:r>
-      <w:proofErr w:type="spellStart"/>
-      <w:r>
-        <w:t>negatif</w:t>
-      </w:r>
-      <w:proofErr w:type="spellEnd"/>
-      <w:r>
-        <w:t xml:space="preserve"> ou neutre</w:t>
+        <w:t>Le champ sentiment doit valoir uniquement positif, negatif ou neutre</w:t>
       </w:r>
     </w:p>
     <w:p>
@@ -3252,14 +3048,12 @@
       <w:r>
         <w:t xml:space="preserve">, matériel, sécurité, accès, autre). La réponse est au format JSON avec les champs </w:t>
       </w:r>
-      <w:proofErr w:type="spellStart"/>
       <w:r>
         <w:rPr>
           <w:sz w:val="17"/>
         </w:rPr>
         <w:t>categorie</w:t>
       </w:r>
-      <w:proofErr w:type="spellEnd"/>
       <w:r>
         <w:t xml:space="preserve"> et </w:t>
       </w:r>
@@ -3336,40 +3130,14 @@
         <w:ind w:left="664" w:right="0" w:firstLine="0"/>
       </w:pPr>
       <w:r>
-        <w:t>Créer un prompt permettant d’extraire, à partir d’une facture, les infos (</w:t>
-      </w:r>
-      <w:proofErr w:type="spellStart"/>
-      <w:r>
-        <w:t>numéro_facture</w:t>
-      </w:r>
-      <w:proofErr w:type="spellEnd"/>
-      <w:r>
-        <w:t xml:space="preserve">, date, client, </w:t>
-      </w:r>
-      <w:proofErr w:type="spellStart"/>
-      <w:r>
-        <w:t>montant_ht</w:t>
-      </w:r>
-      <w:proofErr w:type="spellEnd"/>
-      <w:r>
-        <w:t xml:space="preserve">, tva, </w:t>
-      </w:r>
-      <w:proofErr w:type="spellStart"/>
-      <w:r>
-        <w:t>montant_ttc</w:t>
-      </w:r>
-      <w:proofErr w:type="spellEnd"/>
-      <w:r>
-        <w:t xml:space="preserve">). Retourner uniquement un JSON valide avec </w:t>
-      </w:r>
-      <w:proofErr w:type="spellStart"/>
+        <w:t xml:space="preserve">Créer un prompt permettant d’extraire, à partir d’une facture, les infos (numéro_facture, date, client, montant_ht, tva, montant_ttc). Retourner uniquement un JSON valide avec </w:t>
+      </w:r>
       <w:r>
         <w:rPr>
           <w:sz w:val="17"/>
         </w:rPr>
         <w:t>null</w:t>
       </w:r>
-      <w:proofErr w:type="spellEnd"/>
       <w:r>
         <w:t xml:space="preserve"> si une info est absente </w:t>
       </w:r>
@@ -3391,16 +3159,47 @@
       <w:pPr>
         <w:ind w:left="664" w:right="0" w:firstLine="0"/>
       </w:pPr>
-      <w:proofErr w:type="spellStart"/>
       <w:proofErr w:type="gramStart"/>
       <w:r>
         <w:t>numero</w:t>
       </w:r>
       <w:proofErr w:type="gramEnd"/>
       <w:r>
-        <w:t>_facture</w:t>
-      </w:r>
-      <w:proofErr w:type="spellEnd"/>
+        <w:t>_facture : texte</w:t>
+      </w:r>
+    </w:p>
+    <w:p>
+      <w:pPr>
+        <w:ind w:left="664" w:right="0" w:firstLine="0"/>
+      </w:pPr>
+    </w:p>
+    <w:p>
+      <w:pPr>
+        <w:ind w:left="664" w:right="0" w:firstLine="0"/>
+      </w:pPr>
+      <w:proofErr w:type="gramStart"/>
+      <w:r>
+        <w:t>date</w:t>
+      </w:r>
+      <w:proofErr w:type="gramEnd"/>
+      <w:r>
+        <w:t xml:space="preserve"> : texte au format JJ/MM/AAAA</w:t>
+      </w:r>
+    </w:p>
+    <w:p>
+      <w:pPr>
+        <w:ind w:left="664" w:right="0" w:firstLine="0"/>
+      </w:pPr>
+    </w:p>
+    <w:p>
+      <w:pPr>
+        <w:ind w:left="664" w:right="0" w:firstLine="0"/>
+      </w:pPr>
+      <w:proofErr w:type="gramStart"/>
+      <w:r>
+        <w:t>client</w:t>
+      </w:r>
+      <w:proofErr w:type="gramEnd"/>
       <w:r>
         <w:t xml:space="preserve"> : texte</w:t>
       </w:r>
@@ -3416,11 +3215,11 @@
       </w:pPr>
       <w:proofErr w:type="gramStart"/>
       <w:r>
-        <w:t>date</w:t>
+        <w:t>montant</w:t>
       </w:r>
       <w:proofErr w:type="gramEnd"/>
       <w:r>
-        <w:t xml:space="preserve"> : texte au format JJ/MM/AAAA</w:t>
+        <w:t>_ht : nombre décimal</w:t>
       </w:r>
     </w:p>
     <w:p>
@@ -3434,11 +3233,11 @@
       </w:pPr>
       <w:proofErr w:type="gramStart"/>
       <w:r>
-        <w:t>client</w:t>
+        <w:t>tva</w:t>
       </w:r>
       <w:proofErr w:type="gramEnd"/>
       <w:r>
-        <w:t xml:space="preserve"> : texte</w:t>
+        <w:t xml:space="preserve"> : nombre décimal</w:t>
       </w:r>
     </w:p>
     <w:p>
@@ -3450,18 +3249,13 @@
       <w:pPr>
         <w:ind w:left="664" w:right="0" w:firstLine="0"/>
       </w:pPr>
-      <w:proofErr w:type="spellStart"/>
       <w:proofErr w:type="gramStart"/>
       <w:r>
         <w:t>montant</w:t>
       </w:r>
       <w:proofErr w:type="gramEnd"/>
       <w:r>
-        <w:t>_ht</w:t>
-      </w:r>
-      <w:proofErr w:type="spellEnd"/>
-      <w:r>
-        <w:t xml:space="preserve"> : nombre décimal</w:t>
+        <w:t>_ttc : nombre décimal</w:t>
       </w:r>
     </w:p>
     <w:p>
@@ -3473,57 +3267,8 @@
       <w:pPr>
         <w:ind w:left="664" w:right="0" w:firstLine="0"/>
       </w:pPr>
-      <w:proofErr w:type="gramStart"/>
-      <w:r>
-        <w:t>tva</w:t>
-      </w:r>
-      <w:proofErr w:type="gramEnd"/>
-      <w:r>
-        <w:t xml:space="preserve"> : nombre décimal</w:t>
-      </w:r>
-    </w:p>
-    <w:p>
-      <w:pPr>
-        <w:ind w:left="664" w:right="0" w:firstLine="0"/>
-      </w:pPr>
-    </w:p>
-    <w:p>
-      <w:pPr>
-        <w:ind w:left="664" w:right="0" w:firstLine="0"/>
-      </w:pPr>
-      <w:proofErr w:type="spellStart"/>
-      <w:proofErr w:type="gramStart"/>
-      <w:r>
-        <w:t>montant</w:t>
-      </w:r>
-      <w:proofErr w:type="gramEnd"/>
-      <w:r>
-        <w:t>_ttc</w:t>
-      </w:r>
-      <w:proofErr w:type="spellEnd"/>
-      <w:r>
-        <w:t xml:space="preserve"> : nombre décimal</w:t>
-      </w:r>
-    </w:p>
-    <w:p>
-      <w:pPr>
-        <w:ind w:left="664" w:right="0" w:firstLine="0"/>
-      </w:pPr>
-    </w:p>
-    <w:p>
-      <w:pPr>
-        <w:ind w:left="664" w:right="0" w:firstLine="0"/>
-      </w:pPr>
-      <w:r>
-        <w:t xml:space="preserve">Si une information est absente du document, indique </w:t>
-      </w:r>
-      <w:proofErr w:type="spellStart"/>
-      <w:r>
-        <w:t>null</w:t>
-      </w:r>
-      <w:proofErr w:type="spellEnd"/>
-      <w:r>
-        <w:t xml:space="preserve"> pour le champ correspondant. Ne retourne rien d'autre que le JSON.</w:t>
+      <w:r>
+        <w:t>Si une information est absente du document, indique null pour le champ correspondant. Ne retourne rien d'autre que le JSON.</w:t>
       </w:r>
     </w:p>
     <w:p>
@@ -3730,13 +3475,163 @@
       </w:pPr>
       <w:r>
         <w:lastRenderedPageBreak/>
-        <w:t>Créer un prompt permettant de rédiger un email destiné à un client dont la livraison a pris du retard avec les objectifs (reconnaître le retard, présenter des excuses, expliquer la situation sans inventer de cause et proposer une solution), le ton (professionnel, courtois et rassurant) et la longueur</w:t>
+        <w:t xml:space="preserve">Créer un prompt permettant de rédiger un email destiné à un client dont la livraison a pris du retard avec les objectifs (reconnaître le retard, présenter des excuses, expliquer la situation sans inventer de cause et proposer une solution), le ton (professionnel, courtois et rassurant) et la longueur maximale (150 mots) </w:t>
+      </w:r>
+    </w:p>
+    <w:p>
+      <w:pPr>
+        <w:ind w:left="664" w:right="0" w:firstLine="0"/>
+      </w:pPr>
+    </w:p>
+    <w:p>
+      <w:pPr>
+        <w:ind w:left="326" w:right="0" w:firstLine="0"/>
+      </w:pPr>
+      <w:r>
+        <w:t>Rédige un email destiné à un client dont la livraison a pris du retard, en respectant les éléments suivants :</w:t>
+      </w:r>
+    </w:p>
+    <w:p>
+      <w:pPr>
+        <w:ind w:left="326" w:right="0" w:firstLine="0"/>
+      </w:pPr>
+    </w:p>
+    <w:p>
+      <w:pPr>
+        <w:ind w:left="326" w:right="0" w:firstLine="0"/>
+      </w:pPr>
+      <w:r>
+        <w:t>Objectifs :</w:t>
+      </w:r>
+    </w:p>
+    <w:p>
+      <w:pPr>
+        <w:ind w:left="326" w:right="0" w:firstLine="0"/>
+      </w:pPr>
+      <w:r>
+        <w:t>Reconnaître le retard de livraison</w:t>
+      </w:r>
+    </w:p>
+    <w:p>
+      <w:pPr>
+        <w:ind w:left="326" w:right="0" w:firstLine="0"/>
+      </w:pPr>
+      <w:r>
+        <w:t>Présenter des excuses au client</w:t>
+      </w:r>
+    </w:p>
+    <w:p>
+      <w:pPr>
+        <w:ind w:left="326" w:right="0" w:firstLine="0"/>
+      </w:pPr>
+      <w:r>
+        <w:t>Expliquer la situation sans inventer de cause précise si elle n'est pas fournie</w:t>
+      </w:r>
+    </w:p>
+    <w:p>
+      <w:pPr>
+        <w:ind w:left="326" w:right="0" w:firstLine="0"/>
+      </w:pPr>
+      <w:r>
+        <w:t>Proposer une solution ou un geste commercial</w:t>
+      </w:r>
+    </w:p>
+    <w:p>
+      <w:pPr>
+        <w:ind w:left="326" w:right="0" w:firstLine="0"/>
+      </w:pPr>
+    </w:p>
+    <w:p>
+      <w:pPr>
+        <w:ind w:left="326" w:right="0" w:firstLine="0"/>
+      </w:pPr>
+      <w:r>
+        <w:t>Ton : professionnel, courtois et rassurant</w:t>
+      </w:r>
+    </w:p>
+    <w:p>
+      <w:pPr>
+        <w:ind w:left="326" w:right="0" w:firstLine="0"/>
+      </w:pPr>
+    </w:p>
+    <w:p>
+      <w:pPr>
+        <w:ind w:left="326" w:right="0" w:firstLine="0"/>
+      </w:pPr>
+      <w:r>
+        <w:t>Contrainte de longueur : maximum 150 mots</w:t>
+      </w:r>
+    </w:p>
+    <w:p>
+      <w:pPr>
+        <w:ind w:left="326" w:right="0" w:firstLine="0"/>
+      </w:pPr>
+    </w:p>
+    <w:p>
+      <w:pPr>
+        <w:ind w:left="326" w:right="0" w:firstLine="0"/>
+      </w:pPr>
+      <w:r>
+        <w:t>Rédige l'email maintenant.</w:t>
+      </w:r>
+    </w:p>
+    <w:p>
+      <w:pPr>
+        <w:ind w:left="326" w:right="0" w:firstLine="0"/>
+      </w:pPr>
+      <w:r>
+        <w:rPr>
+          <w:noProof/>
+        </w:rPr>
+        <w:drawing>
+          <wp:inline distT="0" distB="0" distL="0" distR="0" wp14:anchorId="32964FF3" wp14:editId="3D611A15">
+            <wp:extent cx="5382260" cy="4184650"/>
+            <wp:effectExtent l="0" t="0" r="8890" b="6350"/>
+            <wp:docPr id="14" name="Image 14"/>
+            <wp:cNvGraphicFramePr>
+              <a:graphicFrameLocks xmlns:a="http://schemas.openxmlformats.org/drawingml/2006/main" noChangeAspect="1"/>
+            </wp:cNvGraphicFramePr>
+            <a:graphic xmlns:a="http://schemas.openxmlformats.org/drawingml/2006/main">
+              <a:graphicData uri="http://schemas.openxmlformats.org/drawingml/2006/picture">
+                <pic:pic xmlns:pic="http://schemas.openxmlformats.org/drawingml/2006/picture">
+                  <pic:nvPicPr>
+                    <pic:cNvPr id="14" name="Capture d'écran 2026-09-10 103231.png"/>
+                    <pic:cNvPicPr/>
+                  </pic:nvPicPr>
+                  <pic:blipFill>
+                    <a:blip r:embed="rId20">
+                      <a:extLst>
+                        <a:ext uri="{28A0092B-C50C-407E-A947-70E740481C1C}">
+                          <a14:useLocalDpi xmlns:a14="http://schemas.microsoft.com/office/drawing/2010/main" val="0"/>
+                        </a:ext>
+                      </a:extLst>
+                    </a:blip>
+                    <a:stretch>
+                      <a:fillRect/>
+                    </a:stretch>
+                  </pic:blipFill>
+                  <pic:spPr>
+                    <a:xfrm>
+                      <a:off x="0" y="0"/>
+                      <a:ext cx="5382260" cy="4184650"/>
+                    </a:xfrm>
+                    <a:prstGeom prst="rect">
+                      <a:avLst/>
+                    </a:prstGeom>
+                  </pic:spPr>
+                </pic:pic>
+              </a:graphicData>
+            </a:graphic>
+          </wp:inline>
+        </w:drawing>
       </w:r>
       <w:bookmarkStart w:id="0" w:name="_GoBack"/>
       <w:bookmarkEnd w:id="0"/>
-      <w:r>
-        <w:t xml:space="preserve"> maximale (150 mots) </w:t>
-      </w:r>
+    </w:p>
+    <w:p>
+      <w:pPr>
+        <w:ind w:left="664" w:right="0" w:firstLine="0"/>
+      </w:pPr>
     </w:p>
     <w:p>
       <w:pPr>
@@ -3747,19 +3642,12 @@
           <w:lang w:val="en-CA"/>
         </w:rPr>
       </w:pPr>
-      <w:proofErr w:type="spellStart"/>
       <w:r>
         <w:rPr>
           <w:lang w:val="en-CA"/>
         </w:rPr>
-        <w:t>Partie</w:t>
-      </w:r>
-      <w:proofErr w:type="spellEnd"/>
-      <w:r>
-        <w:rPr>
-          <w:lang w:val="en-CA"/>
-        </w:rPr>
-        <w:t xml:space="preserve"> 6 – Prompt Engineering pour le Machine Learning </w:t>
+        <w:lastRenderedPageBreak/>
+        <w:t xml:space="preserve">Partie 6 – Prompt Engineering pour le Machine Learning </w:t>
       </w:r>
     </w:p>
     <w:p>
@@ -3772,15 +3660,7 @@
         <w:ind w:right="0" w:hanging="338"/>
       </w:pPr>
       <w:r>
-        <w:t xml:space="preserve">Créer un prompt permettant, à partir du </w:t>
-      </w:r>
-      <w:proofErr w:type="spellStart"/>
-      <w:r>
-        <w:t>dataset</w:t>
-      </w:r>
-      <w:proofErr w:type="spellEnd"/>
-      <w:r>
-        <w:t xml:space="preserve"> des capteurs, de proposer des stratégies (détection, traitement, risques associés) de traitement des valeurs manquantes, des doublons, des valeurs aberrantes, des variables catégorielles </w:t>
+        <w:t xml:space="preserve">Créer un prompt permettant, à partir du dataset des capteurs, de proposer des stratégies (détection, traitement, risques associés) de traitement des valeurs manquantes, des doublons, des valeurs aberrantes, des variables catégorielles </w:t>
       </w:r>
     </w:p>
     <w:p>
@@ -3793,15 +3673,7 @@
         <w:ind w:right="0" w:hanging="338"/>
       </w:pPr>
       <w:r>
-        <w:t xml:space="preserve">Créer un prompt permettant, à partir du </w:t>
-      </w:r>
-      <w:proofErr w:type="spellStart"/>
-      <w:r>
-        <w:t>dataset</w:t>
-      </w:r>
-      <w:proofErr w:type="spellEnd"/>
-      <w:r>
-        <w:t xml:space="preserve"> des capteurs, de proposer les visualisations les plus pertinentes pour comprendre la consommation énergétique d'un bâtiment. Et pour chaque visualisation indiquer le type de graphique, les variables utilisées, l’objectif et l’interprétation attendue. </w:t>
+        <w:t xml:space="preserve">Créer un prompt permettant, à partir du dataset des capteurs, de proposer les visualisations les plus pertinentes pour comprendre la consommation énergétique d'un bâtiment. Et pour chaque visualisation indiquer le type de graphique, les variables utilisées, l’objectif et l’interprétation attendue. </w:t>
       </w:r>
     </w:p>
     <w:p>
@@ -3814,15 +3686,7 @@
         <w:ind w:right="0" w:hanging="338"/>
       </w:pPr>
       <w:r>
-        <w:t xml:space="preserve">Créer un prompt permettant, à partir du </w:t>
-      </w:r>
-      <w:proofErr w:type="spellStart"/>
-      <w:r>
-        <w:t>dataset</w:t>
-      </w:r>
-      <w:proofErr w:type="spellEnd"/>
-      <w:r>
-        <w:t xml:space="preserve"> des capteurs, de proposer plusieurs modèles adaptés à la prédiction de la consommation énergétique d'un bâtiment. Pour chaque modèle, le LLM doit indiquer le principe, les avantages, les limites, le type de problème et les métriques pertinentes. </w:t>
+        <w:t xml:space="preserve">Créer un prompt permettant, à partir du dataset des capteurs, de proposer plusieurs modèles adaptés à la prédiction de la consommation énergétique d'un bâtiment. Pour chaque modèle, le LLM doit indiquer le principe, les avantages, les limites, le type de problème et les métriques pertinentes. </w:t>
       </w:r>
     </w:p>
     <w:p>
@@ -3835,31 +3699,7 @@
         <w:ind w:right="0" w:hanging="338"/>
       </w:pPr>
       <w:r>
-        <w:t>Créer un prompt permettant d’expliquer les métriques de classification (</w:t>
-      </w:r>
-      <w:proofErr w:type="spellStart"/>
-      <w:r>
-        <w:t>Accuracy</w:t>
-      </w:r>
-      <w:proofErr w:type="spellEnd"/>
-      <w:r>
-        <w:t xml:space="preserve">, </w:t>
-      </w:r>
-      <w:proofErr w:type="spellStart"/>
-      <w:r>
-        <w:t>Precision</w:t>
-      </w:r>
-      <w:proofErr w:type="spellEnd"/>
-      <w:r>
-        <w:t xml:space="preserve">, </w:t>
-      </w:r>
-      <w:proofErr w:type="spellStart"/>
-      <w:r>
-        <w:t>Recall</w:t>
-      </w:r>
-      <w:proofErr w:type="spellEnd"/>
-      <w:r>
-        <w:t xml:space="preserve">, F1-score, ROC-AUC). Pour chacune, le LLM doit donner la définition, expliquer son interprétation, donner un exemple concret et indiquer dans quel contexte elle est particulièrement utile. </w:t>
+        <w:t xml:space="preserve">Créer un prompt permettant d’expliquer les métriques de classification (Accuracy, Precision, Recall, F1-score, ROC-AUC). Pour chacune, le LLM doit donner la définition, expliquer son interprétation, donner un exemple concret et indiquer dans quel contexte elle est particulièrement utile. </w:t>
       </w:r>
     </w:p>
     <w:p>
@@ -4064,16 +3904,8 @@
         <w:rPr>
           <w:sz w:val="19"/>
         </w:rPr>
-        <w:t>ai-</w:t>
-      </w:r>
-      <w:proofErr w:type="spellStart"/>
-      <w:r>
-        <w:rPr>
-          <w:sz w:val="19"/>
-        </w:rPr>
-        <w:t>business_assistant</w:t>
-      </w:r>
-      <w:proofErr w:type="spellEnd"/>
+        <w:t>ai-business_assistant</w:t>
+      </w:r>
       <w:r>
         <w:t xml:space="preserve"> contenant le fichier</w:t>
       </w:r>
@@ -4099,7 +3931,6 @@
         <w:ind w:left="-5"/>
       </w:pPr>
       <w:r>
-        <w:lastRenderedPageBreak/>
         <w:t xml:space="preserve">Modalité de livraison </w:t>
       </w:r>
     </w:p>
@@ -4125,15 +3956,7 @@
       </w:r>
       <w:proofErr w:type="gramEnd"/>
       <w:r>
-        <w:t xml:space="preserve"> le livrable, d’abord vide, sur un dépôt public de son compte </w:t>
-      </w:r>
-      <w:proofErr w:type="spellStart"/>
-      <w:r>
-        <w:t>Github</w:t>
-      </w:r>
-      <w:proofErr w:type="spellEnd"/>
-      <w:r>
-        <w:t xml:space="preserve"> personnel </w:t>
+        <w:t xml:space="preserve"> le livrable, d’abord vide, sur un dépôt public de son compte Github personnel </w:t>
       </w:r>
     </w:p>
     <w:p>
@@ -4154,9 +3977,9 @@
       </w:r>
     </w:p>
     <w:sectPr>
-      <w:footerReference w:type="even" r:id="rId20"/>
-      <w:footerReference w:type="default" r:id="rId21"/>
-      <w:footerReference w:type="first" r:id="rId22"/>
+      <w:footerReference w:type="even" r:id="rId21"/>
+      <w:footerReference w:type="default" r:id="rId22"/>
+      <w:footerReference w:type="first" r:id="rId23"/>
       <w:pgSz w:w="12240" w:h="15840"/>
       <w:pgMar w:top="1404" w:right="1892" w:bottom="1567" w:left="1872" w:header="720" w:footer="681" w:gutter="0"/>
       <w:cols w:space="720"/>

</xml_diff>

<commit_message>
prompt permettant, à partir du dataset des capteurs, de proposer des stratégies de preprocessing
</commit_message>
<xml_diff>
--- a/ai-business_assistant/atelier-prompt-engineering.docx
+++ b/ai-business_assistant/atelier-prompt-engineering.docx
@@ -31,7 +31,15 @@
         <w:jc w:val="both"/>
       </w:pPr>
       <w:r>
-        <w:t xml:space="preserve">Une entreprise souhaite mettre en place « AI Business Assistant », un assistant IA polyvalent capable d'aider ses collaborateurs à exploiter des documents, analyser des données, faire du machine learning et produire des résultats structurés. </w:t>
+        <w:t xml:space="preserve">Une entreprise souhaite mettre en place « AI Business Assistant », un assistant IA polyvalent capable d'aider ses collaborateurs à exploiter des documents, analyser des données, faire du machine </w:t>
+      </w:r>
+      <w:proofErr w:type="spellStart"/>
+      <w:r>
+        <w:t>learning</w:t>
+      </w:r>
+      <w:proofErr w:type="spellEnd"/>
+      <w:r>
+        <w:t xml:space="preserve"> et produire des résultats structurés. </w:t>
       </w:r>
       <w:r>
         <w:rPr>
@@ -918,7 +926,15 @@
         <w:pStyle w:val="NormalWeb"/>
       </w:pPr>
       <w:r>
-        <w:t>Par rapport à une demande vague comme « analyse ces retours clients », la décomposition en composantes apporte une structure exploitable (facile à réutiliser dans une application ou un rapport) plutôt qu'un texte libre difficile à parser, des contraintes explicites qui évitent les hallucinations et cadrent le raisonnement du modèle, et une réponse priorisée et actionnable, directement utile pour une équipe métier.</w:t>
+        <w:t xml:space="preserve">Par rapport à une demande vague comme « analyse ces retours clients », la décomposition en composantes apporte une structure exploitable (facile à réutiliser dans une application ou un rapport) plutôt qu'un texte libre difficile à </w:t>
+      </w:r>
+      <w:proofErr w:type="spellStart"/>
+      <w:r>
+        <w:t>parser</w:t>
+      </w:r>
+      <w:proofErr w:type="spellEnd"/>
+      <w:r>
+        <w:t>, des contraintes explicites qui évitent les hallucinations et cadrent le raisonnement du modèle, et une réponse priorisée et actionnable, directement utile pour une équipe métier.</w:t>
       </w:r>
     </w:p>
     <w:p>
@@ -938,7 +954,15 @@
         <w:ind w:left="-5"/>
       </w:pPr>
       <w:r>
-        <w:t xml:space="preserve">Partie 2 - Comparer les techniques de prompting </w:t>
+        <w:t xml:space="preserve">Partie 2 - Comparer les techniques de </w:t>
+      </w:r>
+      <w:proofErr w:type="spellStart"/>
+      <w:r>
+        <w:t>prompting</w:t>
+      </w:r>
+      <w:proofErr w:type="spellEnd"/>
+      <w:r>
+        <w:t xml:space="preserve"> </w:t>
       </w:r>
     </w:p>
     <w:p>
@@ -948,24 +972,21 @@
         <w:jc w:val="both"/>
       </w:pPr>
       <w:r>
-        <w:t xml:space="preserve">Tester puis évaluer les résultats obtenus avec les techniques zero-shot, one-shot, few-shot et un prompt structuré sur une demande du genre : </w:t>
-      </w:r>
-      <w:proofErr w:type="gramStart"/>
-      <w:r>
-        <w:t xml:space="preserve">«  </w:t>
+        <w:t xml:space="preserve">Tester puis évaluer les résultats obtenus avec les techniques </w:t>
+      </w:r>
+      <w:proofErr w:type="spellStart"/>
+      <w:r>
+        <w:t>zero</w:t>
+      </w:r>
+      <w:proofErr w:type="spellEnd"/>
+      <w:r>
+        <w:t xml:space="preserve">-shot, one-shot, few-shot et un prompt structuré sur une demande du genre : «  </w:t>
       </w:r>
       <w:r>
         <w:rPr>
           <w:sz w:val="17"/>
         </w:rPr>
-        <w:t>Classer</w:t>
-      </w:r>
-      <w:proofErr w:type="gramEnd"/>
-      <w:r>
-        <w:rPr>
-          <w:sz w:val="17"/>
-        </w:rPr>
-        <w:t xml:space="preserve"> le commentaire suivant : </w:t>
+        <w:t xml:space="preserve">Classer le commentaire suivant : </w:t>
       </w:r>
     </w:p>
     <w:p>
@@ -1001,7 +1022,21 @@
         <w:rPr>
           <w:rStyle w:val="lev"/>
         </w:rPr>
-        <w:t>1) Zero-shot</w:t>
+        <w:t xml:space="preserve">1) </w:t>
+      </w:r>
+      <w:proofErr w:type="spellStart"/>
+      <w:r>
+        <w:rPr>
+          <w:rStyle w:val="lev"/>
+        </w:rPr>
+        <w:t>Zero</w:t>
+      </w:r>
+      <w:proofErr w:type="spellEnd"/>
+      <w:r>
+        <w:rPr>
+          <w:rStyle w:val="lev"/>
+        </w:rPr>
+        <w:t>-shot</w:t>
       </w:r>
       <w:r>
         <w:t xml:space="preserve"> (aucun exemple, instruction directe)</w:t>
@@ -1280,8 +1315,20 @@
           <w:sz w:val="24"/>
           <w:szCs w:val="24"/>
         </w:rPr>
-        <w:t>Partie 2 – Comparer les techniques de prompting</w:t>
-      </w:r>
+        <w:t xml:space="preserve">Partie 2 – Comparer les techniques de </w:t>
+      </w:r>
+      <w:proofErr w:type="spellStart"/>
+      <w:r>
+        <w:rPr>
+          <w:b/>
+          <w:bCs/>
+          <w:color w:val="auto"/>
+          <w:sz w:val="24"/>
+          <w:szCs w:val="24"/>
+        </w:rPr>
+        <w:t>prompting</w:t>
+      </w:r>
+      <w:proofErr w:type="spellEnd"/>
     </w:p>
     <w:p>
       <w:pPr>
@@ -1315,13 +1362,23 @@
           <w:szCs w:val="24"/>
         </w:rPr>
       </w:pPr>
-      <w:r>
-        <w:rPr>
-          <w:color w:val="auto"/>
-          <w:sz w:val="24"/>
-          <w:szCs w:val="24"/>
-        </w:rPr>
-        <w:t>Zero-shot : Négatif. Le commentaire mentionne un point positif (« service rapide »), mais le problème récurrent de l'application (« plante régulièrement ») domine l'évaluation globale.</w:t>
+      <w:proofErr w:type="spellStart"/>
+      <w:r>
+        <w:rPr>
+          <w:color w:val="auto"/>
+          <w:sz w:val="24"/>
+          <w:szCs w:val="24"/>
+        </w:rPr>
+        <w:t>Zero</w:t>
+      </w:r>
+      <w:proofErr w:type="spellEnd"/>
+      <w:r>
+        <w:rPr>
+          <w:color w:val="auto"/>
+          <w:sz w:val="24"/>
+          <w:szCs w:val="24"/>
+        </w:rPr>
+        <w:t>-shot : Négatif. Le commentaire mentionne un point positif (« service rapide »), mais le problème récurrent de l'application (« plante régulièrement ») domine l'évaluation globale.</w:t>
       </w:r>
     </w:p>
     <w:p>
@@ -1437,25 +1494,25 @@
           <w:sz w:val="24"/>
           <w:szCs w:val="24"/>
         </w:rPr>
-        <w:t xml:space="preserve">La différence principale se situe dans le format de la réponse. Le prompt zero-shot, ne précisant aucune contrainte de format, a produit une réponse accompagnée d'une justification, ce qui la rend moins directement exploitable par une application (nécessite un post-traitement pour extraire la classe). Les prompts one-shot et few-shot, en donnant un exemple de sortie courte, ont amené le modèle à reproduire ce même format concis, sans instruction explicite sur le format attendu. Le prompt structuré est celui qui offre le meilleur contrôle : la contrainte explicite « </w:t>
-      </w:r>
-      <w:proofErr w:type="gramStart"/>
-      <w:r>
-        <w:rPr>
-          <w:color w:val="auto"/>
-          <w:sz w:val="24"/>
-          <w:szCs w:val="24"/>
-        </w:rPr>
-        <w:t>réponds</w:t>
-      </w:r>
-      <w:proofErr w:type="gramEnd"/>
-      <w:r>
-        <w:rPr>
-          <w:color w:val="auto"/>
-          <w:sz w:val="24"/>
-          <w:szCs w:val="24"/>
-        </w:rPr>
-        <w:t xml:space="preserve"> uniquement avec le nom de la classe, sans phrase supplémentaire » garantit une sortie strictement conforme, immédiatement utilisable par du code.</w:t>
+        <w:t xml:space="preserve">La différence principale se situe dans le format de la réponse. Le prompt </w:t>
+      </w:r>
+      <w:proofErr w:type="spellStart"/>
+      <w:r>
+        <w:rPr>
+          <w:color w:val="auto"/>
+          <w:sz w:val="24"/>
+          <w:szCs w:val="24"/>
+        </w:rPr>
+        <w:t>zero</w:t>
+      </w:r>
+      <w:proofErr w:type="spellEnd"/>
+      <w:r>
+        <w:rPr>
+          <w:color w:val="auto"/>
+          <w:sz w:val="24"/>
+          <w:szCs w:val="24"/>
+        </w:rPr>
+        <w:t>-shot, ne précisant aucune contrainte de format, a produit une réponse accompagnée d'une justification, ce qui la rend moins directement exploitable par une application (nécessite un post-traitement pour extraire la classe). Les prompts one-shot et few-shot, en donnant un exemple de sortie courte, ont amené le modèle à reproduire ce même format concis, sans instruction explicite sur le format attendu. Le prompt structuré est celui qui offre le meilleur contrôle : la contrainte explicite « réponds uniquement avec le nom de la classe, sans phrase supplémentaire » garantit une sortie strictement conforme, immédiatement utilisable par du code.</w:t>
       </w:r>
     </w:p>
     <w:p>
@@ -1474,7 +1531,25 @@
           <w:sz w:val="24"/>
           <w:szCs w:val="24"/>
         </w:rPr>
-        <w:t>En résumé : le few-shot améliore la cohérence du format par imitation des exemples, mais seul le prompt structuré garantit ce format de manière fiable et explicite, ce qui en fait le plus adapté à un usage en application métier (où la sortie doit être parsée automatiquement).</w:t>
+        <w:t xml:space="preserve">En résumé : le few-shot améliore la cohérence du format par imitation des exemples, mais seul le prompt structuré garantit ce format de manière fiable et explicite, ce qui en fait le plus adapté à un usage en application métier (où la sortie doit être </w:t>
+      </w:r>
+      <w:proofErr w:type="spellStart"/>
+      <w:r>
+        <w:rPr>
+          <w:color w:val="auto"/>
+          <w:sz w:val="24"/>
+          <w:szCs w:val="24"/>
+        </w:rPr>
+        <w:t>parsée</w:t>
+      </w:r>
+      <w:proofErr w:type="spellEnd"/>
+      <w:r>
+        <w:rPr>
+          <w:color w:val="auto"/>
+          <w:sz w:val="24"/>
+          <w:szCs w:val="24"/>
+        </w:rPr>
+        <w:t xml:space="preserve"> automatiquement).</w:t>
       </w:r>
     </w:p>
     <w:p>
@@ -1526,18 +1601,10 @@
         <w:t xml:space="preserve">Ce prompt mélange </w:t>
       </w:r>
       <w:r>
-        <w:t xml:space="preserve">3 </w:t>
-      </w:r>
-      <w:proofErr w:type="gramStart"/>
-      <w:r>
-        <w:t>taches</w:t>
-      </w:r>
-      <w:r>
-        <w:t xml:space="preserve"> .</w:t>
-      </w:r>
-      <w:proofErr w:type="gramEnd"/>
-      <w:r>
-        <w:t xml:space="preserve"> On les sépare</w:t>
+        <w:t>3 taches</w:t>
+      </w:r>
+      <w:r>
+        <w:t xml:space="preserve"> . On les sépare</w:t>
       </w:r>
       <w:r>
         <w:t> :</w:t>
@@ -1624,11 +1691,33 @@
       <w:r>
         <w:t xml:space="preserve">C'est la technique du </w:t>
       </w:r>
+      <w:proofErr w:type="spellStart"/>
       <w:r>
         <w:rPr>
           <w:rStyle w:val="lev"/>
         </w:rPr>
-        <w:t>chain-of-thought guidé / décomposition en étapes</w:t>
+        <w:t>chain</w:t>
+      </w:r>
+      <w:proofErr w:type="spellEnd"/>
+      <w:r>
+        <w:rPr>
+          <w:rStyle w:val="lev"/>
+        </w:rPr>
+        <w:t>-of-</w:t>
+      </w:r>
+      <w:proofErr w:type="spellStart"/>
+      <w:r>
+        <w:rPr>
+          <w:rStyle w:val="lev"/>
+        </w:rPr>
+        <w:t>thought</w:t>
+      </w:r>
+      <w:proofErr w:type="spellEnd"/>
+      <w:r>
+        <w:rPr>
+          <w:rStyle w:val="lev"/>
+        </w:rPr>
+        <w:t xml:space="preserve"> guidé / décomposition en étapes</w:t>
       </w:r>
       <w:r>
         <w:t xml:space="preserve"> : au lieu de demander un raisonnement complexe en une seule fois, on force le modèle à suivre un chemin logique explicite, ce qui réduit les oublis et améliore la cohérence de la réponse finale.</w:t>
@@ -2157,12 +2246,14 @@
       <w:r>
         <w:t xml:space="preserve">, </w:t>
       </w:r>
+      <w:proofErr w:type="spellStart"/>
       <w:r>
         <w:rPr>
           <w:sz w:val="17"/>
         </w:rPr>
         <w:t>categorie</w:t>
       </w:r>
+      <w:proofErr w:type="spellEnd"/>
       <w:r>
         <w:t xml:space="preserve">, </w:t>
       </w:r>
@@ -2175,12 +2266,14 @@
       <w:r>
         <w:t xml:space="preserve">, </w:t>
       </w:r>
+      <w:proofErr w:type="spellStart"/>
       <w:r>
         <w:rPr>
           <w:sz w:val="17"/>
         </w:rPr>
         <w:t>probleme</w:t>
       </w:r>
+      <w:proofErr w:type="spellEnd"/>
       <w:r>
         <w:t xml:space="preserve">, </w:t>
       </w:r>
@@ -2224,21 +2317,21 @@
         <w:rPr>
           <w:sz w:val="17"/>
         </w:rPr>
-        <w:t xml:space="preserve">  "sentiment</w:t>
-      </w:r>
-      <w:proofErr w:type="gramStart"/>
+        <w:t xml:space="preserve">  "sentiment": "</w:t>
+      </w:r>
+      <w:proofErr w:type="spellStart"/>
       <w:r>
         <w:rPr>
           <w:sz w:val="17"/>
         </w:rPr>
-        <w:t>":</w:t>
-      </w:r>
-      <w:proofErr w:type="gramEnd"/>
+        <w:t>negatif</w:t>
+      </w:r>
+      <w:proofErr w:type="spellEnd"/>
       <w:r>
         <w:rPr>
           <w:sz w:val="17"/>
         </w:rPr>
-        <w:t xml:space="preserve"> "negatif", </w:t>
+        <w:t xml:space="preserve">", </w:t>
       </w:r>
     </w:p>
     <w:p>
@@ -2250,21 +2343,21 @@
         <w:rPr>
           <w:sz w:val="17"/>
         </w:rPr>
-        <w:t xml:space="preserve">  "categorie</w:t>
-      </w:r>
-      <w:proofErr w:type="gramStart"/>
+        <w:t xml:space="preserve">  "</w:t>
+      </w:r>
+      <w:proofErr w:type="spellStart"/>
       <w:r>
         <w:rPr>
           <w:sz w:val="17"/>
         </w:rPr>
-        <w:t>":</w:t>
-      </w:r>
-      <w:proofErr w:type="gramEnd"/>
+        <w:t>categorie</w:t>
+      </w:r>
+      <w:proofErr w:type="spellEnd"/>
       <w:r>
         <w:rPr>
           <w:sz w:val="17"/>
         </w:rPr>
-        <w:t xml:space="preserve"> "livraison", </w:t>
+        <w:t xml:space="preserve">": "livraison", </w:t>
       </w:r>
     </w:p>
     <w:p>
@@ -2276,21 +2369,7 @@
         <w:rPr>
           <w:sz w:val="17"/>
         </w:rPr>
-        <w:t xml:space="preserve">  "urgence</w:t>
-      </w:r>
-      <w:proofErr w:type="gramStart"/>
-      <w:r>
-        <w:rPr>
-          <w:sz w:val="17"/>
-        </w:rPr>
-        <w:t>":</w:t>
-      </w:r>
-      <w:proofErr w:type="gramEnd"/>
-      <w:r>
-        <w:rPr>
-          <w:sz w:val="17"/>
-        </w:rPr>
-        <w:t xml:space="preserve"> "moyenne", </w:t>
+        <w:t xml:space="preserve">  "urgence": "moyenne", </w:t>
       </w:r>
     </w:p>
     <w:p>
@@ -2302,21 +2381,21 @@
         <w:rPr>
           <w:sz w:val="17"/>
         </w:rPr>
-        <w:t xml:space="preserve">  "probleme</w:t>
-      </w:r>
-      <w:proofErr w:type="gramStart"/>
+        <w:t xml:space="preserve">  "</w:t>
+      </w:r>
+      <w:proofErr w:type="spellStart"/>
       <w:r>
         <w:rPr>
           <w:sz w:val="17"/>
         </w:rPr>
-        <w:t>":</w:t>
-      </w:r>
-      <w:proofErr w:type="gramEnd"/>
+        <w:t>probleme</w:t>
+      </w:r>
+      <w:proofErr w:type="spellEnd"/>
       <w:r>
         <w:rPr>
           <w:sz w:val="17"/>
         </w:rPr>
-        <w:t xml:space="preserve"> "Retard de livraison", </w:t>
+        <w:t xml:space="preserve">": "Retard de livraison", </w:t>
       </w:r>
     </w:p>
     <w:p>
@@ -2328,21 +2407,7 @@
         <w:rPr>
           <w:sz w:val="17"/>
         </w:rPr>
-        <w:t xml:space="preserve">  "confiance</w:t>
-      </w:r>
-      <w:proofErr w:type="gramStart"/>
-      <w:r>
-        <w:rPr>
-          <w:sz w:val="17"/>
-        </w:rPr>
-        <w:t>":</w:t>
-      </w:r>
-      <w:proofErr w:type="gramEnd"/>
-      <w:r>
-        <w:rPr>
-          <w:sz w:val="17"/>
-        </w:rPr>
-        <w:t xml:space="preserve"> 0.91 </w:t>
+        <w:t xml:space="preserve">  "confiance": 0.91 </w:t>
       </w:r>
     </w:p>
     <w:p>
@@ -2429,7 +2494,15 @@
         <w:ind w:right="0" w:hanging="338"/>
       </w:pPr>
       <w:r>
-        <w:t xml:space="preserve">Ajouter une validation en définissant les règles de sortie suivantes : format JSON valide ; aucune propriété supplémentaire ; sentiment vaut positif, negatif ou neutre ; confiance est compris entre 0 et 1 ; urgence vaut faible, moyenne ou élevée. </w:t>
+        <w:t xml:space="preserve">Ajouter une validation en définissant les règles de sortie suivantes : format JSON valide ; aucune propriété supplémentaire ; sentiment vaut positif, </w:t>
+      </w:r>
+      <w:proofErr w:type="spellStart"/>
+      <w:r>
+        <w:t>negatif</w:t>
+      </w:r>
+      <w:proofErr w:type="spellEnd"/>
+      <w:r>
+        <w:t xml:space="preserve"> ou neutre ; confiance est compris entre 0 et 1 ; urgence vaut faible, moyenne ou élevée. </w:t>
       </w:r>
     </w:p>
     <w:p>
@@ -2455,13 +2528,16 @@
         <w:spacing w:after="160"/>
         <w:ind w:left="664" w:right="0" w:firstLine="0"/>
       </w:pPr>
-      <w:proofErr w:type="gramStart"/>
-      <w:r>
-        <w:t>sentiment</w:t>
-      </w:r>
-      <w:proofErr w:type="gramEnd"/>
-      <w:r>
-        <w:t xml:space="preserve"> : texte, valeur parmi positif, negatif, neutre</w:t>
+      <w:r>
+        <w:t xml:space="preserve">sentiment : texte, valeur parmi positif, </w:t>
+      </w:r>
+      <w:proofErr w:type="spellStart"/>
+      <w:r>
+        <w:t>negatif</w:t>
+      </w:r>
+      <w:proofErr w:type="spellEnd"/>
+      <w:r>
+        <w:t>, neutre</w:t>
       </w:r>
     </w:p>
     <w:p>
@@ -2469,11 +2545,11 @@
         <w:spacing w:after="160"/>
         <w:ind w:left="664" w:right="0" w:firstLine="0"/>
       </w:pPr>
-      <w:proofErr w:type="gramStart"/>
+      <w:proofErr w:type="spellStart"/>
       <w:r>
         <w:t>categorie</w:t>
       </w:r>
-      <w:proofErr w:type="gramEnd"/>
+      <w:proofErr w:type="spellEnd"/>
       <w:r>
         <w:t xml:space="preserve"> : texte décrivant le thème principal du commentaire, par exemple livraison, produit, service, application</w:t>
       </w:r>
@@ -2483,13 +2559,8 @@
         <w:spacing w:after="160"/>
         <w:ind w:left="664" w:right="0" w:firstLine="0"/>
       </w:pPr>
-      <w:proofErr w:type="gramStart"/>
-      <w:r>
-        <w:t>urgence</w:t>
-      </w:r>
-      <w:proofErr w:type="gramEnd"/>
-      <w:r>
-        <w:t xml:space="preserve"> : texte, valeur parmi faible, moyenne, élevée</w:t>
+      <w:r>
+        <w:t>urgence : texte, valeur parmi faible, moyenne, élevée</w:t>
       </w:r>
     </w:p>
     <w:p>
@@ -2497,11 +2568,11 @@
         <w:spacing w:after="160"/>
         <w:ind w:left="664" w:right="0" w:firstLine="0"/>
       </w:pPr>
-      <w:proofErr w:type="gramStart"/>
+      <w:proofErr w:type="spellStart"/>
       <w:r>
         <w:t>probleme</w:t>
       </w:r>
-      <w:proofErr w:type="gramEnd"/>
+      <w:proofErr w:type="spellEnd"/>
       <w:r>
         <w:t xml:space="preserve"> : texte résumant le problème principal en une courte phrase</w:t>
       </w:r>
@@ -2511,13 +2582,8 @@
         <w:spacing w:after="160"/>
         <w:ind w:left="664" w:right="0" w:firstLine="0"/>
       </w:pPr>
-      <w:proofErr w:type="gramStart"/>
-      <w:r>
-        <w:t>confiance</w:t>
-      </w:r>
-      <w:proofErr w:type="gramEnd"/>
-      <w:r>
-        <w:t xml:space="preserve"> : nombre décimal entre 0 et 1 représentant le niveau de certitude de l'analyse</w:t>
+      <w:r>
+        <w:t>confiance : nombre décimal entre 0 et 1 représentant le niveau de certitude de l'analyse</w:t>
       </w:r>
     </w:p>
     <w:p>
@@ -2557,7 +2623,23 @@
       </w:pPr>
       <w:r>
         <w:lastRenderedPageBreak/>
-        <w:t>Aucune propriété supplémentaire ne doit être ajoutée en dehors de sentiment, categorie, urgence, probleme, confiance</w:t>
+        <w:t xml:space="preserve">Aucune propriété supplémentaire ne doit être ajoutée en dehors de sentiment, </w:t>
+      </w:r>
+      <w:proofErr w:type="spellStart"/>
+      <w:r>
+        <w:t>categorie</w:t>
+      </w:r>
+      <w:proofErr w:type="spellEnd"/>
+      <w:r>
+        <w:t xml:space="preserve">, urgence, </w:t>
+      </w:r>
+      <w:proofErr w:type="spellStart"/>
+      <w:r>
+        <w:t>probleme</w:t>
+      </w:r>
+      <w:proofErr w:type="spellEnd"/>
+      <w:r>
+        <w:t>, confiance</w:t>
       </w:r>
     </w:p>
     <w:p>
@@ -2566,7 +2648,15 @@
         <w:ind w:left="664" w:right="0" w:firstLine="0"/>
       </w:pPr>
       <w:r>
-        <w:t>Le champ sentiment doit valoir uniquement positif, negatif ou neutre</w:t>
+        <w:t xml:space="preserve">Le champ sentiment doit valoir uniquement positif, </w:t>
+      </w:r>
+      <w:proofErr w:type="spellStart"/>
+      <w:r>
+        <w:t>negatif</w:t>
+      </w:r>
+      <w:proofErr w:type="spellEnd"/>
+      <w:r>
+        <w:t xml:space="preserve"> ou neutre</w:t>
       </w:r>
     </w:p>
     <w:p>
@@ -2848,16 +2938,11 @@
       <w:r>
         <w:t xml:space="preserve"> </w:t>
       </w:r>
-      <w:proofErr w:type="gramStart"/>
       <w:r>
         <w:t>t</w:t>
       </w:r>
       <w:r>
-        <w:t>raduis</w:t>
-      </w:r>
-      <w:proofErr w:type="gramEnd"/>
-      <w:r>
-        <w:t xml:space="preserve"> le document suivant du français vers l'anglais en respectant les contraintes ci-dessous :</w:t>
+        <w:t>raduis le document suivant du français vers l'anglais en respectant les contraintes ci-dessous :</w:t>
       </w:r>
     </w:p>
     <w:p>
@@ -3038,22 +3123,16 @@
         <w:ind w:right="0" w:hanging="338"/>
       </w:pPr>
       <w:r>
-        <w:t xml:space="preserve">Créer un prompt permettant de classer un ticket informatique dans une catégorie (réseau, </w:t>
-      </w:r>
-      <w:proofErr w:type="gramStart"/>
-      <w:r>
-        <w:t>logiciel</w:t>
-      </w:r>
-      <w:proofErr w:type="gramEnd"/>
-      <w:r>
-        <w:t xml:space="preserve">, matériel, sécurité, accès, autre). La réponse est au format JSON avec les champs </w:t>
-      </w:r>
+        <w:t xml:space="preserve">Créer un prompt permettant de classer un ticket informatique dans une catégorie (réseau, logiciel, matériel, sécurité, accès, autre). La réponse est au format JSON avec les champs </w:t>
+      </w:r>
+      <w:proofErr w:type="spellStart"/>
       <w:r>
         <w:rPr>
           <w:sz w:val="17"/>
         </w:rPr>
         <w:t>categorie</w:t>
       </w:r>
+      <w:proofErr w:type="spellEnd"/>
       <w:r>
         <w:t xml:space="preserve"> et </w:t>
       </w:r>
@@ -3130,14 +3209,40 @@
         <w:ind w:left="664" w:right="0" w:firstLine="0"/>
       </w:pPr>
       <w:r>
-        <w:t xml:space="preserve">Créer un prompt permettant d’extraire, à partir d’une facture, les infos (numéro_facture, date, client, montant_ht, tva, montant_ttc). Retourner uniquement un JSON valide avec </w:t>
-      </w:r>
+        <w:t>Créer un prompt permettant d’extraire, à partir d’une facture, les infos (</w:t>
+      </w:r>
+      <w:proofErr w:type="spellStart"/>
+      <w:r>
+        <w:t>numéro_facture</w:t>
+      </w:r>
+      <w:proofErr w:type="spellEnd"/>
+      <w:r>
+        <w:t xml:space="preserve">, date, client, </w:t>
+      </w:r>
+      <w:proofErr w:type="spellStart"/>
+      <w:r>
+        <w:t>montant_ht</w:t>
+      </w:r>
+      <w:proofErr w:type="spellEnd"/>
+      <w:r>
+        <w:t xml:space="preserve">, tva, </w:t>
+      </w:r>
+      <w:proofErr w:type="spellStart"/>
+      <w:r>
+        <w:t>montant_ttc</w:t>
+      </w:r>
+      <w:proofErr w:type="spellEnd"/>
+      <w:r>
+        <w:t xml:space="preserve">). Retourner uniquement un JSON valide avec </w:t>
+      </w:r>
+      <w:proofErr w:type="spellStart"/>
       <w:r>
         <w:rPr>
           <w:sz w:val="17"/>
         </w:rPr>
         <w:t>null</w:t>
       </w:r>
+      <w:proofErr w:type="spellEnd"/>
       <w:r>
         <w:t xml:space="preserve"> si une info est absente </w:t>
       </w:r>
@@ -3159,13 +3264,13 @@
       <w:pPr>
         <w:ind w:left="664" w:right="0" w:firstLine="0"/>
       </w:pPr>
-      <w:proofErr w:type="gramStart"/>
-      <w:r>
-        <w:t>numero</w:t>
-      </w:r>
-      <w:proofErr w:type="gramEnd"/>
-      <w:r>
-        <w:t>_facture : texte</w:t>
+      <w:proofErr w:type="spellStart"/>
+      <w:r>
+        <w:t>numero_facture</w:t>
+      </w:r>
+      <w:proofErr w:type="spellEnd"/>
+      <w:r>
+        <w:t xml:space="preserve"> : texte</w:t>
       </w:r>
     </w:p>
     <w:p>
@@ -3177,13 +3282,8 @@
       <w:pPr>
         <w:ind w:left="664" w:right="0" w:firstLine="0"/>
       </w:pPr>
-      <w:proofErr w:type="gramStart"/>
-      <w:r>
-        <w:t>date</w:t>
-      </w:r>
-      <w:proofErr w:type="gramEnd"/>
-      <w:r>
-        <w:t xml:space="preserve"> : texte au format JJ/MM/AAAA</w:t>
+      <w:r>
+        <w:t>date : texte au format JJ/MM/AAAA</w:t>
       </w:r>
     </w:p>
     <w:p>
@@ -3195,13 +3295,8 @@
       <w:pPr>
         <w:ind w:left="664" w:right="0" w:firstLine="0"/>
       </w:pPr>
-      <w:proofErr w:type="gramStart"/>
-      <w:r>
-        <w:t>client</w:t>
-      </w:r>
-      <w:proofErr w:type="gramEnd"/>
-      <w:r>
-        <w:t xml:space="preserve"> : texte</w:t>
+      <w:r>
+        <w:t>client : texte</w:t>
       </w:r>
     </w:p>
     <w:p>
@@ -3213,13 +3308,13 @@
       <w:pPr>
         <w:ind w:left="664" w:right="0" w:firstLine="0"/>
       </w:pPr>
-      <w:proofErr w:type="gramStart"/>
-      <w:r>
-        <w:t>montant</w:t>
-      </w:r>
-      <w:proofErr w:type="gramEnd"/>
-      <w:r>
-        <w:t>_ht : nombre décimal</w:t>
+      <w:proofErr w:type="spellStart"/>
+      <w:r>
+        <w:t>montant_ht</w:t>
+      </w:r>
+      <w:proofErr w:type="spellEnd"/>
+      <w:r>
+        <w:t xml:space="preserve"> : nombre décimal</w:t>
       </w:r>
     </w:p>
     <w:p>
@@ -3231,11 +3326,24 @@
       <w:pPr>
         <w:ind w:left="664" w:right="0" w:firstLine="0"/>
       </w:pPr>
-      <w:proofErr w:type="gramStart"/>
-      <w:r>
-        <w:t>tva</w:t>
-      </w:r>
-      <w:proofErr w:type="gramEnd"/>
+      <w:r>
+        <w:t>tva : nombre décimal</w:t>
+      </w:r>
+    </w:p>
+    <w:p>
+      <w:pPr>
+        <w:ind w:left="664" w:right="0" w:firstLine="0"/>
+      </w:pPr>
+    </w:p>
+    <w:p>
+      <w:pPr>
+        <w:ind w:left="664" w:right="0" w:firstLine="0"/>
+      </w:pPr>
+      <w:proofErr w:type="spellStart"/>
+      <w:r>
+        <w:t>montant_ttc</w:t>
+      </w:r>
+      <w:proofErr w:type="spellEnd"/>
       <w:r>
         <w:t xml:space="preserve"> : nombre décimal</w:t>
       </w:r>
@@ -3249,26 +3357,16 @@
       <w:pPr>
         <w:ind w:left="664" w:right="0" w:firstLine="0"/>
       </w:pPr>
-      <w:proofErr w:type="gramStart"/>
-      <w:r>
-        <w:t>montant</w:t>
-      </w:r>
-      <w:proofErr w:type="gramEnd"/>
-      <w:r>
-        <w:t>_ttc : nombre décimal</w:t>
-      </w:r>
-    </w:p>
-    <w:p>
-      <w:pPr>
-        <w:ind w:left="664" w:right="0" w:firstLine="0"/>
-      </w:pPr>
-    </w:p>
-    <w:p>
-      <w:pPr>
-        <w:ind w:left="664" w:right="0" w:firstLine="0"/>
-      </w:pPr>
-      <w:r>
-        <w:t>Si une information est absente du document, indique null pour le champ correspondant. Ne retourne rien d'autre que le JSON.</w:t>
+      <w:r>
+        <w:t xml:space="preserve">Si une information est absente du document, indique </w:t>
+      </w:r>
+      <w:proofErr w:type="spellStart"/>
+      <w:r>
+        <w:t>null</w:t>
+      </w:r>
+      <w:proofErr w:type="spellEnd"/>
+      <w:r>
+        <w:t xml:space="preserve"> pour le champ correspondant. Ne retourne rien d'autre que le JSON.</w:t>
       </w:r>
     </w:p>
     <w:p>
@@ -3625,8 +3723,6 @@
           </wp:inline>
         </w:drawing>
       </w:r>
-      <w:bookmarkStart w:id="0" w:name="_GoBack"/>
-      <w:bookmarkEnd w:id="0"/>
     </w:p>
     <w:p>
       <w:pPr>
@@ -3642,12 +3738,20 @@
           <w:lang w:val="en-CA"/>
         </w:rPr>
       </w:pPr>
+      <w:proofErr w:type="spellStart"/>
       <w:r>
         <w:rPr>
           <w:lang w:val="en-CA"/>
         </w:rPr>
         <w:lastRenderedPageBreak/>
-        <w:t xml:space="preserve">Partie 6 – Prompt Engineering pour le Machine Learning </w:t>
+        <w:t>Partie</w:t>
+      </w:r>
+      <w:proofErr w:type="spellEnd"/>
+      <w:r>
+        <w:rPr>
+          <w:lang w:val="en-CA"/>
+        </w:rPr>
+        <w:t xml:space="preserve"> 6 – Prompt Engineering pour le Machine Learning </w:t>
       </w:r>
     </w:p>
     <w:p>
@@ -3660,7 +3764,267 @@
         <w:ind w:right="0" w:hanging="338"/>
       </w:pPr>
       <w:r>
-        <w:t xml:space="preserve">Créer un prompt permettant, à partir du dataset des capteurs, de proposer des stratégies (détection, traitement, risques associés) de traitement des valeurs manquantes, des doublons, des valeurs aberrantes, des variables catégorielles </w:t>
+        <w:t xml:space="preserve">Créer un prompt permettant, à partir du </w:t>
+      </w:r>
+      <w:proofErr w:type="spellStart"/>
+      <w:r>
+        <w:t>dataset</w:t>
+      </w:r>
+      <w:proofErr w:type="spellEnd"/>
+      <w:r>
+        <w:t xml:space="preserve"> des capteurs, de proposer des stratégies (détection, traitement, risques associés) de traitement des valeurs manquantes, des doublons, des valeurs aberrantes, des variables catégorielles </w:t>
+      </w:r>
+    </w:p>
+    <w:p>
+      <w:pPr>
+        <w:spacing w:after="122"/>
+        <w:ind w:left="664" w:right="0" w:firstLine="0"/>
+      </w:pPr>
+      <w:r>
+        <w:rPr>
+          <w:noProof/>
+        </w:rPr>
+        <w:drawing>
+          <wp:inline distT="0" distB="0" distL="0" distR="0" wp14:anchorId="61EAD8B8" wp14:editId="25E81A10">
+            <wp:extent cx="5382260" cy="3317240"/>
+            <wp:effectExtent l="0" t="0" r="8890" b="0"/>
+            <wp:docPr id="15" name="Image 15"/>
+            <wp:cNvGraphicFramePr>
+              <a:graphicFrameLocks xmlns:a="http://schemas.openxmlformats.org/drawingml/2006/main" noChangeAspect="1"/>
+            </wp:cNvGraphicFramePr>
+            <a:graphic xmlns:a="http://schemas.openxmlformats.org/drawingml/2006/main">
+              <a:graphicData uri="http://schemas.openxmlformats.org/drawingml/2006/picture">
+                <pic:pic xmlns:pic="http://schemas.openxmlformats.org/drawingml/2006/picture">
+                  <pic:nvPicPr>
+                    <pic:cNvPr id="15" name="Capture d'écran 2026-09-10 104103.png"/>
+                    <pic:cNvPicPr/>
+                  </pic:nvPicPr>
+                  <pic:blipFill>
+                    <a:blip r:embed="rId21">
+                      <a:extLst>
+                        <a:ext uri="{28A0092B-C50C-407E-A947-70E740481C1C}">
+                          <a14:useLocalDpi xmlns:a14="http://schemas.microsoft.com/office/drawing/2010/main" val="0"/>
+                        </a:ext>
+                      </a:extLst>
+                    </a:blip>
+                    <a:stretch>
+                      <a:fillRect/>
+                    </a:stretch>
+                  </pic:blipFill>
+                  <pic:spPr>
+                    <a:xfrm>
+                      <a:off x="0" y="0"/>
+                      <a:ext cx="5382260" cy="3317240"/>
+                    </a:xfrm>
+                    <a:prstGeom prst="rect">
+                      <a:avLst/>
+                    </a:prstGeom>
+                  </pic:spPr>
+                </pic:pic>
+              </a:graphicData>
+            </a:graphic>
+          </wp:inline>
+        </w:drawing>
+      </w:r>
+    </w:p>
+    <w:p>
+      <w:pPr>
+        <w:spacing w:after="122"/>
+        <w:ind w:left="664" w:right="0" w:firstLine="0"/>
+      </w:pPr>
+      <w:r>
+        <w:rPr>
+          <w:noProof/>
+        </w:rPr>
+        <w:lastRenderedPageBreak/>
+        <w:drawing>
+          <wp:inline distT="0" distB="0" distL="0" distR="0" wp14:anchorId="7556E515" wp14:editId="77362F77">
+            <wp:extent cx="5382260" cy="4427855"/>
+            <wp:effectExtent l="0" t="0" r="8890" b="0"/>
+            <wp:docPr id="19" name="Image 19"/>
+            <wp:cNvGraphicFramePr>
+              <a:graphicFrameLocks xmlns:a="http://schemas.openxmlformats.org/drawingml/2006/main" noChangeAspect="1"/>
+            </wp:cNvGraphicFramePr>
+            <a:graphic xmlns:a="http://schemas.openxmlformats.org/drawingml/2006/main">
+              <a:graphicData uri="http://schemas.openxmlformats.org/drawingml/2006/picture">
+                <pic:pic xmlns:pic="http://schemas.openxmlformats.org/drawingml/2006/picture">
+                  <pic:nvPicPr>
+                    <pic:cNvPr id="19" name="Capture d'écran 2026-09-10 104216.png"/>
+                    <pic:cNvPicPr/>
+                  </pic:nvPicPr>
+                  <pic:blipFill>
+                    <a:blip r:embed="rId22">
+                      <a:extLst>
+                        <a:ext uri="{28A0092B-C50C-407E-A947-70E740481C1C}">
+                          <a14:useLocalDpi xmlns:a14="http://schemas.microsoft.com/office/drawing/2010/main" val="0"/>
+                        </a:ext>
+                      </a:extLst>
+                    </a:blip>
+                    <a:stretch>
+                      <a:fillRect/>
+                    </a:stretch>
+                  </pic:blipFill>
+                  <pic:spPr>
+                    <a:xfrm>
+                      <a:off x="0" y="0"/>
+                      <a:ext cx="5382260" cy="4427855"/>
+                    </a:xfrm>
+                    <a:prstGeom prst="rect">
+                      <a:avLst/>
+                    </a:prstGeom>
+                  </pic:spPr>
+                </pic:pic>
+              </a:graphicData>
+            </a:graphic>
+          </wp:inline>
+        </w:drawing>
+      </w:r>
+    </w:p>
+    <w:p>
+      <w:pPr>
+        <w:spacing w:after="122"/>
+        <w:ind w:left="664" w:right="0" w:firstLine="0"/>
+      </w:pPr>
+      <w:r>
+        <w:rPr>
+          <w:noProof/>
+        </w:rPr>
+        <w:lastRenderedPageBreak/>
+        <w:drawing>
+          <wp:inline distT="0" distB="0" distL="0" distR="0" wp14:anchorId="66C5CCA3" wp14:editId="008AA5D9">
+            <wp:extent cx="5382260" cy="3371215"/>
+            <wp:effectExtent l="0" t="0" r="8890" b="635"/>
+            <wp:docPr id="16" name="Image 16"/>
+            <wp:cNvGraphicFramePr>
+              <a:graphicFrameLocks xmlns:a="http://schemas.openxmlformats.org/drawingml/2006/main" noChangeAspect="1"/>
+            </wp:cNvGraphicFramePr>
+            <a:graphic xmlns:a="http://schemas.openxmlformats.org/drawingml/2006/main">
+              <a:graphicData uri="http://schemas.openxmlformats.org/drawingml/2006/picture">
+                <pic:pic xmlns:pic="http://schemas.openxmlformats.org/drawingml/2006/picture">
+                  <pic:nvPicPr>
+                    <pic:cNvPr id="16" name="Capture d'écran 2026-09-10 104226.png"/>
+                    <pic:cNvPicPr/>
+                  </pic:nvPicPr>
+                  <pic:blipFill>
+                    <a:blip r:embed="rId23">
+                      <a:extLst>
+                        <a:ext uri="{28A0092B-C50C-407E-A947-70E740481C1C}">
+                          <a14:useLocalDpi xmlns:a14="http://schemas.microsoft.com/office/drawing/2010/main" val="0"/>
+                        </a:ext>
+                      </a:extLst>
+                    </a:blip>
+                    <a:stretch>
+                      <a:fillRect/>
+                    </a:stretch>
+                  </pic:blipFill>
+                  <pic:spPr>
+                    <a:xfrm>
+                      <a:off x="0" y="0"/>
+                      <a:ext cx="5382260" cy="3371215"/>
+                    </a:xfrm>
+                    <a:prstGeom prst="rect">
+                      <a:avLst/>
+                    </a:prstGeom>
+                  </pic:spPr>
+                </pic:pic>
+              </a:graphicData>
+            </a:graphic>
+          </wp:inline>
+        </w:drawing>
+      </w:r>
+      <w:r>
+        <w:rPr>
+          <w:noProof/>
+        </w:rPr>
+        <w:lastRenderedPageBreak/>
+        <w:drawing>
+          <wp:inline distT="0" distB="0" distL="0" distR="0" wp14:anchorId="0C39D634" wp14:editId="1257C656">
+            <wp:extent cx="5382260" cy="5127625"/>
+            <wp:effectExtent l="0" t="0" r="8890" b="0"/>
+            <wp:docPr id="17" name="Image 17"/>
+            <wp:cNvGraphicFramePr>
+              <a:graphicFrameLocks xmlns:a="http://schemas.openxmlformats.org/drawingml/2006/main" noChangeAspect="1"/>
+            </wp:cNvGraphicFramePr>
+            <a:graphic xmlns:a="http://schemas.openxmlformats.org/drawingml/2006/main">
+              <a:graphicData uri="http://schemas.openxmlformats.org/drawingml/2006/picture">
+                <pic:pic xmlns:pic="http://schemas.openxmlformats.org/drawingml/2006/picture">
+                  <pic:nvPicPr>
+                    <pic:cNvPr id="17" name="Capture d'écran 2026-09-10 104342.png"/>
+                    <pic:cNvPicPr/>
+                  </pic:nvPicPr>
+                  <pic:blipFill>
+                    <a:blip r:embed="rId24">
+                      <a:extLst>
+                        <a:ext uri="{28A0092B-C50C-407E-A947-70E740481C1C}">
+                          <a14:useLocalDpi xmlns:a14="http://schemas.microsoft.com/office/drawing/2010/main" val="0"/>
+                        </a:ext>
+                      </a:extLst>
+                    </a:blip>
+                    <a:stretch>
+                      <a:fillRect/>
+                    </a:stretch>
+                  </pic:blipFill>
+                  <pic:spPr>
+                    <a:xfrm>
+                      <a:off x="0" y="0"/>
+                      <a:ext cx="5382260" cy="5127625"/>
+                    </a:xfrm>
+                    <a:prstGeom prst="rect">
+                      <a:avLst/>
+                    </a:prstGeom>
+                  </pic:spPr>
+                </pic:pic>
+              </a:graphicData>
+            </a:graphic>
+          </wp:inline>
+        </w:drawing>
+      </w:r>
+      <w:r>
+        <w:rPr>
+          <w:noProof/>
+        </w:rPr>
+        <w:lastRenderedPageBreak/>
+        <w:drawing>
+          <wp:inline distT="0" distB="0" distL="0" distR="0" wp14:anchorId="43AE2A10" wp14:editId="2DED1739">
+            <wp:extent cx="5382260" cy="4570730"/>
+            <wp:effectExtent l="0" t="0" r="8890" b="1270"/>
+            <wp:docPr id="18" name="Image 18"/>
+            <wp:cNvGraphicFramePr>
+              <a:graphicFrameLocks xmlns:a="http://schemas.openxmlformats.org/drawingml/2006/main" noChangeAspect="1"/>
+            </wp:cNvGraphicFramePr>
+            <a:graphic xmlns:a="http://schemas.openxmlformats.org/drawingml/2006/main">
+              <a:graphicData uri="http://schemas.openxmlformats.org/drawingml/2006/picture">
+                <pic:pic xmlns:pic="http://schemas.openxmlformats.org/drawingml/2006/picture">
+                  <pic:nvPicPr>
+                    <pic:cNvPr id="18" name="Capture d'écran 2026-09-10 104358.png"/>
+                    <pic:cNvPicPr/>
+                  </pic:nvPicPr>
+                  <pic:blipFill>
+                    <a:blip r:embed="rId25">
+                      <a:extLst>
+                        <a:ext uri="{28A0092B-C50C-407E-A947-70E740481C1C}">
+                          <a14:useLocalDpi xmlns:a14="http://schemas.microsoft.com/office/drawing/2010/main" val="0"/>
+                        </a:ext>
+                      </a:extLst>
+                    </a:blip>
+                    <a:stretch>
+                      <a:fillRect/>
+                    </a:stretch>
+                  </pic:blipFill>
+                  <pic:spPr>
+                    <a:xfrm>
+                      <a:off x="0" y="0"/>
+                      <a:ext cx="5382260" cy="4570730"/>
+                    </a:xfrm>
+                    <a:prstGeom prst="rect">
+                      <a:avLst/>
+                    </a:prstGeom>
+                  </pic:spPr>
+                </pic:pic>
+              </a:graphicData>
+            </a:graphic>
+          </wp:inline>
+        </w:drawing>
       </w:r>
     </w:p>
     <w:p>
@@ -3673,8 +4037,24 @@
         <w:ind w:right="0" w:hanging="338"/>
       </w:pPr>
       <w:r>
-        <w:t xml:space="preserve">Créer un prompt permettant, à partir du dataset des capteurs, de proposer les visualisations les plus pertinentes pour comprendre la consommation énergétique d'un bâtiment. Et pour chaque visualisation indiquer le type de graphique, les variables utilisées, l’objectif et l’interprétation attendue. </w:t>
-      </w:r>
+        <w:t xml:space="preserve">Créer un prompt permettant, à partir du </w:t>
+      </w:r>
+      <w:proofErr w:type="spellStart"/>
+      <w:r>
+        <w:t>dataset</w:t>
+      </w:r>
+      <w:proofErr w:type="spellEnd"/>
+      <w:r>
+        <w:t xml:space="preserve"> des capteurs, de proposer les visualisations les plus pertinentes pour comprendre la consommation énergétique d'un bâtiment. Et pour chaque visualisation indiquer le type de graphique, les variables utilisées, l’objectif et l’interprétation attendue. </w:t>
+      </w:r>
+    </w:p>
+    <w:p>
+      <w:pPr>
+        <w:spacing w:after="122"/>
+        <w:ind w:left="664" w:right="0" w:firstLine="0"/>
+      </w:pPr>
+      <w:bookmarkStart w:id="0" w:name="_GoBack"/>
+      <w:bookmarkEnd w:id="0"/>
     </w:p>
     <w:p>
       <w:pPr>
@@ -3686,7 +4066,15 @@
         <w:ind w:right="0" w:hanging="338"/>
       </w:pPr>
       <w:r>
-        <w:t xml:space="preserve">Créer un prompt permettant, à partir du dataset des capteurs, de proposer plusieurs modèles adaptés à la prédiction de la consommation énergétique d'un bâtiment. Pour chaque modèle, le LLM doit indiquer le principe, les avantages, les limites, le type de problème et les métriques pertinentes. </w:t>
+        <w:t xml:space="preserve">Créer un prompt permettant, à partir du </w:t>
+      </w:r>
+      <w:proofErr w:type="spellStart"/>
+      <w:r>
+        <w:t>dataset</w:t>
+      </w:r>
+      <w:proofErr w:type="spellEnd"/>
+      <w:r>
+        <w:t xml:space="preserve"> des capteurs, de proposer plusieurs modèles adaptés à la prédiction de la consommation énergétique d'un bâtiment. Pour chaque modèle, le LLM doit indiquer le principe, les avantages, les limites, le type de problème et les métriques pertinentes. </w:t>
       </w:r>
     </w:p>
     <w:p>
@@ -3699,7 +4087,31 @@
         <w:ind w:right="0" w:hanging="338"/>
       </w:pPr>
       <w:r>
-        <w:t xml:space="preserve">Créer un prompt permettant d’expliquer les métriques de classification (Accuracy, Precision, Recall, F1-score, ROC-AUC). Pour chacune, le LLM doit donner la définition, expliquer son interprétation, donner un exemple concret et indiquer dans quel contexte elle est particulièrement utile. </w:t>
+        <w:t>Créer un prompt permettant d’expliquer les métriques de classification (</w:t>
+      </w:r>
+      <w:proofErr w:type="spellStart"/>
+      <w:r>
+        <w:t>Accuracy</w:t>
+      </w:r>
+      <w:proofErr w:type="spellEnd"/>
+      <w:r>
+        <w:t xml:space="preserve">, </w:t>
+      </w:r>
+      <w:proofErr w:type="spellStart"/>
+      <w:r>
+        <w:t>Precision</w:t>
+      </w:r>
+      <w:proofErr w:type="spellEnd"/>
+      <w:r>
+        <w:t xml:space="preserve">, </w:t>
+      </w:r>
+      <w:proofErr w:type="spellStart"/>
+      <w:r>
+        <w:t>Recall</w:t>
+      </w:r>
+      <w:proofErr w:type="spellEnd"/>
+      <w:r>
+        <w:t xml:space="preserve">, F1-score, ROC-AUC). Pour chacune, le LLM doit donner la définition, expliquer son interprétation, donner un exemple concret et indiquer dans quel contexte elle est particulièrement utile. </w:t>
       </w:r>
     </w:p>
     <w:p>
@@ -3752,6 +4164,7 @@
         <w:ind w:right="0" w:hanging="338"/>
       </w:pPr>
       <w:r>
+        <w:lastRenderedPageBreak/>
         <w:t xml:space="preserve">Tester trois prompts pour poser une question relative à un contenu du document. </w:t>
       </w:r>
     </w:p>
@@ -3904,8 +4317,16 @@
         <w:rPr>
           <w:sz w:val="19"/>
         </w:rPr>
-        <w:t>ai-business_assistant</w:t>
-      </w:r>
+        <w:t>ai-</w:t>
+      </w:r>
+      <w:proofErr w:type="spellStart"/>
+      <w:r>
+        <w:rPr>
+          <w:sz w:val="19"/>
+        </w:rPr>
+        <w:t>business_assistant</w:t>
+      </w:r>
+      <w:proofErr w:type="spellEnd"/>
       <w:r>
         <w:t xml:space="preserve"> contenant le fichier</w:t>
       </w:r>
@@ -3950,13 +4371,16 @@
         </w:numPr>
         <w:ind w:right="0" w:hanging="338"/>
       </w:pPr>
-      <w:proofErr w:type="gramStart"/>
-      <w:r>
-        <w:t>pousse</w:t>
-      </w:r>
-      <w:proofErr w:type="gramEnd"/>
-      <w:r>
-        <w:t xml:space="preserve"> le livrable, d’abord vide, sur un dépôt public de son compte Github personnel </w:t>
+      <w:r>
+        <w:t xml:space="preserve">pousse le livrable, d’abord vide, sur un dépôt public de son compte </w:t>
+      </w:r>
+      <w:proofErr w:type="spellStart"/>
+      <w:r>
+        <w:t>Github</w:t>
+      </w:r>
+      <w:proofErr w:type="spellEnd"/>
+      <w:r>
+        <w:t xml:space="preserve"> personnel </w:t>
       </w:r>
     </w:p>
     <w:p>
@@ -3967,19 +4391,14 @@
         </w:numPr>
         <w:ind w:right="0" w:hanging="338"/>
       </w:pPr>
-      <w:proofErr w:type="gramStart"/>
-      <w:r>
-        <w:t>met</w:t>
-      </w:r>
-      <w:proofErr w:type="gramEnd"/>
-      <w:r>
-        <w:t xml:space="preserve"> à jour le livrable après chaque tâche accomplie, avec un message de commit explicite </w:t>
+      <w:r>
+        <w:t xml:space="preserve">met à jour le livrable après chaque tâche accomplie, avec un message de commit explicite </w:t>
       </w:r>
     </w:p>
     <w:sectPr>
-      <w:footerReference w:type="even" r:id="rId21"/>
-      <w:footerReference w:type="default" r:id="rId22"/>
-      <w:footerReference w:type="first" r:id="rId23"/>
+      <w:footerReference w:type="even" r:id="rId26"/>
+      <w:footerReference w:type="default" r:id="rId27"/>
+      <w:footerReference w:type="first" r:id="rId28"/>
       <w:pgSz w:w="12240" w:h="15840"/>
       <w:pgMar w:top="1404" w:right="1892" w:bottom="1567" w:left="1872" w:header="720" w:footer="681" w:gutter="0"/>
       <w:cols w:space="720"/>

</xml_diff>

<commit_message>
prompt permettant, à partir du dataset des capteurs, de proposer les visualisations les plus pertinentes pour comprendre la consommation énergétique d'un bâtiment
</commit_message>
<xml_diff>
--- a/ai-business_assistant/atelier-prompt-engineering.docx
+++ b/ai-business_assistant/atelier-prompt-engineering.docx
@@ -980,13 +980,24 @@
       </w:r>
       <w:proofErr w:type="spellEnd"/>
       <w:r>
-        <w:t xml:space="preserve">-shot, one-shot, few-shot et un prompt structuré sur une demande du genre : «  </w:t>
+        <w:t xml:space="preserve">-shot, one-shot, few-shot et un prompt structuré sur une demande du genre : </w:t>
+      </w:r>
+      <w:proofErr w:type="gramStart"/>
+      <w:r>
+        <w:t xml:space="preserve">«  </w:t>
       </w:r>
       <w:r>
         <w:rPr>
           <w:sz w:val="17"/>
         </w:rPr>
-        <w:t xml:space="preserve">Classer le commentaire suivant : </w:t>
+        <w:t>Classer</w:t>
+      </w:r>
+      <w:proofErr w:type="gramEnd"/>
+      <w:r>
+        <w:rPr>
+          <w:sz w:val="17"/>
+        </w:rPr>
+        <w:t xml:space="preserve"> le commentaire suivant : </w:t>
       </w:r>
     </w:p>
     <w:p>
@@ -1512,7 +1523,25 @@
           <w:sz w:val="24"/>
           <w:szCs w:val="24"/>
         </w:rPr>
-        <w:t>-shot, ne précisant aucune contrainte de format, a produit une réponse accompagnée d'une justification, ce qui la rend moins directement exploitable par une application (nécessite un post-traitement pour extraire la classe). Les prompts one-shot et few-shot, en donnant un exemple de sortie courte, ont amené le modèle à reproduire ce même format concis, sans instruction explicite sur le format attendu. Le prompt structuré est celui qui offre le meilleur contrôle : la contrainte explicite « réponds uniquement avec le nom de la classe, sans phrase supplémentaire » garantit une sortie strictement conforme, immédiatement utilisable par du code.</w:t>
+        <w:t xml:space="preserve">-shot, ne précisant aucune contrainte de format, a produit une réponse accompagnée d'une justification, ce qui la rend moins directement exploitable par une application (nécessite un post-traitement pour extraire la classe). Les prompts one-shot et few-shot, en donnant un exemple de sortie courte, ont amené le modèle à reproduire ce même format concis, sans instruction explicite sur le format attendu. Le prompt structuré est celui qui offre le meilleur contrôle : la contrainte explicite « </w:t>
+      </w:r>
+      <w:proofErr w:type="gramStart"/>
+      <w:r>
+        <w:rPr>
+          <w:color w:val="auto"/>
+          <w:sz w:val="24"/>
+          <w:szCs w:val="24"/>
+        </w:rPr>
+        <w:t>réponds</w:t>
+      </w:r>
+      <w:proofErr w:type="gramEnd"/>
+      <w:r>
+        <w:rPr>
+          <w:color w:val="auto"/>
+          <w:sz w:val="24"/>
+          <w:szCs w:val="24"/>
+        </w:rPr>
+        <w:t xml:space="preserve"> uniquement avec le nom de la classe, sans phrase supplémentaire » garantit une sortie strictement conforme, immédiatement utilisable par du code.</w:t>
       </w:r>
     </w:p>
     <w:p>
@@ -1601,10 +1630,18 @@
         <w:t xml:space="preserve">Ce prompt mélange </w:t>
       </w:r>
       <w:r>
-        <w:t>3 taches</w:t>
-      </w:r>
-      <w:r>
-        <w:t xml:space="preserve"> . On les sépare</w:t>
+        <w:t xml:space="preserve">3 </w:t>
+      </w:r>
+      <w:proofErr w:type="gramStart"/>
+      <w:r>
+        <w:t>taches</w:t>
+      </w:r>
+      <w:r>
+        <w:t xml:space="preserve"> .</w:t>
+      </w:r>
+      <w:proofErr w:type="gramEnd"/>
+      <w:r>
+        <w:t xml:space="preserve"> On les sépare</w:t>
       </w:r>
       <w:r>
         <w:t> :</w:t>
@@ -2317,7 +2354,21 @@
         <w:rPr>
           <w:sz w:val="17"/>
         </w:rPr>
-        <w:t xml:space="preserve">  "sentiment": "</w:t>
+        <w:t xml:space="preserve">  "sentiment</w:t>
+      </w:r>
+      <w:proofErr w:type="gramStart"/>
+      <w:r>
+        <w:rPr>
+          <w:sz w:val="17"/>
+        </w:rPr>
+        <w:t>":</w:t>
+      </w:r>
+      <w:proofErr w:type="gramEnd"/>
+      <w:r>
+        <w:rPr>
+          <w:sz w:val="17"/>
+        </w:rPr>
+        <w:t xml:space="preserve"> "</w:t>
       </w:r>
       <w:proofErr w:type="spellStart"/>
       <w:r>
@@ -2353,11 +2404,19 @@
         <w:t>categorie</w:t>
       </w:r>
       <w:proofErr w:type="spellEnd"/>
+      <w:proofErr w:type="gramStart"/>
       <w:r>
         <w:rPr>
           <w:sz w:val="17"/>
         </w:rPr>
-        <w:t xml:space="preserve">": "livraison", </w:t>
+        <w:t>":</w:t>
+      </w:r>
+      <w:proofErr w:type="gramEnd"/>
+      <w:r>
+        <w:rPr>
+          <w:sz w:val="17"/>
+        </w:rPr>
+        <w:t xml:space="preserve"> "livraison", </w:t>
       </w:r>
     </w:p>
     <w:p>
@@ -2369,7 +2428,21 @@
         <w:rPr>
           <w:sz w:val="17"/>
         </w:rPr>
-        <w:t xml:space="preserve">  "urgence": "moyenne", </w:t>
+        <w:t xml:space="preserve">  "urgence</w:t>
+      </w:r>
+      <w:proofErr w:type="gramStart"/>
+      <w:r>
+        <w:rPr>
+          <w:sz w:val="17"/>
+        </w:rPr>
+        <w:t>":</w:t>
+      </w:r>
+      <w:proofErr w:type="gramEnd"/>
+      <w:r>
+        <w:rPr>
+          <w:sz w:val="17"/>
+        </w:rPr>
+        <w:t xml:space="preserve"> "moyenne", </w:t>
       </w:r>
     </w:p>
     <w:p>
@@ -2391,11 +2464,19 @@
         <w:t>probleme</w:t>
       </w:r>
       <w:proofErr w:type="spellEnd"/>
+      <w:proofErr w:type="gramStart"/>
       <w:r>
         <w:rPr>
           <w:sz w:val="17"/>
         </w:rPr>
-        <w:t xml:space="preserve">": "Retard de livraison", </w:t>
+        <w:t>":</w:t>
+      </w:r>
+      <w:proofErr w:type="gramEnd"/>
+      <w:r>
+        <w:rPr>
+          <w:sz w:val="17"/>
+        </w:rPr>
+        <w:t xml:space="preserve"> "Retard de livraison", </w:t>
       </w:r>
     </w:p>
     <w:p>
@@ -2407,7 +2488,21 @@
         <w:rPr>
           <w:sz w:val="17"/>
         </w:rPr>
-        <w:t xml:space="preserve">  "confiance": 0.91 </w:t>
+        <w:t xml:space="preserve">  "confiance</w:t>
+      </w:r>
+      <w:proofErr w:type="gramStart"/>
+      <w:r>
+        <w:rPr>
+          <w:sz w:val="17"/>
+        </w:rPr>
+        <w:t>":</w:t>
+      </w:r>
+      <w:proofErr w:type="gramEnd"/>
+      <w:r>
+        <w:rPr>
+          <w:sz w:val="17"/>
+        </w:rPr>
+        <w:t xml:space="preserve"> 0.91 </w:t>
       </w:r>
     </w:p>
     <w:p>
@@ -2528,8 +2623,13 @@
         <w:spacing w:after="160"/>
         <w:ind w:left="664" w:right="0" w:firstLine="0"/>
       </w:pPr>
-      <w:r>
-        <w:t xml:space="preserve">sentiment : texte, valeur parmi positif, </w:t>
+      <w:proofErr w:type="gramStart"/>
+      <w:r>
+        <w:t>sentiment</w:t>
+      </w:r>
+      <w:proofErr w:type="gramEnd"/>
+      <w:r>
+        <w:t xml:space="preserve"> : texte, valeur parmi positif, </w:t>
       </w:r>
       <w:proofErr w:type="spellStart"/>
       <w:r>
@@ -2546,10 +2646,12 @@
         <w:ind w:left="664" w:right="0" w:firstLine="0"/>
       </w:pPr>
       <w:proofErr w:type="spellStart"/>
+      <w:proofErr w:type="gramStart"/>
       <w:r>
         <w:t>categorie</w:t>
       </w:r>
       <w:proofErr w:type="spellEnd"/>
+      <w:proofErr w:type="gramEnd"/>
       <w:r>
         <w:t xml:space="preserve"> : texte décrivant le thème principal du commentaire, par exemple livraison, produit, service, application</w:t>
       </w:r>
@@ -2559,8 +2661,13 @@
         <w:spacing w:after="160"/>
         <w:ind w:left="664" w:right="0" w:firstLine="0"/>
       </w:pPr>
-      <w:r>
-        <w:t>urgence : texte, valeur parmi faible, moyenne, élevée</w:t>
+      <w:proofErr w:type="gramStart"/>
+      <w:r>
+        <w:t>urgence</w:t>
+      </w:r>
+      <w:proofErr w:type="gramEnd"/>
+      <w:r>
+        <w:t xml:space="preserve"> : texte, valeur parmi faible, moyenne, élevée</w:t>
       </w:r>
     </w:p>
     <w:p>
@@ -2569,10 +2676,12 @@
         <w:ind w:left="664" w:right="0" w:firstLine="0"/>
       </w:pPr>
       <w:proofErr w:type="spellStart"/>
+      <w:proofErr w:type="gramStart"/>
       <w:r>
         <w:t>probleme</w:t>
       </w:r>
       <w:proofErr w:type="spellEnd"/>
+      <w:proofErr w:type="gramEnd"/>
       <w:r>
         <w:t xml:space="preserve"> : texte résumant le problème principal en une courte phrase</w:t>
       </w:r>
@@ -2582,8 +2691,13 @@
         <w:spacing w:after="160"/>
         <w:ind w:left="664" w:right="0" w:firstLine="0"/>
       </w:pPr>
-      <w:r>
-        <w:t>confiance : nombre décimal entre 0 et 1 représentant le niveau de certitude de l'analyse</w:t>
+      <w:proofErr w:type="gramStart"/>
+      <w:r>
+        <w:t>confiance</w:t>
+      </w:r>
+      <w:proofErr w:type="gramEnd"/>
+      <w:r>
+        <w:t xml:space="preserve"> : nombre décimal entre 0 et 1 représentant le niveau de certitude de l'analyse</w:t>
       </w:r>
     </w:p>
     <w:p>
@@ -2938,11 +3052,16 @@
       <w:r>
         <w:t xml:space="preserve"> </w:t>
       </w:r>
+      <w:proofErr w:type="gramStart"/>
       <w:r>
         <w:t>t</w:t>
       </w:r>
       <w:r>
-        <w:t>raduis le document suivant du français vers l'anglais en respectant les contraintes ci-dessous :</w:t>
+        <w:t>raduis</w:t>
+      </w:r>
+      <w:proofErr w:type="gramEnd"/>
+      <w:r>
+        <w:t xml:space="preserve"> le document suivant du français vers l'anglais en respectant les contraintes ci-dessous :</w:t>
       </w:r>
     </w:p>
     <w:p>
@@ -3123,7 +3242,15 @@
         <w:ind w:right="0" w:hanging="338"/>
       </w:pPr>
       <w:r>
-        <w:t xml:space="preserve">Créer un prompt permettant de classer un ticket informatique dans une catégorie (réseau, logiciel, matériel, sécurité, accès, autre). La réponse est au format JSON avec les champs </w:t>
+        <w:t xml:space="preserve">Créer un prompt permettant de classer un ticket informatique dans une catégorie (réseau, </w:t>
+      </w:r>
+      <w:proofErr w:type="gramStart"/>
+      <w:r>
+        <w:t>logiciel</w:t>
+      </w:r>
+      <w:proofErr w:type="gramEnd"/>
+      <w:r>
+        <w:t xml:space="preserve">, matériel, sécurité, accès, autre). La réponse est au format JSON avec les champs </w:t>
       </w:r>
       <w:proofErr w:type="spellStart"/>
       <w:r>
@@ -3265,8 +3392,13 @@
         <w:ind w:left="664" w:right="0" w:firstLine="0"/>
       </w:pPr>
       <w:proofErr w:type="spellStart"/>
-      <w:r>
-        <w:t>numero_facture</w:t>
+      <w:proofErr w:type="gramStart"/>
+      <w:r>
+        <w:t>numero</w:t>
+      </w:r>
+      <w:proofErr w:type="gramEnd"/>
+      <w:r>
+        <w:t>_facture</w:t>
       </w:r>
       <w:proofErr w:type="spellEnd"/>
       <w:r>
@@ -3282,8 +3414,13 @@
       <w:pPr>
         <w:ind w:left="664" w:right="0" w:firstLine="0"/>
       </w:pPr>
-      <w:r>
-        <w:t>date : texte au format JJ/MM/AAAA</w:t>
+      <w:proofErr w:type="gramStart"/>
+      <w:r>
+        <w:t>date</w:t>
+      </w:r>
+      <w:proofErr w:type="gramEnd"/>
+      <w:r>
+        <w:t xml:space="preserve"> : texte au format JJ/MM/AAAA</w:t>
       </w:r>
     </w:p>
     <w:p>
@@ -3295,8 +3432,13 @@
       <w:pPr>
         <w:ind w:left="664" w:right="0" w:firstLine="0"/>
       </w:pPr>
-      <w:r>
-        <w:t>client : texte</w:t>
+      <w:proofErr w:type="gramStart"/>
+      <w:r>
+        <w:t>client</w:t>
+      </w:r>
+      <w:proofErr w:type="gramEnd"/>
+      <w:r>
+        <w:t xml:space="preserve"> : texte</w:t>
       </w:r>
     </w:p>
     <w:p>
@@ -3309,8 +3451,13 @@
         <w:ind w:left="664" w:right="0" w:firstLine="0"/>
       </w:pPr>
       <w:proofErr w:type="spellStart"/>
-      <w:r>
-        <w:t>montant_ht</w:t>
+      <w:proofErr w:type="gramStart"/>
+      <w:r>
+        <w:t>montant</w:t>
+      </w:r>
+      <w:proofErr w:type="gramEnd"/>
+      <w:r>
+        <w:t>_ht</w:t>
       </w:r>
       <w:proofErr w:type="spellEnd"/>
       <w:r>
@@ -3326,8 +3473,13 @@
       <w:pPr>
         <w:ind w:left="664" w:right="0" w:firstLine="0"/>
       </w:pPr>
-      <w:r>
-        <w:t>tva : nombre décimal</w:t>
+      <w:proofErr w:type="gramStart"/>
+      <w:r>
+        <w:t>tva</w:t>
+      </w:r>
+      <w:proofErr w:type="gramEnd"/>
+      <w:r>
+        <w:t xml:space="preserve"> : nombre décimal</w:t>
       </w:r>
     </w:p>
     <w:p>
@@ -3340,8 +3492,13 @@
         <w:ind w:left="664" w:right="0" w:firstLine="0"/>
       </w:pPr>
       <w:proofErr w:type="spellStart"/>
-      <w:r>
-        <w:t>montant_ttc</w:t>
+      <w:proofErr w:type="gramStart"/>
+      <w:r>
+        <w:t>montant</w:t>
+      </w:r>
+      <w:proofErr w:type="gramEnd"/>
+      <w:r>
+        <w:t>_ttc</w:t>
       </w:r>
       <w:proofErr w:type="spellEnd"/>
       <w:r>
@@ -4051,10 +4208,351 @@
     <w:p>
       <w:pPr>
         <w:spacing w:after="122"/>
-        <w:ind w:left="664" w:right="0" w:firstLine="0"/>
-      </w:pPr>
+        <w:ind w:left="326" w:right="0" w:firstLine="0"/>
+      </w:pPr>
+      <w:r>
+        <w:t xml:space="preserve">À partir du </w:t>
+      </w:r>
+      <w:proofErr w:type="spellStart"/>
+      <w:r>
+        <w:t>dataset</w:t>
+      </w:r>
+      <w:proofErr w:type="spellEnd"/>
+      <w:r>
+        <w:t xml:space="preserve"> de capteurs IoT (température, humidité, pression, consommation énergétique), propose les visualisations les plus pertinentes pour comprendre la consommation énergétique d'un bâtiment.</w:t>
+      </w:r>
+    </w:p>
+    <w:p>
+      <w:pPr>
+        <w:spacing w:after="122"/>
+        <w:ind w:left="326" w:right="0" w:firstLine="0"/>
+      </w:pPr>
+    </w:p>
+    <w:p>
+      <w:pPr>
+        <w:spacing w:after="122"/>
+        <w:ind w:left="326" w:right="0" w:firstLine="0"/>
+      </w:pPr>
+      <w:r>
+        <w:t>Pour chaque visualisation, indique :</w:t>
+      </w:r>
+    </w:p>
+    <w:p>
+      <w:pPr>
+        <w:spacing w:after="122"/>
+        <w:ind w:left="326" w:right="0" w:firstLine="0"/>
+      </w:pPr>
+      <w:r>
+        <w:t>1. Type de graphique (ex : histogramme, nuage de points, série temporelle...)</w:t>
+      </w:r>
+    </w:p>
+    <w:p>
+      <w:pPr>
+        <w:spacing w:after="122"/>
+        <w:ind w:left="326" w:right="0" w:firstLine="0"/>
+      </w:pPr>
+      <w:r>
+        <w:t>2. Variables utilisées</w:t>
+      </w:r>
+    </w:p>
+    <w:p>
+      <w:pPr>
+        <w:spacing w:after="122"/>
+        <w:ind w:left="326" w:right="0" w:firstLine="0"/>
+      </w:pPr>
+      <w:r>
+        <w:t>3. Objectif de la visualisation</w:t>
+      </w:r>
+    </w:p>
+    <w:p>
+      <w:pPr>
+        <w:spacing w:after="122"/>
+        <w:ind w:left="326" w:right="0" w:firstLine="0"/>
+      </w:pPr>
+      <w:r>
+        <w:t>4. Interprétation attendue</w:t>
+      </w:r>
+    </w:p>
+    <w:p>
+      <w:pPr>
+        <w:spacing w:after="122"/>
+        <w:ind w:left="0" w:right="0" w:firstLine="0"/>
+      </w:pPr>
+    </w:p>
+    <w:p>
+      <w:pPr>
+        <w:spacing w:after="122"/>
+        <w:ind w:left="326" w:right="0" w:firstLine="0"/>
+      </w:pPr>
+      <w:r>
+        <w:rPr>
+          <w:noProof/>
+        </w:rPr>
+        <w:lastRenderedPageBreak/>
+        <w:drawing>
+          <wp:inline distT="0" distB="0" distL="0" distR="0" wp14:anchorId="259486EE" wp14:editId="09AAEF38">
+            <wp:extent cx="5382260" cy="2147570"/>
+            <wp:effectExtent l="0" t="0" r="8890" b="5080"/>
+            <wp:docPr id="20" name="Image 20"/>
+            <wp:cNvGraphicFramePr>
+              <a:graphicFrameLocks xmlns:a="http://schemas.openxmlformats.org/drawingml/2006/main" noChangeAspect="1"/>
+            </wp:cNvGraphicFramePr>
+            <a:graphic xmlns:a="http://schemas.openxmlformats.org/drawingml/2006/main">
+              <a:graphicData uri="http://schemas.openxmlformats.org/drawingml/2006/picture">
+                <pic:pic xmlns:pic="http://schemas.openxmlformats.org/drawingml/2006/picture">
+                  <pic:nvPicPr>
+                    <pic:cNvPr id="20" name="Capture d'écran 2026-09-10 105416.png"/>
+                    <pic:cNvPicPr/>
+                  </pic:nvPicPr>
+                  <pic:blipFill>
+                    <a:blip r:embed="rId26">
+                      <a:extLst>
+                        <a:ext uri="{28A0092B-C50C-407E-A947-70E740481C1C}">
+                          <a14:useLocalDpi xmlns:a14="http://schemas.microsoft.com/office/drawing/2010/main" val="0"/>
+                        </a:ext>
+                      </a:extLst>
+                    </a:blip>
+                    <a:stretch>
+                      <a:fillRect/>
+                    </a:stretch>
+                  </pic:blipFill>
+                  <pic:spPr>
+                    <a:xfrm>
+                      <a:off x="0" y="0"/>
+                      <a:ext cx="5382260" cy="2147570"/>
+                    </a:xfrm>
+                    <a:prstGeom prst="rect">
+                      <a:avLst/>
+                    </a:prstGeom>
+                  </pic:spPr>
+                </pic:pic>
+              </a:graphicData>
+            </a:graphic>
+          </wp:inline>
+        </w:drawing>
+      </w:r>
+    </w:p>
+    <w:p>
+      <w:pPr>
+        <w:spacing w:after="122"/>
+        <w:ind w:left="326" w:right="0" w:firstLine="0"/>
+      </w:pPr>
+      <w:r>
+        <w:rPr>
+          <w:noProof/>
+        </w:rPr>
+        <w:lastRenderedPageBreak/>
+        <w:drawing>
+          <wp:inline distT="0" distB="0" distL="0" distR="0" wp14:anchorId="2A88A873" wp14:editId="0C71ECDA">
+            <wp:extent cx="5382260" cy="3138805"/>
+            <wp:effectExtent l="0" t="0" r="8890" b="4445"/>
+            <wp:docPr id="21" name="Image 21"/>
+            <wp:cNvGraphicFramePr>
+              <a:graphicFrameLocks xmlns:a="http://schemas.openxmlformats.org/drawingml/2006/main" noChangeAspect="1"/>
+            </wp:cNvGraphicFramePr>
+            <a:graphic xmlns:a="http://schemas.openxmlformats.org/drawingml/2006/main">
+              <a:graphicData uri="http://schemas.openxmlformats.org/drawingml/2006/picture">
+                <pic:pic xmlns:pic="http://schemas.openxmlformats.org/drawingml/2006/picture">
+                  <pic:nvPicPr>
+                    <pic:cNvPr id="21" name="Capture d'écran 2026-09-10 105910.png"/>
+                    <pic:cNvPicPr/>
+                  </pic:nvPicPr>
+                  <pic:blipFill>
+                    <a:blip r:embed="rId27">
+                      <a:extLst>
+                        <a:ext uri="{28A0092B-C50C-407E-A947-70E740481C1C}">
+                          <a14:useLocalDpi xmlns:a14="http://schemas.microsoft.com/office/drawing/2010/main" val="0"/>
+                        </a:ext>
+                      </a:extLst>
+                    </a:blip>
+                    <a:stretch>
+                      <a:fillRect/>
+                    </a:stretch>
+                  </pic:blipFill>
+                  <pic:spPr>
+                    <a:xfrm>
+                      <a:off x="0" y="0"/>
+                      <a:ext cx="5382260" cy="3138805"/>
+                    </a:xfrm>
+                    <a:prstGeom prst="rect">
+                      <a:avLst/>
+                    </a:prstGeom>
+                  </pic:spPr>
+                </pic:pic>
+              </a:graphicData>
+            </a:graphic>
+          </wp:inline>
+        </w:drawing>
+      </w:r>
+      <w:r>
+        <w:rPr>
+          <w:noProof/>
+        </w:rPr>
+        <w:drawing>
+          <wp:inline distT="0" distB="0" distL="0" distR="0" wp14:anchorId="6FE37C11" wp14:editId="29052406">
+            <wp:extent cx="5382260" cy="4041775"/>
+            <wp:effectExtent l="0" t="0" r="8890" b="0"/>
+            <wp:docPr id="22" name="Image 22"/>
+            <wp:cNvGraphicFramePr>
+              <a:graphicFrameLocks xmlns:a="http://schemas.openxmlformats.org/drawingml/2006/main" noChangeAspect="1"/>
+            </wp:cNvGraphicFramePr>
+            <a:graphic xmlns:a="http://schemas.openxmlformats.org/drawingml/2006/main">
+              <a:graphicData uri="http://schemas.openxmlformats.org/drawingml/2006/picture">
+                <pic:pic xmlns:pic="http://schemas.openxmlformats.org/drawingml/2006/picture">
+                  <pic:nvPicPr>
+                    <pic:cNvPr id="22" name="Capture d'écran 2026-09-10 105920.png"/>
+                    <pic:cNvPicPr/>
+                  </pic:nvPicPr>
+                  <pic:blipFill>
+                    <a:blip r:embed="rId28">
+                      <a:extLst>
+                        <a:ext uri="{28A0092B-C50C-407E-A947-70E740481C1C}">
+                          <a14:useLocalDpi xmlns:a14="http://schemas.microsoft.com/office/drawing/2010/main" val="0"/>
+                        </a:ext>
+                      </a:extLst>
+                    </a:blip>
+                    <a:stretch>
+                      <a:fillRect/>
+                    </a:stretch>
+                  </pic:blipFill>
+                  <pic:spPr>
+                    <a:xfrm>
+                      <a:off x="0" y="0"/>
+                      <a:ext cx="5382260" cy="4041775"/>
+                    </a:xfrm>
+                    <a:prstGeom prst="rect">
+                      <a:avLst/>
+                    </a:prstGeom>
+                  </pic:spPr>
+                </pic:pic>
+              </a:graphicData>
+            </a:graphic>
+          </wp:inline>
+        </w:drawing>
+      </w:r>
+      <w:r>
+        <w:rPr>
+          <w:noProof/>
+        </w:rPr>
+        <w:lastRenderedPageBreak/>
+        <w:drawing>
+          <wp:inline distT="0" distB="0" distL="0" distR="0" wp14:anchorId="261FB98F" wp14:editId="53217868">
+            <wp:extent cx="5382260" cy="4587240"/>
+            <wp:effectExtent l="0" t="0" r="8890" b="3810"/>
+            <wp:docPr id="23" name="Image 23"/>
+            <wp:cNvGraphicFramePr>
+              <a:graphicFrameLocks xmlns:a="http://schemas.openxmlformats.org/drawingml/2006/main" noChangeAspect="1"/>
+            </wp:cNvGraphicFramePr>
+            <a:graphic xmlns:a="http://schemas.openxmlformats.org/drawingml/2006/main">
+              <a:graphicData uri="http://schemas.openxmlformats.org/drawingml/2006/picture">
+                <pic:pic xmlns:pic="http://schemas.openxmlformats.org/drawingml/2006/picture">
+                  <pic:nvPicPr>
+                    <pic:cNvPr id="23" name="Capture d'écran 2026-09-10 105950.png"/>
+                    <pic:cNvPicPr/>
+                  </pic:nvPicPr>
+                  <pic:blipFill>
+                    <a:blip r:embed="rId29">
+                      <a:extLst>
+                        <a:ext uri="{28A0092B-C50C-407E-A947-70E740481C1C}">
+                          <a14:useLocalDpi xmlns:a14="http://schemas.microsoft.com/office/drawing/2010/main" val="0"/>
+                        </a:ext>
+                      </a:extLst>
+                    </a:blip>
+                    <a:stretch>
+                      <a:fillRect/>
+                    </a:stretch>
+                  </pic:blipFill>
+                  <pic:spPr>
+                    <a:xfrm>
+                      <a:off x="0" y="0"/>
+                      <a:ext cx="5382260" cy="4587240"/>
+                    </a:xfrm>
+                    <a:prstGeom prst="rect">
+                      <a:avLst/>
+                    </a:prstGeom>
+                  </pic:spPr>
+                </pic:pic>
+              </a:graphicData>
+            </a:graphic>
+          </wp:inline>
+        </w:drawing>
+      </w:r>
+      <w:r>
+        <w:rPr>
+          <w:noProof/>
+        </w:rPr>
+        <w:lastRenderedPageBreak/>
+        <w:drawing>
+          <wp:inline distT="0" distB="0" distL="0" distR="0" wp14:anchorId="4967CEB9" wp14:editId="2FC6B0F4">
+            <wp:extent cx="5382260" cy="4451350"/>
+            <wp:effectExtent l="0" t="0" r="8890" b="6350"/>
+            <wp:docPr id="24" name="Image 24"/>
+            <wp:cNvGraphicFramePr>
+              <a:graphicFrameLocks xmlns:a="http://schemas.openxmlformats.org/drawingml/2006/main" noChangeAspect="1"/>
+            </wp:cNvGraphicFramePr>
+            <a:graphic xmlns:a="http://schemas.openxmlformats.org/drawingml/2006/main">
+              <a:graphicData uri="http://schemas.openxmlformats.org/drawingml/2006/picture">
+                <pic:pic xmlns:pic="http://schemas.openxmlformats.org/drawingml/2006/picture">
+                  <pic:nvPicPr>
+                    <pic:cNvPr id="24" name="Capture d'écran 2026-09-10 110002.png"/>
+                    <pic:cNvPicPr/>
+                  </pic:nvPicPr>
+                  <pic:blipFill>
+                    <a:blip r:embed="rId30">
+                      <a:extLst>
+                        <a:ext uri="{28A0092B-C50C-407E-A947-70E740481C1C}">
+                          <a14:useLocalDpi xmlns:a14="http://schemas.microsoft.com/office/drawing/2010/main" val="0"/>
+                        </a:ext>
+                      </a:extLst>
+                    </a:blip>
+                    <a:stretch>
+                      <a:fillRect/>
+                    </a:stretch>
+                  </pic:blipFill>
+                  <pic:spPr>
+                    <a:xfrm>
+                      <a:off x="0" y="0"/>
+                      <a:ext cx="5382260" cy="4451350"/>
+                    </a:xfrm>
+                    <a:prstGeom prst="rect">
+                      <a:avLst/>
+                    </a:prstGeom>
+                  </pic:spPr>
+                </pic:pic>
+              </a:graphicData>
+            </a:graphic>
+          </wp:inline>
+        </w:drawing>
+      </w:r>
+    </w:p>
+    <w:p>
+      <w:pPr>
+        <w:spacing w:after="122"/>
+        <w:ind w:left="326" w:right="0" w:firstLine="0"/>
+      </w:pPr>
+    </w:p>
+    <w:p>
+      <w:pPr>
+        <w:spacing w:after="122"/>
+        <w:ind w:left="326" w:right="0" w:firstLine="0"/>
+      </w:pPr>
+    </w:p>
+    <w:p>
+      <w:pPr>
+        <w:spacing w:after="122"/>
+        <w:ind w:left="0" w:right="0" w:firstLine="0"/>
+      </w:pPr>
+      <w:r>
+        <w:t>.</w:t>
+      </w:r>
       <w:bookmarkStart w:id="0" w:name="_GoBack"/>
       <w:bookmarkEnd w:id="0"/>
+    </w:p>
+    <w:p>
+      <w:pPr>
+        <w:spacing w:after="122"/>
+        <w:ind w:left="664" w:right="0" w:firstLine="0"/>
+      </w:pPr>
     </w:p>
     <w:p>
       <w:pPr>
@@ -4164,15 +4662,15 @@
         <w:ind w:right="0" w:hanging="338"/>
       </w:pPr>
       <w:r>
+        <w:t xml:space="preserve">Tester trois prompts pour poser une question relative à un contenu du document. </w:t>
+      </w:r>
+    </w:p>
+    <w:p>
+      <w:pPr>
+        <w:ind w:left="675" w:right="0"/>
+      </w:pPr>
+      <w:r>
         <w:lastRenderedPageBreak/>
-        <w:t xml:space="preserve">Tester trois prompts pour poser une question relative à un contenu du document. </w:t>
-      </w:r>
-    </w:p>
-    <w:p>
-      <w:pPr>
-        <w:ind w:left="675" w:right="0"/>
-      </w:pPr>
-      <w:r>
         <w:t xml:space="preserve">Prompt A : poser la question sans fournir le document au LLM </w:t>
       </w:r>
     </w:p>
@@ -4371,8 +4869,13 @@
         </w:numPr>
         <w:ind w:right="0" w:hanging="338"/>
       </w:pPr>
-      <w:r>
-        <w:t xml:space="preserve">pousse le livrable, d’abord vide, sur un dépôt public de son compte </w:t>
+      <w:proofErr w:type="gramStart"/>
+      <w:r>
+        <w:t>pousse</w:t>
+      </w:r>
+      <w:proofErr w:type="gramEnd"/>
+      <w:r>
+        <w:t xml:space="preserve"> le livrable, d’abord vide, sur un dépôt public de son compte </w:t>
       </w:r>
       <w:proofErr w:type="spellStart"/>
       <w:r>
@@ -4391,14 +4894,19 @@
         </w:numPr>
         <w:ind w:right="0" w:hanging="338"/>
       </w:pPr>
-      <w:r>
-        <w:t xml:space="preserve">met à jour le livrable après chaque tâche accomplie, avec un message de commit explicite </w:t>
+      <w:proofErr w:type="gramStart"/>
+      <w:r>
+        <w:t>met</w:t>
+      </w:r>
+      <w:proofErr w:type="gramEnd"/>
+      <w:r>
+        <w:t xml:space="preserve"> à jour le livrable après chaque tâche accomplie, avec un message de commit explicite </w:t>
       </w:r>
     </w:p>
     <w:sectPr>
-      <w:footerReference w:type="even" r:id="rId26"/>
-      <w:footerReference w:type="default" r:id="rId27"/>
-      <w:footerReference w:type="first" r:id="rId28"/>
+      <w:footerReference w:type="even" r:id="rId31"/>
+      <w:footerReference w:type="default" r:id="rId32"/>
+      <w:footerReference w:type="first" r:id="rId33"/>
       <w:pgSz w:w="12240" w:h="15840"/>
       <w:pgMar w:top="1404" w:right="1892" w:bottom="1567" w:left="1872" w:header="720" w:footer="681" w:gutter="0"/>
       <w:cols w:space="720"/>

</xml_diff>

<commit_message>
rompt permettant, à partir du dataset des capteurs, de proposer plusieurs modèles adaptés à la prédiction de la consommation énergétique d'un bâtiment.
</commit_message>
<xml_diff>
--- a/ai-business_assistant/atelier-prompt-engineering.docx
+++ b/ai-business_assistant/atelier-prompt-engineering.docx
@@ -4208,34 +4208,84 @@
     <w:p>
       <w:pPr>
         <w:spacing w:after="122"/>
-        <w:ind w:left="326" w:right="0" w:firstLine="0"/>
-      </w:pPr>
-      <w:r>
-        <w:t xml:space="preserve">À partir du </w:t>
-      </w:r>
-      <w:proofErr w:type="spellStart"/>
-      <w:r>
-        <w:t>dataset</w:t>
-      </w:r>
-      <w:proofErr w:type="spellEnd"/>
-      <w:r>
-        <w:t xml:space="preserve"> de capteurs IoT (température, humidité, pression, consommation énergétique), propose les visualisations les plus pertinentes pour comprendre la consommation énergétique d'un bâtiment.</w:t>
-      </w:r>
+        <w:ind w:left="664" w:right="0" w:firstLine="0"/>
+      </w:pPr>
+      <w:r>
+        <w:rPr>
+          <w:noProof/>
+        </w:rPr>
+        <w:drawing>
+          <wp:inline distT="0" distB="0" distL="0" distR="0" wp14:anchorId="54353AF7" wp14:editId="16B227A1">
+            <wp:extent cx="5382260" cy="2045970"/>
+            <wp:effectExtent l="0" t="0" r="8890" b="0"/>
+            <wp:docPr id="25" name="Image 25"/>
+            <wp:cNvGraphicFramePr>
+              <a:graphicFrameLocks xmlns:a="http://schemas.openxmlformats.org/drawingml/2006/main" noChangeAspect="1"/>
+            </wp:cNvGraphicFramePr>
+            <a:graphic xmlns:a="http://schemas.openxmlformats.org/drawingml/2006/main">
+              <a:graphicData uri="http://schemas.openxmlformats.org/drawingml/2006/picture">
+                <pic:pic xmlns:pic="http://schemas.openxmlformats.org/drawingml/2006/picture">
+                  <pic:nvPicPr>
+                    <pic:cNvPr id="25" name="Capture d'écran 2026-09-10 110324.png"/>
+                    <pic:cNvPicPr/>
+                  </pic:nvPicPr>
+                  <pic:blipFill>
+                    <a:blip r:embed="rId26">
+                      <a:extLst>
+                        <a:ext uri="{28A0092B-C50C-407E-A947-70E740481C1C}">
+                          <a14:useLocalDpi xmlns:a14="http://schemas.microsoft.com/office/drawing/2010/main" val="0"/>
+                        </a:ext>
+                      </a:extLst>
+                    </a:blip>
+                    <a:stretch>
+                      <a:fillRect/>
+                    </a:stretch>
+                  </pic:blipFill>
+                  <pic:spPr>
+                    <a:xfrm>
+                      <a:off x="0" y="0"/>
+                      <a:ext cx="5382260" cy="2045970"/>
+                    </a:xfrm>
+                    <a:prstGeom prst="rect">
+                      <a:avLst/>
+                    </a:prstGeom>
+                  </pic:spPr>
+                </pic:pic>
+              </a:graphicData>
+            </a:graphic>
+          </wp:inline>
+        </w:drawing>
+      </w:r>
+    </w:p>
+    <w:p>
+      <w:pPr>
+        <w:spacing w:after="122"/>
+        <w:ind w:left="664" w:right="0" w:firstLine="0"/>
+      </w:pPr>
     </w:p>
     <w:p>
       <w:pPr>
         <w:spacing w:after="122"/>
         <w:ind w:left="326" w:right="0" w:firstLine="0"/>
       </w:pPr>
+      <w:r>
+        <w:lastRenderedPageBreak/>
+        <w:t xml:space="preserve">À partir du </w:t>
+      </w:r>
+      <w:proofErr w:type="spellStart"/>
+      <w:r>
+        <w:t>dataset</w:t>
+      </w:r>
+      <w:proofErr w:type="spellEnd"/>
+      <w:r>
+        <w:t xml:space="preserve"> de capteurs IoT (température, humidité, pression, consommation énergétique), propose les visualisations les plus pertinentes pour comprendre la consommation énergétique d'un bâtiment.</w:t>
+      </w:r>
     </w:p>
     <w:p>
       <w:pPr>
         <w:spacing w:after="122"/>
         <w:ind w:left="326" w:right="0" w:firstLine="0"/>
       </w:pPr>
-      <w:r>
-        <w:t>Pour chaque visualisation, indique :</w:t>
-      </w:r>
     </w:p>
     <w:p>
       <w:pPr>
@@ -4243,7 +4293,7 @@
         <w:ind w:left="326" w:right="0" w:firstLine="0"/>
       </w:pPr>
       <w:r>
-        <w:t>1. Type de graphique (ex : histogramme, nuage de points, série temporelle...)</w:t>
+        <w:t>Pour chaque visualisation, indique :</w:t>
       </w:r>
     </w:p>
     <w:p>
@@ -4252,7 +4302,7 @@
         <w:ind w:left="326" w:right="0" w:firstLine="0"/>
       </w:pPr>
       <w:r>
-        <w:t>2. Variables utilisées</w:t>
+        <w:t>1. Type de graphique (ex : histogramme, nuage de points, série temporelle...)</w:t>
       </w:r>
     </w:p>
     <w:p>
@@ -4261,7 +4311,7 @@
         <w:ind w:left="326" w:right="0" w:firstLine="0"/>
       </w:pPr>
       <w:r>
-        <w:t>3. Objectif de la visualisation</w:t>
+        <w:t>2. Variables utilisées</w:t>
       </w:r>
     </w:p>
     <w:p>
@@ -4270,6 +4320,15 @@
         <w:ind w:left="326" w:right="0" w:firstLine="0"/>
       </w:pPr>
       <w:r>
+        <w:t>3. Objectif de la visualisation</w:t>
+      </w:r>
+    </w:p>
+    <w:p>
+      <w:pPr>
+        <w:spacing w:after="122"/>
+        <w:ind w:left="326" w:right="0" w:firstLine="0"/>
+      </w:pPr>
+      <w:r>
         <w:t>4. Interprétation attendue</w:t>
       </w:r>
     </w:p>
@@ -4288,7 +4347,6 @@
         <w:rPr>
           <w:noProof/>
         </w:rPr>
-        <w:lastRenderedPageBreak/>
         <w:drawing>
           <wp:inline distT="0" distB="0" distL="0" distR="0" wp14:anchorId="259486EE" wp14:editId="09AAEF38">
             <wp:extent cx="5382260" cy="2147570"/>
@@ -4305,7 +4363,7 @@
                     <pic:cNvPicPr/>
                   </pic:nvPicPr>
                   <pic:blipFill>
-                    <a:blip r:embed="rId26">
+                    <a:blip r:embed="rId27">
                       <a:extLst>
                         <a:ext uri="{28A0092B-C50C-407E-A947-70E740481C1C}">
                           <a14:useLocalDpi xmlns:a14="http://schemas.microsoft.com/office/drawing/2010/main" val="0"/>
@@ -4343,6 +4401,200 @@
         </w:rPr>
         <w:lastRenderedPageBreak/>
         <w:drawing>
+          <wp:inline distT="0" distB="0" distL="0" distR="0" wp14:anchorId="104AE040" wp14:editId="35EA9AD5">
+            <wp:extent cx="5382260" cy="3486150"/>
+            <wp:effectExtent l="0" t="0" r="8890" b="0"/>
+            <wp:docPr id="26" name="Image 26"/>
+            <wp:cNvGraphicFramePr>
+              <a:graphicFrameLocks xmlns:a="http://schemas.openxmlformats.org/drawingml/2006/main" noChangeAspect="1"/>
+            </wp:cNvGraphicFramePr>
+            <a:graphic xmlns:a="http://schemas.openxmlformats.org/drawingml/2006/main">
+              <a:graphicData uri="http://schemas.openxmlformats.org/drawingml/2006/picture">
+                <pic:pic xmlns:pic="http://schemas.openxmlformats.org/drawingml/2006/picture">
+                  <pic:nvPicPr>
+                    <pic:cNvPr id="26" name="Capture d'écran 2026-09-10 110623.png"/>
+                    <pic:cNvPicPr/>
+                  </pic:nvPicPr>
+                  <pic:blipFill>
+                    <a:blip r:embed="rId28">
+                      <a:extLst>
+                        <a:ext uri="{28A0092B-C50C-407E-A947-70E740481C1C}">
+                          <a14:useLocalDpi xmlns:a14="http://schemas.microsoft.com/office/drawing/2010/main" val="0"/>
+                        </a:ext>
+                      </a:extLst>
+                    </a:blip>
+                    <a:stretch>
+                      <a:fillRect/>
+                    </a:stretch>
+                  </pic:blipFill>
+                  <pic:spPr>
+                    <a:xfrm>
+                      <a:off x="0" y="0"/>
+                      <a:ext cx="5382260" cy="3486150"/>
+                    </a:xfrm>
+                    <a:prstGeom prst="rect">
+                      <a:avLst/>
+                    </a:prstGeom>
+                  </pic:spPr>
+                </pic:pic>
+              </a:graphicData>
+            </a:graphic>
+          </wp:inline>
+        </w:drawing>
+      </w:r>
+      <w:r>
+        <w:rPr>
+          <w:noProof/>
+        </w:rPr>
+        <w:drawing>
+          <wp:inline distT="0" distB="0" distL="0" distR="0" wp14:anchorId="70899BC9" wp14:editId="0C2B8BA9">
+            <wp:extent cx="5382260" cy="3274060"/>
+            <wp:effectExtent l="0" t="0" r="8890" b="2540"/>
+            <wp:docPr id="27" name="Image 27"/>
+            <wp:cNvGraphicFramePr>
+              <a:graphicFrameLocks xmlns:a="http://schemas.openxmlformats.org/drawingml/2006/main" noChangeAspect="1"/>
+            </wp:cNvGraphicFramePr>
+            <a:graphic xmlns:a="http://schemas.openxmlformats.org/drawingml/2006/main">
+              <a:graphicData uri="http://schemas.openxmlformats.org/drawingml/2006/picture">
+                <pic:pic xmlns:pic="http://schemas.openxmlformats.org/drawingml/2006/picture">
+                  <pic:nvPicPr>
+                    <pic:cNvPr id="27" name="Capture d'écran 2026-09-10 110640.png"/>
+                    <pic:cNvPicPr/>
+                  </pic:nvPicPr>
+                  <pic:blipFill>
+                    <a:blip r:embed="rId29">
+                      <a:extLst>
+                        <a:ext uri="{28A0092B-C50C-407E-A947-70E740481C1C}">
+                          <a14:useLocalDpi xmlns:a14="http://schemas.microsoft.com/office/drawing/2010/main" val="0"/>
+                        </a:ext>
+                      </a:extLst>
+                    </a:blip>
+                    <a:stretch>
+                      <a:fillRect/>
+                    </a:stretch>
+                  </pic:blipFill>
+                  <pic:spPr>
+                    <a:xfrm>
+                      <a:off x="0" y="0"/>
+                      <a:ext cx="5382260" cy="3274060"/>
+                    </a:xfrm>
+                    <a:prstGeom prst="rect">
+                      <a:avLst/>
+                    </a:prstGeom>
+                  </pic:spPr>
+                </pic:pic>
+              </a:graphicData>
+            </a:graphic>
+          </wp:inline>
+        </w:drawing>
+      </w:r>
+      <w:r>
+        <w:rPr>
+          <w:noProof/>
+        </w:rPr>
+        <w:lastRenderedPageBreak/>
+        <w:drawing>
+          <wp:inline distT="0" distB="0" distL="0" distR="0" wp14:anchorId="4CB2CDB6" wp14:editId="065E05EE">
+            <wp:extent cx="5382260" cy="2995930"/>
+            <wp:effectExtent l="0" t="0" r="8890" b="0"/>
+            <wp:docPr id="28" name="Image 28"/>
+            <wp:cNvGraphicFramePr>
+              <a:graphicFrameLocks xmlns:a="http://schemas.openxmlformats.org/drawingml/2006/main" noChangeAspect="1"/>
+            </wp:cNvGraphicFramePr>
+            <a:graphic xmlns:a="http://schemas.openxmlformats.org/drawingml/2006/main">
+              <a:graphicData uri="http://schemas.openxmlformats.org/drawingml/2006/picture">
+                <pic:pic xmlns:pic="http://schemas.openxmlformats.org/drawingml/2006/picture">
+                  <pic:nvPicPr>
+                    <pic:cNvPr id="28" name="Capture d'écran 2026-09-10 110649.png"/>
+                    <pic:cNvPicPr/>
+                  </pic:nvPicPr>
+                  <pic:blipFill>
+                    <a:blip r:embed="rId30">
+                      <a:extLst>
+                        <a:ext uri="{28A0092B-C50C-407E-A947-70E740481C1C}">
+                          <a14:useLocalDpi xmlns:a14="http://schemas.microsoft.com/office/drawing/2010/main" val="0"/>
+                        </a:ext>
+                      </a:extLst>
+                    </a:blip>
+                    <a:stretch>
+                      <a:fillRect/>
+                    </a:stretch>
+                  </pic:blipFill>
+                  <pic:spPr>
+                    <a:xfrm>
+                      <a:off x="0" y="0"/>
+                      <a:ext cx="5382260" cy="2995930"/>
+                    </a:xfrm>
+                    <a:prstGeom prst="rect">
+                      <a:avLst/>
+                    </a:prstGeom>
+                  </pic:spPr>
+                </pic:pic>
+              </a:graphicData>
+            </a:graphic>
+          </wp:inline>
+        </w:drawing>
+      </w:r>
+      <w:bookmarkStart w:id="0" w:name="_GoBack"/>
+      <w:r>
+        <w:rPr>
+          <w:noProof/>
+        </w:rPr>
+        <w:drawing>
+          <wp:inline distT="0" distB="0" distL="0" distR="0" wp14:anchorId="5C75FF4B" wp14:editId="4B789CDD">
+            <wp:extent cx="5382260" cy="3505835"/>
+            <wp:effectExtent l="0" t="0" r="8890" b="0"/>
+            <wp:docPr id="29" name="Image 29"/>
+            <wp:cNvGraphicFramePr>
+              <a:graphicFrameLocks xmlns:a="http://schemas.openxmlformats.org/drawingml/2006/main" noChangeAspect="1"/>
+            </wp:cNvGraphicFramePr>
+            <a:graphic xmlns:a="http://schemas.openxmlformats.org/drawingml/2006/main">
+              <a:graphicData uri="http://schemas.openxmlformats.org/drawingml/2006/picture">
+                <pic:pic xmlns:pic="http://schemas.openxmlformats.org/drawingml/2006/picture">
+                  <pic:nvPicPr>
+                    <pic:cNvPr id="29" name="Capture d'écran 2026-09-10 110658.png"/>
+                    <pic:cNvPicPr/>
+                  </pic:nvPicPr>
+                  <pic:blipFill>
+                    <a:blip r:embed="rId31">
+                      <a:extLst>
+                        <a:ext uri="{28A0092B-C50C-407E-A947-70E740481C1C}">
+                          <a14:useLocalDpi xmlns:a14="http://schemas.microsoft.com/office/drawing/2010/main" val="0"/>
+                        </a:ext>
+                      </a:extLst>
+                    </a:blip>
+                    <a:stretch>
+                      <a:fillRect/>
+                    </a:stretch>
+                  </pic:blipFill>
+                  <pic:spPr>
+                    <a:xfrm>
+                      <a:off x="0" y="0"/>
+                      <a:ext cx="5382260" cy="3505835"/>
+                    </a:xfrm>
+                    <a:prstGeom prst="rect">
+                      <a:avLst/>
+                    </a:prstGeom>
+                  </pic:spPr>
+                </pic:pic>
+              </a:graphicData>
+            </a:graphic>
+          </wp:inline>
+        </w:drawing>
+      </w:r>
+      <w:bookmarkEnd w:id="0"/>
+    </w:p>
+    <w:p>
+      <w:pPr>
+        <w:spacing w:after="122"/>
+        <w:ind w:left="326" w:right="0" w:firstLine="0"/>
+      </w:pPr>
+      <w:r>
+        <w:rPr>
+          <w:noProof/>
+        </w:rPr>
+        <w:lastRenderedPageBreak/>
+        <w:drawing>
           <wp:inline distT="0" distB="0" distL="0" distR="0" wp14:anchorId="2A88A873" wp14:editId="0C71ECDA">
             <wp:extent cx="5382260" cy="3138805"/>
             <wp:effectExtent l="0" t="0" r="8890" b="4445"/>
@@ -4358,7 +4610,7 @@
                     <pic:cNvPicPr/>
                   </pic:nvPicPr>
                   <pic:blipFill>
-                    <a:blip r:embed="rId27">
+                    <a:blip r:embed="rId32">
                       <a:extLst>
                         <a:ext uri="{28A0092B-C50C-407E-A947-70E740481C1C}">
                           <a14:useLocalDpi xmlns:a14="http://schemas.microsoft.com/office/drawing/2010/main" val="0"/>
@@ -4404,7 +4656,7 @@
                     <pic:cNvPicPr/>
                   </pic:nvPicPr>
                   <pic:blipFill>
-                    <a:blip r:embed="rId28">
+                    <a:blip r:embed="rId33">
                       <a:extLst>
                         <a:ext uri="{28A0092B-C50C-407E-A947-70E740481C1C}">
                           <a14:useLocalDpi xmlns:a14="http://schemas.microsoft.com/office/drawing/2010/main" val="0"/>
@@ -4451,7 +4703,7 @@
                     <pic:cNvPicPr/>
                   </pic:nvPicPr>
                   <pic:blipFill>
-                    <a:blip r:embed="rId29">
+                    <a:blip r:embed="rId34">
                       <a:extLst>
                         <a:ext uri="{28A0092B-C50C-407E-A947-70E740481C1C}">
                           <a14:useLocalDpi xmlns:a14="http://schemas.microsoft.com/office/drawing/2010/main" val="0"/>
@@ -4498,7 +4750,7 @@
                     <pic:cNvPicPr/>
                   </pic:nvPicPr>
                   <pic:blipFill>
-                    <a:blip r:embed="rId30">
+                    <a:blip r:embed="rId35">
                       <a:extLst>
                         <a:ext uri="{28A0092B-C50C-407E-A947-70E740481C1C}">
                           <a14:useLocalDpi xmlns:a14="http://schemas.microsoft.com/office/drawing/2010/main" val="0"/>
@@ -4545,8 +4797,6 @@
       <w:r>
         <w:t>.</w:t>
       </w:r>
-      <w:bookmarkStart w:id="0" w:name="_GoBack"/>
-      <w:bookmarkEnd w:id="0"/>
     </w:p>
     <w:p>
       <w:pPr>
@@ -4904,9 +5154,9 @@
       </w:r>
     </w:p>
     <w:sectPr>
-      <w:footerReference w:type="even" r:id="rId31"/>
-      <w:footerReference w:type="default" r:id="rId32"/>
-      <w:footerReference w:type="first" r:id="rId33"/>
+      <w:footerReference w:type="even" r:id="rId36"/>
+      <w:footerReference w:type="default" r:id="rId37"/>
+      <w:footerReference w:type="first" r:id="rId38"/>
       <w:pgSz w:w="12240" w:h="15840"/>
       <w:pgMar w:top="1404" w:right="1892" w:bottom="1567" w:left="1872" w:header="720" w:footer="681" w:gutter="0"/>
       <w:cols w:space="720"/>

</xml_diff>

<commit_message>
permettant d’expliquer les métriques de classification (Accuracy, Precision, Recall, F1-score, ROC-AUC)
</commit_message>
<xml_diff>
--- a/ai-business_assistant/atelier-prompt-engineering.docx
+++ b/ai-business_assistant/atelier-prompt-engineering.docx
@@ -4686,8 +4686,6 @@
           </wp:inline>
         </w:drawing>
       </w:r>
-      <w:bookmarkStart w:id="0" w:name="_GoBack"/>
-      <w:bookmarkEnd w:id="0"/>
     </w:p>
     <w:p>
       <w:pPr>
@@ -4880,6 +4878,251 @@
     </w:p>
     <w:p>
       <w:pPr>
+        <w:spacing w:after="122"/>
+        <w:ind w:left="664" w:right="0" w:firstLine="0"/>
+      </w:pPr>
+      <w:r>
+        <w:rPr>
+          <w:noProof/>
+        </w:rPr>
+        <w:lastRenderedPageBreak/>
+        <w:drawing>
+          <wp:inline distT="0" distB="0" distL="0" distR="0" wp14:anchorId="67078697" wp14:editId="7A6CF8C7">
+            <wp:extent cx="5382260" cy="1931035"/>
+            <wp:effectExtent l="0" t="0" r="8890" b="0"/>
+            <wp:docPr id="36" name="Image 36"/>
+            <wp:cNvGraphicFramePr>
+              <a:graphicFrameLocks xmlns:a="http://schemas.openxmlformats.org/drawingml/2006/main" noChangeAspect="1"/>
+            </wp:cNvGraphicFramePr>
+            <a:graphic xmlns:a="http://schemas.openxmlformats.org/drawingml/2006/main">
+              <a:graphicData uri="http://schemas.openxmlformats.org/drawingml/2006/picture">
+                <pic:pic xmlns:pic="http://schemas.openxmlformats.org/drawingml/2006/picture">
+                  <pic:nvPicPr>
+                    <pic:cNvPr id="36" name="Capture d'écran 2026-09-10 111058.png"/>
+                    <pic:cNvPicPr/>
+                  </pic:nvPicPr>
+                  <pic:blipFill>
+                    <a:blip r:embed="rId36">
+                      <a:extLst>
+                        <a:ext uri="{28A0092B-C50C-407E-A947-70E740481C1C}">
+                          <a14:useLocalDpi xmlns:a14="http://schemas.microsoft.com/office/drawing/2010/main" val="0"/>
+                        </a:ext>
+                      </a:extLst>
+                    </a:blip>
+                    <a:stretch>
+                      <a:fillRect/>
+                    </a:stretch>
+                  </pic:blipFill>
+                  <pic:spPr>
+                    <a:xfrm>
+                      <a:off x="0" y="0"/>
+                      <a:ext cx="5382260" cy="1931035"/>
+                    </a:xfrm>
+                    <a:prstGeom prst="rect">
+                      <a:avLst/>
+                    </a:prstGeom>
+                  </pic:spPr>
+                </pic:pic>
+              </a:graphicData>
+            </a:graphic>
+          </wp:inline>
+        </w:drawing>
+      </w:r>
+      <w:r>
+        <w:rPr>
+          <w:noProof/>
+        </w:rPr>
+        <w:drawing>
+          <wp:inline distT="0" distB="0" distL="0" distR="0" wp14:anchorId="14F23191" wp14:editId="70E54BD8">
+            <wp:extent cx="5382260" cy="3307715"/>
+            <wp:effectExtent l="0" t="0" r="8890" b="6985"/>
+            <wp:docPr id="37" name="Image 37"/>
+            <wp:cNvGraphicFramePr>
+              <a:graphicFrameLocks xmlns:a="http://schemas.openxmlformats.org/drawingml/2006/main" noChangeAspect="1"/>
+            </wp:cNvGraphicFramePr>
+            <a:graphic xmlns:a="http://schemas.openxmlformats.org/drawingml/2006/main">
+              <a:graphicData uri="http://schemas.openxmlformats.org/drawingml/2006/picture">
+                <pic:pic xmlns:pic="http://schemas.openxmlformats.org/drawingml/2006/picture">
+                  <pic:nvPicPr>
+                    <pic:cNvPr id="37" name="Capture d'écran 2026-09-10 112342.png"/>
+                    <pic:cNvPicPr/>
+                  </pic:nvPicPr>
+                  <pic:blipFill>
+                    <a:blip r:embed="rId37">
+                      <a:extLst>
+                        <a:ext uri="{28A0092B-C50C-407E-A947-70E740481C1C}">
+                          <a14:useLocalDpi xmlns:a14="http://schemas.microsoft.com/office/drawing/2010/main" val="0"/>
+                        </a:ext>
+                      </a:extLst>
+                    </a:blip>
+                    <a:stretch>
+                      <a:fillRect/>
+                    </a:stretch>
+                  </pic:blipFill>
+                  <pic:spPr>
+                    <a:xfrm>
+                      <a:off x="0" y="0"/>
+                      <a:ext cx="5382260" cy="3307715"/>
+                    </a:xfrm>
+                    <a:prstGeom prst="rect">
+                      <a:avLst/>
+                    </a:prstGeom>
+                  </pic:spPr>
+                </pic:pic>
+              </a:graphicData>
+            </a:graphic>
+          </wp:inline>
+        </w:drawing>
+      </w:r>
+    </w:p>
+    <w:p>
+      <w:pPr>
+        <w:spacing w:after="122"/>
+        <w:ind w:left="664" w:right="0" w:firstLine="0"/>
+      </w:pPr>
+      <w:r>
+        <w:rPr>
+          <w:noProof/>
+        </w:rPr>
+        <w:lastRenderedPageBreak/>
+        <w:drawing>
+          <wp:inline distT="0" distB="0" distL="0" distR="0" wp14:anchorId="6A2AD6BA" wp14:editId="48987C3B">
+            <wp:extent cx="5382260" cy="3990975"/>
+            <wp:effectExtent l="0" t="0" r="8890" b="9525"/>
+            <wp:docPr id="38" name="Image 38"/>
+            <wp:cNvGraphicFramePr>
+              <a:graphicFrameLocks xmlns:a="http://schemas.openxmlformats.org/drawingml/2006/main" noChangeAspect="1"/>
+            </wp:cNvGraphicFramePr>
+            <a:graphic xmlns:a="http://schemas.openxmlformats.org/drawingml/2006/main">
+              <a:graphicData uri="http://schemas.openxmlformats.org/drawingml/2006/picture">
+                <pic:pic xmlns:pic="http://schemas.openxmlformats.org/drawingml/2006/picture">
+                  <pic:nvPicPr>
+                    <pic:cNvPr id="38" name="Capture d'écran 2026-09-10 112436.png"/>
+                    <pic:cNvPicPr/>
+                  </pic:nvPicPr>
+                  <pic:blipFill>
+                    <a:blip r:embed="rId38">
+                      <a:extLst>
+                        <a:ext uri="{28A0092B-C50C-407E-A947-70E740481C1C}">
+                          <a14:useLocalDpi xmlns:a14="http://schemas.microsoft.com/office/drawing/2010/main" val="0"/>
+                        </a:ext>
+                      </a:extLst>
+                    </a:blip>
+                    <a:stretch>
+                      <a:fillRect/>
+                    </a:stretch>
+                  </pic:blipFill>
+                  <pic:spPr>
+                    <a:xfrm>
+                      <a:off x="0" y="0"/>
+                      <a:ext cx="5382260" cy="3990975"/>
+                    </a:xfrm>
+                    <a:prstGeom prst="rect">
+                      <a:avLst/>
+                    </a:prstGeom>
+                  </pic:spPr>
+                </pic:pic>
+              </a:graphicData>
+            </a:graphic>
+          </wp:inline>
+        </w:drawing>
+      </w:r>
+      <w:r>
+        <w:rPr>
+          <w:noProof/>
+        </w:rPr>
+        <w:drawing>
+          <wp:inline distT="0" distB="0" distL="0" distR="0" wp14:anchorId="3151D102" wp14:editId="68A482B2">
+            <wp:extent cx="5382260" cy="2701290"/>
+            <wp:effectExtent l="0" t="0" r="8890" b="3810"/>
+            <wp:docPr id="40" name="Image 40"/>
+            <wp:cNvGraphicFramePr>
+              <a:graphicFrameLocks xmlns:a="http://schemas.openxmlformats.org/drawingml/2006/main" noChangeAspect="1"/>
+            </wp:cNvGraphicFramePr>
+            <a:graphic xmlns:a="http://schemas.openxmlformats.org/drawingml/2006/main">
+              <a:graphicData uri="http://schemas.openxmlformats.org/drawingml/2006/picture">
+                <pic:pic xmlns:pic="http://schemas.openxmlformats.org/drawingml/2006/picture">
+                  <pic:nvPicPr>
+                    <pic:cNvPr id="40" name="Capture d'écran 2026-09-10 112510.png"/>
+                    <pic:cNvPicPr/>
+                  </pic:nvPicPr>
+                  <pic:blipFill>
+                    <a:blip r:embed="rId39">
+                      <a:extLst>
+                        <a:ext uri="{28A0092B-C50C-407E-A947-70E740481C1C}">
+                          <a14:useLocalDpi xmlns:a14="http://schemas.microsoft.com/office/drawing/2010/main" val="0"/>
+                        </a:ext>
+                      </a:extLst>
+                    </a:blip>
+                    <a:stretch>
+                      <a:fillRect/>
+                    </a:stretch>
+                  </pic:blipFill>
+                  <pic:spPr>
+                    <a:xfrm>
+                      <a:off x="0" y="0"/>
+                      <a:ext cx="5382260" cy="2701290"/>
+                    </a:xfrm>
+                    <a:prstGeom prst="rect">
+                      <a:avLst/>
+                    </a:prstGeom>
+                  </pic:spPr>
+                </pic:pic>
+              </a:graphicData>
+            </a:graphic>
+          </wp:inline>
+        </w:drawing>
+      </w:r>
+      <w:r>
+        <w:rPr>
+          <w:noProof/>
+        </w:rPr>
+        <w:lastRenderedPageBreak/>
+        <w:drawing>
+          <wp:inline distT="0" distB="0" distL="0" distR="0" wp14:anchorId="24E5EA02" wp14:editId="69B7505A">
+            <wp:extent cx="5382260" cy="4144010"/>
+            <wp:effectExtent l="0" t="0" r="8890" b="8890"/>
+            <wp:docPr id="41" name="Image 41"/>
+            <wp:cNvGraphicFramePr>
+              <a:graphicFrameLocks xmlns:a="http://schemas.openxmlformats.org/drawingml/2006/main" noChangeAspect="1"/>
+            </wp:cNvGraphicFramePr>
+            <a:graphic xmlns:a="http://schemas.openxmlformats.org/drawingml/2006/main">
+              <a:graphicData uri="http://schemas.openxmlformats.org/drawingml/2006/picture">
+                <pic:pic xmlns:pic="http://schemas.openxmlformats.org/drawingml/2006/picture">
+                  <pic:nvPicPr>
+                    <pic:cNvPr id="41" name="Capture d'écran 2026-09-10 112521.png"/>
+                    <pic:cNvPicPr/>
+                  </pic:nvPicPr>
+                  <pic:blipFill>
+                    <a:blip r:embed="rId40">
+                      <a:extLst>
+                        <a:ext uri="{28A0092B-C50C-407E-A947-70E740481C1C}">
+                          <a14:useLocalDpi xmlns:a14="http://schemas.microsoft.com/office/drawing/2010/main" val="0"/>
+                        </a:ext>
+                      </a:extLst>
+                    </a:blip>
+                    <a:stretch>
+                      <a:fillRect/>
+                    </a:stretch>
+                  </pic:blipFill>
+                  <pic:spPr>
+                    <a:xfrm>
+                      <a:off x="0" y="0"/>
+                      <a:ext cx="5382260" cy="4144010"/>
+                    </a:xfrm>
+                    <a:prstGeom prst="rect">
+                      <a:avLst/>
+                    </a:prstGeom>
+                  </pic:spPr>
+                </pic:pic>
+              </a:graphicData>
+            </a:graphic>
+          </wp:inline>
+        </w:drawing>
+      </w:r>
+    </w:p>
+    <w:p>
+      <w:pPr>
         <w:numPr>
           <w:ilvl w:val="0"/>
           <w:numId w:val="3"/>
@@ -4888,7 +5131,12 @@
         <w:ind w:right="0" w:hanging="338"/>
       </w:pPr>
       <w:r>
-        <w:t xml:space="preserve">Créer un prompt permettant d’expliquer les métriques de Régression (MAE, MSE, RMSE). Pour chacune, le LLM doit donner la définition, expliquer son interprétation, donner un exemple concret et indiquer dans quel contexte elle est particulièrement utile. </w:t>
+        <w:t>Créer un prompt permettant d’expliquer les métriques de Régression (MAE, MSE, RMSE). Pour chacune, le LLM doit donner</w:t>
+      </w:r>
+      <w:bookmarkStart w:id="0" w:name="_GoBack"/>
+      <w:bookmarkEnd w:id="0"/>
+      <w:r>
+        <w:t xml:space="preserve"> la définition, expliquer son interprétation, donner un exemple concret et indiquer dans quel contexte elle est particulièrement utile. </w:t>
       </w:r>
     </w:p>
     <w:p>
@@ -5056,7 +5304,6 @@
         <w:ind w:right="0"/>
       </w:pPr>
       <w:r>
-        <w:lastRenderedPageBreak/>
         <w:t xml:space="preserve">Proposer et réaliser toute activité pertinente et utile qu’on pourrait rajouter à l’atelier. </w:t>
       </w:r>
     </w:p>
@@ -5066,6 +5313,7 @@
         <w:ind w:left="-5"/>
       </w:pPr>
       <w:r>
+        <w:lastRenderedPageBreak/>
         <w:t xml:space="preserve">Livrable attendu </w:t>
       </w:r>
     </w:p>
@@ -5170,9 +5418,9 @@
       </w:r>
     </w:p>
     <w:sectPr>
-      <w:footerReference w:type="even" r:id="rId36"/>
-      <w:footerReference w:type="default" r:id="rId37"/>
-      <w:footerReference w:type="first" r:id="rId38"/>
+      <w:footerReference w:type="even" r:id="rId41"/>
+      <w:footerReference w:type="default" r:id="rId42"/>
+      <w:footerReference w:type="first" r:id="rId43"/>
       <w:pgSz w:w="12240" w:h="15840"/>
       <w:pgMar w:top="1404" w:right="1892" w:bottom="1567" w:left="1872" w:header="720" w:footer="681" w:gutter="0"/>
       <w:cols w:space="720"/>

</xml_diff>

<commit_message>
prompt permettant d’expliquer les métriques de Régression (MAE, MSE, RMSE)
</commit_message>
<xml_diff>
--- a/ai-business_assistant/atelier-prompt-engineering.docx
+++ b/ai-business_assistant/atelier-prompt-engineering.docx
@@ -5131,13 +5131,214 @@
         <w:ind w:right="0" w:hanging="338"/>
       </w:pPr>
       <w:r>
-        <w:t>Créer un prompt permettant d’expliquer les métriques de Régression (MAE, MSE, RMSE). Pour chacune, le LLM doit donner</w:t>
+        <w:t xml:space="preserve">Créer un prompt permettant d’expliquer les métriques de Régression (MAE, MSE, RMSE). Pour chacune, le LLM doit donner la définition, expliquer son interprétation, donner un exemple concret et indiquer dans quel contexte elle est particulièrement utile. </w:t>
+      </w:r>
+    </w:p>
+    <w:p>
+      <w:pPr>
+        <w:spacing w:after="158"/>
+        <w:ind w:left="664" w:right="0" w:firstLine="0"/>
+      </w:pPr>
+      <w:r>
+        <w:rPr>
+          <w:noProof/>
+        </w:rPr>
+        <w:drawing>
+          <wp:inline distT="0" distB="0" distL="0" distR="0" wp14:anchorId="0AC0203C" wp14:editId="34E5D96A">
+            <wp:extent cx="5382260" cy="1885950"/>
+            <wp:effectExtent l="0" t="0" r="8890" b="0"/>
+            <wp:docPr id="42" name="Image 42"/>
+            <wp:cNvGraphicFramePr>
+              <a:graphicFrameLocks xmlns:a="http://schemas.openxmlformats.org/drawingml/2006/main" noChangeAspect="1"/>
+            </wp:cNvGraphicFramePr>
+            <a:graphic xmlns:a="http://schemas.openxmlformats.org/drawingml/2006/main">
+              <a:graphicData uri="http://schemas.openxmlformats.org/drawingml/2006/picture">
+                <pic:pic xmlns:pic="http://schemas.openxmlformats.org/drawingml/2006/picture">
+                  <pic:nvPicPr>
+                    <pic:cNvPr id="42" name="Capture d'écran 2026-09-10 113512.png"/>
+                    <pic:cNvPicPr/>
+                  </pic:nvPicPr>
+                  <pic:blipFill>
+                    <a:blip r:embed="rId41">
+                      <a:extLst>
+                        <a:ext uri="{28A0092B-C50C-407E-A947-70E740481C1C}">
+                          <a14:useLocalDpi xmlns:a14="http://schemas.microsoft.com/office/drawing/2010/main" val="0"/>
+                        </a:ext>
+                      </a:extLst>
+                    </a:blip>
+                    <a:stretch>
+                      <a:fillRect/>
+                    </a:stretch>
+                  </pic:blipFill>
+                  <pic:spPr>
+                    <a:xfrm>
+                      <a:off x="0" y="0"/>
+                      <a:ext cx="5382260" cy="1885950"/>
+                    </a:xfrm>
+                    <a:prstGeom prst="rect">
+                      <a:avLst/>
+                    </a:prstGeom>
+                  </pic:spPr>
+                </pic:pic>
+              </a:graphicData>
+            </a:graphic>
+          </wp:inline>
+        </w:drawing>
+      </w:r>
+    </w:p>
+    <w:p>
+      <w:pPr>
+        <w:spacing w:after="158"/>
+        <w:ind w:left="664" w:right="0" w:firstLine="0"/>
+      </w:pPr>
+      <w:r>
+        <w:rPr>
+          <w:noProof/>
+        </w:rPr>
+        <w:lastRenderedPageBreak/>
+        <w:drawing>
+          <wp:inline distT="0" distB="0" distL="0" distR="0" wp14:anchorId="740E7EB7" wp14:editId="7F91026E">
+            <wp:extent cx="5382260" cy="1885950"/>
+            <wp:effectExtent l="0" t="0" r="8890" b="0"/>
+            <wp:docPr id="43" name="Image 43"/>
+            <wp:cNvGraphicFramePr>
+              <a:graphicFrameLocks xmlns:a="http://schemas.openxmlformats.org/drawingml/2006/main" noChangeAspect="1"/>
+            </wp:cNvGraphicFramePr>
+            <a:graphic xmlns:a="http://schemas.openxmlformats.org/drawingml/2006/main">
+              <a:graphicData uri="http://schemas.openxmlformats.org/drawingml/2006/picture">
+                <pic:pic xmlns:pic="http://schemas.openxmlformats.org/drawingml/2006/picture">
+                  <pic:nvPicPr>
+                    <pic:cNvPr id="43" name="Capture d'écran 2026-09-10 113512.png"/>
+                    <pic:cNvPicPr/>
+                  </pic:nvPicPr>
+                  <pic:blipFill>
+                    <a:blip r:embed="rId41">
+                      <a:extLst>
+                        <a:ext uri="{28A0092B-C50C-407E-A947-70E740481C1C}">
+                          <a14:useLocalDpi xmlns:a14="http://schemas.microsoft.com/office/drawing/2010/main" val="0"/>
+                        </a:ext>
+                      </a:extLst>
+                    </a:blip>
+                    <a:stretch>
+                      <a:fillRect/>
+                    </a:stretch>
+                  </pic:blipFill>
+                  <pic:spPr>
+                    <a:xfrm>
+                      <a:off x="0" y="0"/>
+                      <a:ext cx="5382260" cy="1885950"/>
+                    </a:xfrm>
+                    <a:prstGeom prst="rect">
+                      <a:avLst/>
+                    </a:prstGeom>
+                  </pic:spPr>
+                </pic:pic>
+              </a:graphicData>
+            </a:graphic>
+          </wp:inline>
+        </w:drawing>
+      </w:r>
+      <w:r>
+        <w:rPr>
+          <w:noProof/>
+        </w:rPr>
+        <w:drawing>
+          <wp:inline distT="0" distB="0" distL="0" distR="0" wp14:anchorId="1AD8D400" wp14:editId="08FECC99">
+            <wp:extent cx="5382260" cy="4439285"/>
+            <wp:effectExtent l="0" t="0" r="8890" b="0"/>
+            <wp:docPr id="44" name="Image 44"/>
+            <wp:cNvGraphicFramePr>
+              <a:graphicFrameLocks xmlns:a="http://schemas.openxmlformats.org/drawingml/2006/main" noChangeAspect="1"/>
+            </wp:cNvGraphicFramePr>
+            <a:graphic xmlns:a="http://schemas.openxmlformats.org/drawingml/2006/main">
+              <a:graphicData uri="http://schemas.openxmlformats.org/drawingml/2006/picture">
+                <pic:pic xmlns:pic="http://schemas.openxmlformats.org/drawingml/2006/picture">
+                  <pic:nvPicPr>
+                    <pic:cNvPr id="44" name="Capture d'écran 2026-09-10 114051.png"/>
+                    <pic:cNvPicPr/>
+                  </pic:nvPicPr>
+                  <pic:blipFill>
+                    <a:blip r:embed="rId42">
+                      <a:extLst>
+                        <a:ext uri="{28A0092B-C50C-407E-A947-70E740481C1C}">
+                          <a14:useLocalDpi xmlns:a14="http://schemas.microsoft.com/office/drawing/2010/main" val="0"/>
+                        </a:ext>
+                      </a:extLst>
+                    </a:blip>
+                    <a:stretch>
+                      <a:fillRect/>
+                    </a:stretch>
+                  </pic:blipFill>
+                  <pic:spPr>
+                    <a:xfrm>
+                      <a:off x="0" y="0"/>
+                      <a:ext cx="5382260" cy="4439285"/>
+                    </a:xfrm>
+                    <a:prstGeom prst="rect">
+                      <a:avLst/>
+                    </a:prstGeom>
+                  </pic:spPr>
+                </pic:pic>
+              </a:graphicData>
+            </a:graphic>
+          </wp:inline>
+        </w:drawing>
+      </w:r>
+    </w:p>
+    <w:p>
+      <w:pPr>
+        <w:spacing w:after="158"/>
+        <w:ind w:left="664" w:right="0" w:firstLine="0"/>
+      </w:pPr>
+      <w:r>
+        <w:rPr>
+          <w:noProof/>
+        </w:rPr>
+        <w:lastRenderedPageBreak/>
+        <w:drawing>
+          <wp:inline distT="0" distB="0" distL="0" distR="0" wp14:anchorId="3A92A940" wp14:editId="7992BFFB">
+            <wp:extent cx="5382260" cy="3653790"/>
+            <wp:effectExtent l="0" t="0" r="8890" b="3810"/>
+            <wp:docPr id="45" name="Image 45"/>
+            <wp:cNvGraphicFramePr>
+              <a:graphicFrameLocks xmlns:a="http://schemas.openxmlformats.org/drawingml/2006/main" noChangeAspect="1"/>
+            </wp:cNvGraphicFramePr>
+            <a:graphic xmlns:a="http://schemas.openxmlformats.org/drawingml/2006/main">
+              <a:graphicData uri="http://schemas.openxmlformats.org/drawingml/2006/picture">
+                <pic:pic xmlns:pic="http://schemas.openxmlformats.org/drawingml/2006/picture">
+                  <pic:nvPicPr>
+                    <pic:cNvPr id="45" name="Capture d'écran 2026-09-10 114120.png"/>
+                    <pic:cNvPicPr/>
+                  </pic:nvPicPr>
+                  <pic:blipFill>
+                    <a:blip r:embed="rId43">
+                      <a:extLst>
+                        <a:ext uri="{28A0092B-C50C-407E-A947-70E740481C1C}">
+                          <a14:useLocalDpi xmlns:a14="http://schemas.microsoft.com/office/drawing/2010/main" val="0"/>
+                        </a:ext>
+                      </a:extLst>
+                    </a:blip>
+                    <a:stretch>
+                      <a:fillRect/>
+                    </a:stretch>
+                  </pic:blipFill>
+                  <pic:spPr>
+                    <a:xfrm>
+                      <a:off x="0" y="0"/>
+                      <a:ext cx="5382260" cy="3653790"/>
+                    </a:xfrm>
+                    <a:prstGeom prst="rect">
+                      <a:avLst/>
+                    </a:prstGeom>
+                  </pic:spPr>
+                </pic:pic>
+              </a:graphicData>
+            </a:graphic>
+          </wp:inline>
+        </w:drawing>
       </w:r>
       <w:bookmarkStart w:id="0" w:name="_GoBack"/>
       <w:bookmarkEnd w:id="0"/>
-      <w:r>
-        <w:t xml:space="preserve"> la définition, expliquer son interprétation, donner un exemple concret et indiquer dans quel contexte elle est particulièrement utile. </w:t>
-      </w:r>
     </w:p>
     <w:p>
       <w:pPr>
@@ -5313,7 +5514,6 @@
         <w:ind w:left="-5"/>
       </w:pPr>
       <w:r>
-        <w:lastRenderedPageBreak/>
         <w:t xml:space="preserve">Livrable attendu </w:t>
       </w:r>
     </w:p>
@@ -5410,6 +5610,7 @@
       </w:pPr>
       <w:proofErr w:type="gramStart"/>
       <w:r>
+        <w:lastRenderedPageBreak/>
         <w:t>met</w:t>
       </w:r>
       <w:proofErr w:type="gramEnd"/>
@@ -5418,9 +5619,9 @@
       </w:r>
     </w:p>
     <w:sectPr>
-      <w:footerReference w:type="even" r:id="rId41"/>
-      <w:footerReference w:type="default" r:id="rId42"/>
-      <w:footerReference w:type="first" r:id="rId43"/>
+      <w:footerReference w:type="even" r:id="rId44"/>
+      <w:footerReference w:type="default" r:id="rId45"/>
+      <w:footerReference w:type="first" r:id="rId46"/>
       <w:pgSz w:w="12240" w:h="15840"/>
       <w:pgMar w:top="1404" w:right="1892" w:bottom="1567" w:left="1872" w:header="720" w:footer="681" w:gutter="0"/>
       <w:cols w:space="720"/>

</xml_diff>

<commit_message>
Prompt A : poser la question sans fournir le document au LLM
</commit_message>
<xml_diff>
--- a/ai-business_assistant/atelier-prompt-engineering.docx
+++ b/ai-business_assistant/atelier-prompt-engineering.docx
@@ -5337,8 +5337,6 @@
           </wp:inline>
         </w:drawing>
       </w:r>
-      <w:bookmarkStart w:id="0" w:name="_GoBack"/>
-      <w:bookmarkEnd w:id="0"/>
     </w:p>
     <w:p>
       <w:pPr>
@@ -5392,6 +5390,11 @@
       <w:pPr>
         <w:ind w:left="675" w:right="0"/>
       </w:pPr>
+    </w:p>
+    <w:p>
+      <w:pPr>
+        <w:ind w:left="675" w:right="0"/>
+      </w:pPr>
       <w:r>
         <w:t xml:space="preserve">Prompt B : poser la question en fournissant le document </w:t>
       </w:r>
@@ -5400,9 +5403,28 @@
       <w:pPr>
         <w:ind w:left="675" w:right="0"/>
       </w:pPr>
+    </w:p>
+    <w:p>
+      <w:pPr>
+        <w:ind w:left="675" w:right="0"/>
+      </w:pPr>
       <w:r>
         <w:t xml:space="preserve">Prompt C : poser la question en fournissant le document avec les contraintes : utiliser uniquement le contexte fourni ; ne pas inventer une information absente ; signaler lorsqu'une information n'est pas trouvée et éventuellement citer la source ou le passage utilisé. </w:t>
       </w:r>
+      <w:r>
+        <w:t>*</w:t>
+      </w:r>
+    </w:p>
+    <w:p>
+      <w:pPr>
+        <w:ind w:left="675" w:right="0"/>
+        <w:jc w:val="center"/>
+      </w:pPr>
+    </w:p>
+    <w:p>
+      <w:pPr>
+        <w:ind w:left="675" w:right="0"/>
+      </w:pPr>
     </w:p>
     <w:p>
       <w:pPr>
@@ -5416,7 +5438,9 @@
       <w:r>
         <w:t xml:space="preserve">Comparer les résultats. </w:t>
       </w:r>
-    </w:p>
+      <w:bookmarkStart w:id="0" w:name="_GoBack"/>
+    </w:p>
+    <w:bookmarkEnd w:id="0"/>
     <w:p>
       <w:pPr>
         <w:pStyle w:val="Titre1"/>
@@ -5564,6 +5588,7 @@
         <w:ind w:left="-5"/>
       </w:pPr>
       <w:r>
+        <w:lastRenderedPageBreak/>
         <w:t xml:space="preserve">Modalité de livraison </w:t>
       </w:r>
     </w:p>
@@ -5610,7 +5635,6 @@
       </w:pPr>
       <w:proofErr w:type="gramStart"/>
       <w:r>
-        <w:lastRenderedPageBreak/>
         <w:t>met</w:t>
       </w:r>
       <w:proofErr w:type="gramEnd"/>

</xml_diff>

<commit_message>
Prompt B : poser la question en fournissant le document
</commit_message>
<xml_diff>
--- a/ai-business_assistant/atelier-prompt-engineering.docx
+++ b/ai-business_assistant/atelier-prompt-engineering.docx
@@ -5390,7 +5390,6 @@
       <w:pPr>
         <w:ind w:left="675" w:right="0"/>
       </w:pPr>
-      <w:bookmarkStart w:id="0" w:name="_GoBack"/>
       <w:r>
         <w:rPr>
           <w:noProof/>
@@ -5437,7 +5436,6 @@
           </wp:inline>
         </w:drawing>
       </w:r>
-      <w:bookmarkEnd w:id="0"/>
     </w:p>
     <w:p>
       <w:pPr>
@@ -5451,6 +5449,53 @@
       <w:pPr>
         <w:ind w:left="675" w:right="0"/>
       </w:pPr>
+      <w:r>
+        <w:rPr>
+          <w:noProof/>
+        </w:rPr>
+        <w:lastRenderedPageBreak/>
+        <w:drawing>
+          <wp:inline distT="0" distB="0" distL="0" distR="0" wp14:anchorId="3B848ED1" wp14:editId="0BBF37E6">
+            <wp:extent cx="5382260" cy="3261995"/>
+            <wp:effectExtent l="0" t="0" r="8890" b="0"/>
+            <wp:docPr id="47" name="Image 47"/>
+            <wp:cNvGraphicFramePr>
+              <a:graphicFrameLocks xmlns:a="http://schemas.openxmlformats.org/drawingml/2006/main" noChangeAspect="1"/>
+            </wp:cNvGraphicFramePr>
+            <a:graphic xmlns:a="http://schemas.openxmlformats.org/drawingml/2006/main">
+              <a:graphicData uri="http://schemas.openxmlformats.org/drawingml/2006/picture">
+                <pic:pic xmlns:pic="http://schemas.openxmlformats.org/drawingml/2006/picture">
+                  <pic:nvPicPr>
+                    <pic:cNvPr id="47" name="Capture d'écran 2026-09-10 115617.png"/>
+                    <pic:cNvPicPr/>
+                  </pic:nvPicPr>
+                  <pic:blipFill>
+                    <a:blip r:embed="rId45">
+                      <a:extLst>
+                        <a:ext uri="{28A0092B-C50C-407E-A947-70E740481C1C}">
+                          <a14:useLocalDpi xmlns:a14="http://schemas.microsoft.com/office/drawing/2010/main" val="0"/>
+                        </a:ext>
+                      </a:extLst>
+                    </a:blip>
+                    <a:stretch>
+                      <a:fillRect/>
+                    </a:stretch>
+                  </pic:blipFill>
+                  <pic:spPr>
+                    <a:xfrm>
+                      <a:off x="0" y="0"/>
+                      <a:ext cx="5382260" cy="3261995"/>
+                    </a:xfrm>
+                    <a:prstGeom prst="rect">
+                      <a:avLst/>
+                    </a:prstGeom>
+                  </pic:spPr>
+                </pic:pic>
+              </a:graphicData>
+            </a:graphic>
+          </wp:inline>
+        </w:drawing>
+      </w:r>
     </w:p>
     <w:p>
       <w:pPr>
@@ -5466,9 +5511,10 @@
     <w:p>
       <w:pPr>
         <w:ind w:left="675" w:right="0"/>
-        <w:jc w:val="center"/>
-      </w:pPr>
-    </w:p>
+      </w:pPr>
+      <w:bookmarkStart w:id="0" w:name="_GoBack"/>
+    </w:p>
+    <w:bookmarkEnd w:id="0"/>
     <w:p>
       <w:pPr>
         <w:ind w:left="675" w:right="0"/>
@@ -5688,9 +5734,9 @@
       </w:r>
     </w:p>
     <w:sectPr>
-      <w:footerReference w:type="even" r:id="rId45"/>
-      <w:footerReference w:type="default" r:id="rId46"/>
-      <w:footerReference w:type="first" r:id="rId47"/>
+      <w:footerReference w:type="even" r:id="rId46"/>
+      <w:footerReference w:type="default" r:id="rId47"/>
+      <w:footerReference w:type="first" r:id="rId48"/>
       <w:pgSz w:w="12240" w:h="15840"/>
       <w:pgMar w:top="1404" w:right="1892" w:bottom="1567" w:left="1872" w:header="720" w:footer="681" w:gutter="0"/>
       <w:cols w:space="720"/>

</xml_diff>

<commit_message>
Prompt C : poser la question en fournissant le document avec les contraintes
</commit_message>
<xml_diff>
--- a/ai-business_assistant/atelier-prompt-engineering.docx
+++ b/ai-business_assistant/atelier-prompt-engineering.docx
@@ -5513,8 +5513,45 @@
         <w:ind w:left="675" w:right="0"/>
       </w:pPr>
       <w:bookmarkStart w:id="0" w:name="_GoBack"/>
-    </w:p>
-    <w:bookmarkEnd w:id="0"/>
+      <w:r>
+        <w:drawing>
+          <wp:inline distT="0" distB="0" distL="0" distR="0" wp14:anchorId="0906AF3B" wp14:editId="791E9FA8">
+            <wp:extent cx="5382260" cy="4050665"/>
+            <wp:effectExtent l="0" t="0" r="8890" b="6985"/>
+            <wp:docPr id="48" name="Image 48"/>
+            <wp:cNvGraphicFramePr>
+              <a:graphicFrameLocks xmlns:a="http://schemas.openxmlformats.org/drawingml/2006/main" noChangeAspect="1"/>
+            </wp:cNvGraphicFramePr>
+            <a:graphic xmlns:a="http://schemas.openxmlformats.org/drawingml/2006/main">
+              <a:graphicData uri="http://schemas.openxmlformats.org/drawingml/2006/picture">
+                <pic:pic xmlns:pic="http://schemas.openxmlformats.org/drawingml/2006/picture">
+                  <pic:nvPicPr>
+                    <pic:cNvPr id="1" name=""/>
+                    <pic:cNvPicPr/>
+                  </pic:nvPicPr>
+                  <pic:blipFill>
+                    <a:blip r:embed="rId46"/>
+                    <a:stretch>
+                      <a:fillRect/>
+                    </a:stretch>
+                  </pic:blipFill>
+                  <pic:spPr>
+                    <a:xfrm>
+                      <a:off x="0" y="0"/>
+                      <a:ext cx="5382260" cy="4050665"/>
+                    </a:xfrm>
+                    <a:prstGeom prst="rect">
+                      <a:avLst/>
+                    </a:prstGeom>
+                  </pic:spPr>
+                </pic:pic>
+              </a:graphicData>
+            </a:graphic>
+          </wp:inline>
+        </w:drawing>
+      </w:r>
+      <w:bookmarkEnd w:id="0"/>
+    </w:p>
     <w:p>
       <w:pPr>
         <w:ind w:left="675" w:right="0"/>
@@ -5530,6 +5567,7 @@
         <w:ind w:right="0" w:hanging="338"/>
       </w:pPr>
       <w:r>
+        <w:lastRenderedPageBreak/>
         <w:t xml:space="preserve">Comparer les résultats. </w:t>
       </w:r>
     </w:p>
@@ -5734,9 +5772,9 @@
       </w:r>
     </w:p>
     <w:sectPr>
-      <w:footerReference w:type="even" r:id="rId46"/>
-      <w:footerReference w:type="default" r:id="rId47"/>
-      <w:footerReference w:type="first" r:id="rId48"/>
+      <w:footerReference w:type="even" r:id="rId47"/>
+      <w:footerReference w:type="default" r:id="rId48"/>
+      <w:footerReference w:type="first" r:id="rId49"/>
       <w:pgSz w:w="12240" w:h="15840"/>
       <w:pgMar w:top="1404" w:right="1892" w:bottom="1567" w:left="1872" w:header="720" w:footer="681" w:gutter="0"/>
       <w:cols w:space="720"/>

</xml_diff>

<commit_message>
Partie 8 Prompt B : « Résume ce texte en 150 mots. »
</commit_message>
<xml_diff>
--- a/ai-business_assistant/atelier-prompt-engineering.docx
+++ b/ai-business_assistant/atelier-prompt-engineering.docx
@@ -5764,6 +5764,65 @@
     </w:p>
     <w:p>
       <w:pPr>
+        <w:spacing w:after="4" w:line="266" w:lineRule="auto"/>
+        <w:ind w:right="0"/>
+      </w:pPr>
+      <w:r>
+        <w:rPr>
+          <w:noProof/>
+        </w:rPr>
+        <w:lastRenderedPageBreak/>
+        <w:drawing>
+          <wp:inline distT="0" distB="0" distL="0" distR="0" wp14:anchorId="090EC8A4" wp14:editId="4E087273">
+            <wp:extent cx="5382260" cy="3684270"/>
+            <wp:effectExtent l="0" t="0" r="8890" b="0"/>
+            <wp:docPr id="50" name="Image 50"/>
+            <wp:cNvGraphicFramePr>
+              <a:graphicFrameLocks xmlns:a="http://schemas.openxmlformats.org/drawingml/2006/main" noChangeAspect="1"/>
+            </wp:cNvGraphicFramePr>
+            <a:graphic xmlns:a="http://schemas.openxmlformats.org/drawingml/2006/main">
+              <a:graphicData uri="http://schemas.openxmlformats.org/drawingml/2006/picture">
+                <pic:pic xmlns:pic="http://schemas.openxmlformats.org/drawingml/2006/picture">
+                  <pic:nvPicPr>
+                    <pic:cNvPr id="50" name="Capture d'écran 2026-09-10 122500.png"/>
+                    <pic:cNvPicPr/>
+                  </pic:nvPicPr>
+                  <pic:blipFill>
+                    <a:blip r:embed="rId48">
+                      <a:extLst>
+                        <a:ext uri="{28A0092B-C50C-407E-A947-70E740481C1C}">
+                          <a14:useLocalDpi xmlns:a14="http://schemas.microsoft.com/office/drawing/2010/main" val="0"/>
+                        </a:ext>
+                      </a:extLst>
+                    </a:blip>
+                    <a:stretch>
+                      <a:fillRect/>
+                    </a:stretch>
+                  </pic:blipFill>
+                  <pic:spPr>
+                    <a:xfrm>
+                      <a:off x="0" y="0"/>
+                      <a:ext cx="5382260" cy="3684270"/>
+                    </a:xfrm>
+                    <a:prstGeom prst="rect">
+                      <a:avLst/>
+                    </a:prstGeom>
+                  </pic:spPr>
+                </pic:pic>
+              </a:graphicData>
+            </a:graphic>
+          </wp:inline>
+        </w:drawing>
+      </w:r>
+    </w:p>
+    <w:p>
+      <w:pPr>
+        <w:spacing w:after="4" w:line="266" w:lineRule="auto"/>
+        <w:ind w:right="0"/>
+      </w:pPr>
+    </w:p>
+    <w:p>
+      <w:pPr>
         <w:spacing w:after="85"/>
         <w:ind w:right="0"/>
       </w:pPr>
@@ -5772,6 +5831,12 @@
       </w:r>
       <w:bookmarkStart w:id="0" w:name="_GoBack"/>
       <w:bookmarkEnd w:id="0"/>
+    </w:p>
+    <w:p>
+      <w:pPr>
+        <w:spacing w:after="85"/>
+        <w:ind w:right="0"/>
+      </w:pPr>
     </w:p>
     <w:p>
       <w:pPr>
@@ -5905,9 +5970,9 @@
       </w:r>
     </w:p>
     <w:sectPr>
-      <w:footerReference w:type="even" r:id="rId48"/>
-      <w:footerReference w:type="default" r:id="rId49"/>
-      <w:footerReference w:type="first" r:id="rId50"/>
+      <w:footerReference w:type="even" r:id="rId49"/>
+      <w:footerReference w:type="default" r:id="rId50"/>
+      <w:footerReference w:type="first" r:id="rId51"/>
       <w:pgSz w:w="12240" w:h="15840"/>
       <w:pgMar w:top="1404" w:right="1892" w:bottom="1567" w:left="1872" w:header="720" w:footer="681" w:gutter="0"/>
       <w:cols w:space="720"/>

</xml_diff>

<commit_message>
Partie 8 Prompt B : « Résume ce texte  avec plus de composants de prompt. »
</commit_message>
<xml_diff>
--- a/ai-business_assistant/atelier-prompt-engineering.docx
+++ b/ai-business_assistant/atelier-prompt-engineering.docx
@@ -5767,6 +5767,7 @@
         <w:spacing w:after="4" w:line="266" w:lineRule="auto"/>
         <w:ind w:right="0"/>
       </w:pPr>
+      <w:bookmarkStart w:id="0" w:name="_GoBack"/>
       <w:r>
         <w:rPr>
           <w:noProof/>
@@ -5814,6 +5815,7 @@
           </wp:inline>
         </w:drawing>
       </w:r>
+      <w:bookmarkEnd w:id="0"/>
     </w:p>
     <w:p>
       <w:pPr>
@@ -5829,14 +5831,111 @@
       <w:r>
         <w:t xml:space="preserve">Prompt C : avec plus de composants de prompt </w:t>
       </w:r>
-      <w:bookmarkStart w:id="0" w:name="_GoBack"/>
-      <w:bookmarkEnd w:id="0"/>
     </w:p>
     <w:p>
       <w:pPr>
         <w:spacing w:after="85"/>
         <w:ind w:right="0"/>
       </w:pPr>
+      <w:r>
+        <w:rPr>
+          <w:noProof/>
+        </w:rPr>
+        <w:drawing>
+          <wp:inline distT="0" distB="0" distL="0" distR="0" wp14:anchorId="6619A1F7" wp14:editId="20190DF0">
+            <wp:extent cx="5382260" cy="2724150"/>
+            <wp:effectExtent l="0" t="0" r="8890" b="0"/>
+            <wp:docPr id="52" name="Image 52"/>
+            <wp:cNvGraphicFramePr>
+              <a:graphicFrameLocks xmlns:a="http://schemas.openxmlformats.org/drawingml/2006/main" noChangeAspect="1"/>
+            </wp:cNvGraphicFramePr>
+            <a:graphic xmlns:a="http://schemas.openxmlformats.org/drawingml/2006/main">
+              <a:graphicData uri="http://schemas.openxmlformats.org/drawingml/2006/picture">
+                <pic:pic xmlns:pic="http://schemas.openxmlformats.org/drawingml/2006/picture">
+                  <pic:nvPicPr>
+                    <pic:cNvPr id="52" name="Capture d'écran 2026-09-10 123044.png"/>
+                    <pic:cNvPicPr/>
+                  </pic:nvPicPr>
+                  <pic:blipFill>
+                    <a:blip r:embed="rId49">
+                      <a:extLst>
+                        <a:ext uri="{28A0092B-C50C-407E-A947-70E740481C1C}">
+                          <a14:useLocalDpi xmlns:a14="http://schemas.microsoft.com/office/drawing/2010/main" val="0"/>
+                        </a:ext>
+                      </a:extLst>
+                    </a:blip>
+                    <a:stretch>
+                      <a:fillRect/>
+                    </a:stretch>
+                  </pic:blipFill>
+                  <pic:spPr>
+                    <a:xfrm>
+                      <a:off x="0" y="0"/>
+                      <a:ext cx="5382260" cy="2724150"/>
+                    </a:xfrm>
+                    <a:prstGeom prst="rect">
+                      <a:avLst/>
+                    </a:prstGeom>
+                  </pic:spPr>
+                </pic:pic>
+              </a:graphicData>
+            </a:graphic>
+          </wp:inline>
+        </w:drawing>
+      </w:r>
+    </w:p>
+    <w:p>
+      <w:pPr>
+        <w:spacing w:after="85"/>
+        <w:ind w:right="0"/>
+      </w:pPr>
+      <w:r>
+        <w:rPr>
+          <w:noProof/>
+        </w:rPr>
+        <w:lastRenderedPageBreak/>
+        <w:drawing>
+          <wp:inline distT="0" distB="0" distL="0" distR="0" wp14:anchorId="1F35A055" wp14:editId="60A19870">
+            <wp:extent cx="5382260" cy="2703830"/>
+            <wp:effectExtent l="0" t="0" r="8890" b="1270"/>
+            <wp:docPr id="51" name="Image 51"/>
+            <wp:cNvGraphicFramePr>
+              <a:graphicFrameLocks xmlns:a="http://schemas.openxmlformats.org/drawingml/2006/main" noChangeAspect="1"/>
+            </wp:cNvGraphicFramePr>
+            <a:graphic xmlns:a="http://schemas.openxmlformats.org/drawingml/2006/main">
+              <a:graphicData uri="http://schemas.openxmlformats.org/drawingml/2006/picture">
+                <pic:pic xmlns:pic="http://schemas.openxmlformats.org/drawingml/2006/picture">
+                  <pic:nvPicPr>
+                    <pic:cNvPr id="51" name="Capture d'écran 2026-09-10 122621.png"/>
+                    <pic:cNvPicPr/>
+                  </pic:nvPicPr>
+                  <pic:blipFill>
+                    <a:blip r:embed="rId50">
+                      <a:extLst>
+                        <a:ext uri="{28A0092B-C50C-407E-A947-70E740481C1C}">
+                          <a14:useLocalDpi xmlns:a14="http://schemas.microsoft.com/office/drawing/2010/main" val="0"/>
+                        </a:ext>
+                      </a:extLst>
+                    </a:blip>
+                    <a:stretch>
+                      <a:fillRect/>
+                    </a:stretch>
+                  </pic:blipFill>
+                  <pic:spPr>
+                    <a:xfrm>
+                      <a:off x="0" y="0"/>
+                      <a:ext cx="5382260" cy="2703830"/>
+                    </a:xfrm>
+                    <a:prstGeom prst="rect">
+                      <a:avLst/>
+                    </a:prstGeom>
+                  </pic:spPr>
+                </pic:pic>
+              </a:graphicData>
+            </a:graphic>
+          </wp:inline>
+        </w:drawing>
+      </w:r>
     </w:p>
     <w:p>
       <w:pPr>
@@ -5970,9 +6069,9 @@
       </w:r>
     </w:p>
     <w:sectPr>
-      <w:footerReference w:type="even" r:id="rId49"/>
-      <w:footerReference w:type="default" r:id="rId50"/>
-      <w:footerReference w:type="first" r:id="rId51"/>
+      <w:footerReference w:type="even" r:id="rId51"/>
+      <w:footerReference w:type="default" r:id="rId52"/>
+      <w:footerReference w:type="first" r:id="rId53"/>
       <w:pgSz w:w="12240" w:h="15840"/>
       <w:pgMar w:top="1404" w:right="1892" w:bottom="1567" w:left="1872" w:header="720" w:footer="681" w:gutter="0"/>
       <w:cols w:space="720"/>

</xml_diff>